<commit_message>
Editting names and making nicer to look at
</commit_message>
<xml_diff>
--- a/SystemManualTemplate25-26.docx
+++ b/SystemManualTemplate25-26.docx
@@ -5,12 +5,66 @@
     <w:p>
       <w:pPr>
         <w:pStyle w:val="Heading1"/>
+        <w:jc w:val="center"/>
+        <w:rPr>
+          <w:b/>
+          <w:bCs/>
+        </w:rPr>
       </w:pPr>
       <w:r>
+        <w:rPr>
+          <w:b/>
+          <w:bCs/>
+        </w:rPr>
+        <w:t>Title: Drawing Robot System Manual</w:t>
+      </w:r>
+    </w:p>
+    <w:p>
+      <w:pPr>
+        <w:pStyle w:val="Heading1"/>
+        <w:jc w:val="center"/>
+        <w:rPr>
+          <w:b/>
+          <w:bCs/>
+        </w:rPr>
+      </w:pPr>
+      <w:r>
+        <w:rPr>
+          <w:b/>
+          <w:bCs/>
+        </w:rPr>
         <w:t>Name</w:t>
       </w:r>
       <w:r>
-        <w:t xml:space="preserve"> &amp; Student ID</w:t>
+        <w:rPr>
+          <w:b/>
+          <w:bCs/>
+        </w:rPr>
+        <w:t>: Callum Fitzsimons</w:t>
+      </w:r>
+    </w:p>
+    <w:p>
+      <w:pPr>
+        <w:pStyle w:val="Heading1"/>
+        <w:jc w:val="center"/>
+        <w:rPr>
+          <w:b/>
+          <w:bCs/>
+        </w:rPr>
+      </w:pPr>
+      <w:r>
+        <w:rPr>
+          <w:b/>
+          <w:bCs/>
+        </w:rPr>
+        <w:t>Student ID</w:t>
+      </w:r>
+      <w:r>
+        <w:rPr>
+          <w:b/>
+          <w:bCs/>
+        </w:rPr>
+        <w:t>: 20565301</w:t>
       </w:r>
     </w:p>
     <w:p>
@@ -18,20 +72,13 @@
         <w:pStyle w:val="Heading1"/>
       </w:pPr>
       <w:r>
-        <w:t>Title</w:t>
+        <w:t>Software Description</w:t>
+      </w:r>
+      <w:r>
+        <w:t xml:space="preserve"> </w:t>
       </w:r>
     </w:p>
-    <w:p>
-      <w:pPr>
-        <w:pStyle w:val="Heading1"/>
-      </w:pPr>
-      <w:r>
-        <w:t>Software Description</w:t>
-      </w:r>
-      <w:r>
-        <w:t xml:space="preserve"> </w:t>
-      </w:r>
-    </w:p>
+    <w:p/>
     <w:p>
       <w:pPr>
         <w:rPr>
@@ -68,47 +115,86 @@
     <w:tbl>
       <w:tblPr>
         <w:tblStyle w:val="TableGrid"/>
-        <w:tblW w:w="0" w:type="auto"/>
+        <w:tblW w:w="9776" w:type="dxa"/>
         <w:tblLook w:val="04A0" w:firstRow="1" w:lastRow="0" w:firstColumn="1" w:lastColumn="0" w:noHBand="0" w:noVBand="1"/>
       </w:tblPr>
       <w:tblGrid>
-        <w:gridCol w:w="2122"/>
-        <w:gridCol w:w="1842"/>
-        <w:gridCol w:w="5052"/>
+        <w:gridCol w:w="2263"/>
+        <w:gridCol w:w="1985"/>
+        <w:gridCol w:w="5528"/>
       </w:tblGrid>
       <w:tr>
         <w:tc>
           <w:tcPr>
-            <w:tcW w:w="2122" w:type="dxa"/>
-          </w:tcPr>
-          <w:p>
-            <w:pPr>
-              <w:jc w:val="center"/>
-            </w:pPr>
-            <w:r>
+            <w:tcW w:w="2263" w:type="dxa"/>
+          </w:tcPr>
+          <w:p>
+            <w:pPr>
+              <w:jc w:val="center"/>
+              <w:rPr>
+                <w:b/>
+                <w:bCs/>
+                <w:sz w:val="24"/>
+                <w:szCs w:val="22"/>
+              </w:rPr>
+            </w:pPr>
+            <w:r>
+              <w:rPr>
+                <w:b/>
+                <w:bCs/>
+                <w:sz w:val="24"/>
+                <w:szCs w:val="22"/>
+              </w:rPr>
               <w:t>Name</w:t>
             </w:r>
           </w:p>
         </w:tc>
         <w:tc>
           <w:tcPr>
-            <w:tcW w:w="1842" w:type="dxa"/>
-          </w:tcPr>
-          <w:p>
-            <w:pPr>
-              <w:jc w:val="center"/>
-            </w:pPr>
-            <w:r>
+            <w:tcW w:w="1985" w:type="dxa"/>
+          </w:tcPr>
+          <w:p>
+            <w:pPr>
+              <w:jc w:val="center"/>
+              <w:rPr>
+                <w:b/>
+                <w:bCs/>
+                <w:sz w:val="24"/>
+                <w:szCs w:val="22"/>
+              </w:rPr>
+            </w:pPr>
+            <w:r>
+              <w:rPr>
+                <w:b/>
+                <w:bCs/>
+                <w:sz w:val="24"/>
+                <w:szCs w:val="22"/>
+              </w:rPr>
               <w:t>Data type</w:t>
             </w:r>
           </w:p>
         </w:tc>
         <w:tc>
           <w:tcPr>
-            <w:tcW w:w="5052" w:type="dxa"/>
-          </w:tcPr>
-          <w:p>
-            <w:r>
+            <w:tcW w:w="5528" w:type="dxa"/>
+          </w:tcPr>
+          <w:p>
+            <w:pPr>
+              <w:jc w:val="center"/>
+              <w:rPr>
+                <w:b/>
+                <w:bCs/>
+                <w:sz w:val="24"/>
+                <w:szCs w:val="22"/>
+              </w:rPr>
+            </w:pPr>
+            <w:r>
+              <w:rPr>
+                <w:b/>
+                <w:bCs/>
+                <w:sz w:val="24"/>
+                <w:szCs w:val="22"/>
+              </w:rPr>
               <w:t>Rationale</w:t>
             </w:r>
           </w:p>
@@ -120,21 +206,59 @@
         </w:trPr>
         <w:tc>
           <w:tcPr>
-            <w:tcW w:w="2122" w:type="dxa"/>
-          </w:tcPr>
-          <w:p/>
-        </w:tc>
-        <w:tc>
-          <w:tcPr>
-            <w:tcW w:w="1842" w:type="dxa"/>
-          </w:tcPr>
-          <w:p/>
-        </w:tc>
-        <w:tc>
-          <w:tcPr>
-            <w:tcW w:w="5052" w:type="dxa"/>
-          </w:tcPr>
-          <w:p/>
+            <w:tcW w:w="2263" w:type="dxa"/>
+          </w:tcPr>
+          <w:p>
+            <w:pPr>
+              <w:jc w:val="center"/>
+              <w:rPr>
+                <w:sz w:val="20"/>
+              </w:rPr>
+            </w:pPr>
+            <w:r>
+              <w:rPr>
+                <w:sz w:val="20"/>
+              </w:rPr>
+              <w:t>i</w:t>
+            </w:r>
+          </w:p>
+        </w:tc>
+        <w:tc>
+          <w:tcPr>
+            <w:tcW w:w="1985" w:type="dxa"/>
+          </w:tcPr>
+          <w:p>
+            <w:pPr>
+              <w:jc w:val="center"/>
+              <w:rPr>
+                <w:sz w:val="20"/>
+              </w:rPr>
+            </w:pPr>
+            <w:r>
+              <w:rPr>
+                <w:sz w:val="20"/>
+              </w:rPr>
+              <w:t>int</w:t>
+            </w:r>
+          </w:p>
+        </w:tc>
+        <w:tc>
+          <w:tcPr>
+            <w:tcW w:w="5528" w:type="dxa"/>
+          </w:tcPr>
+          <w:p>
+            <w:pPr>
+              <w:rPr>
+                <w:sz w:val="20"/>
+              </w:rPr>
+            </w:pPr>
+            <w:r>
+              <w:rPr>
+                <w:sz w:val="20"/>
+              </w:rPr>
+              <w:t>An integer that determines how many loops will be completed</w:t>
+            </w:r>
+          </w:p>
         </w:tc>
       </w:tr>
       <w:tr>
@@ -143,21 +267,1791 @@
         </w:trPr>
         <w:tc>
           <w:tcPr>
-            <w:tcW w:w="2122" w:type="dxa"/>
-          </w:tcPr>
-          <w:p/>
-        </w:tc>
-        <w:tc>
-          <w:tcPr>
-            <w:tcW w:w="1842" w:type="dxa"/>
-          </w:tcPr>
-          <w:p/>
-        </w:tc>
-        <w:tc>
-          <w:tcPr>
-            <w:tcW w:w="5052" w:type="dxa"/>
-          </w:tcPr>
-          <w:p/>
+            <w:tcW w:w="2263" w:type="dxa"/>
+          </w:tcPr>
+          <w:p>
+            <w:pPr>
+              <w:jc w:val="center"/>
+              <w:rPr>
+                <w:sz w:val="20"/>
+              </w:rPr>
+            </w:pPr>
+            <w:r>
+              <w:rPr>
+                <w:sz w:val="20"/>
+              </w:rPr>
+              <w:t>j</w:t>
+            </w:r>
+          </w:p>
+        </w:tc>
+        <w:tc>
+          <w:tcPr>
+            <w:tcW w:w="1985" w:type="dxa"/>
+          </w:tcPr>
+          <w:p>
+            <w:pPr>
+              <w:jc w:val="center"/>
+              <w:rPr>
+                <w:sz w:val="20"/>
+              </w:rPr>
+            </w:pPr>
+            <w:r>
+              <w:rPr>
+                <w:sz w:val="20"/>
+              </w:rPr>
+              <w:t>int</w:t>
+            </w:r>
+          </w:p>
+        </w:tc>
+        <w:tc>
+          <w:tcPr>
+            <w:tcW w:w="5528" w:type="dxa"/>
+          </w:tcPr>
+          <w:p>
+            <w:pPr>
+              <w:rPr>
+                <w:sz w:val="20"/>
+              </w:rPr>
+            </w:pPr>
+            <w:r>
+              <w:rPr>
+                <w:sz w:val="20"/>
+              </w:rPr>
+              <w:t>An integer that determines how many loops will be completed</w:t>
+            </w:r>
+            <w:r>
+              <w:rPr>
+                <w:sz w:val="20"/>
+              </w:rPr>
+              <w:t>, only</w:t>
+            </w:r>
+            <w:r>
+              <w:rPr>
+                <w:sz w:val="20"/>
+              </w:rPr>
+              <w:t xml:space="preserve"> used when </w:t>
+            </w:r>
+            <w:r>
+              <w:rPr>
+                <w:sz w:val="20"/>
+              </w:rPr>
+              <w:t>a for loop is</w:t>
+            </w:r>
+            <w:r>
+              <w:rPr>
+                <w:sz w:val="20"/>
+              </w:rPr>
+              <w:t xml:space="preserve"> inside another </w:t>
+            </w:r>
+            <w:r>
+              <w:rPr>
+                <w:sz w:val="20"/>
+              </w:rPr>
+              <w:t xml:space="preserve">for </w:t>
+            </w:r>
+            <w:r>
+              <w:rPr>
+                <w:sz w:val="20"/>
+              </w:rPr>
+              <w:t xml:space="preserve">loop </w:t>
+            </w:r>
+            <w:r>
+              <w:rPr>
+                <w:sz w:val="20"/>
+              </w:rPr>
+              <w:t>and we therefore don’t want to reset the i value in the outer loop</w:t>
+            </w:r>
+          </w:p>
+        </w:tc>
+      </w:tr>
+      <w:tr>
+        <w:trPr>
+          <w:trHeight w:val="547"/>
+        </w:trPr>
+        <w:tc>
+          <w:tcPr>
+            <w:tcW w:w="2263" w:type="dxa"/>
+          </w:tcPr>
+          <w:p>
+            <w:pPr>
+              <w:jc w:val="center"/>
+              <w:rPr>
+                <w:sz w:val="20"/>
+              </w:rPr>
+            </w:pPr>
+            <w:r>
+              <w:rPr>
+                <w:sz w:val="20"/>
+              </w:rPr>
+              <w:t>Pen_Coordinate_X</w:t>
+            </w:r>
+          </w:p>
+          <w:p>
+            <w:pPr>
+              <w:jc w:val="center"/>
+              <w:rPr>
+                <w:sz w:val="20"/>
+              </w:rPr>
+            </w:pPr>
+          </w:p>
+        </w:tc>
+        <w:tc>
+          <w:tcPr>
+            <w:tcW w:w="1985" w:type="dxa"/>
+          </w:tcPr>
+          <w:p>
+            <w:pPr>
+              <w:jc w:val="center"/>
+              <w:rPr>
+                <w:sz w:val="20"/>
+              </w:rPr>
+            </w:pPr>
+            <w:r>
+              <w:rPr>
+                <w:sz w:val="20"/>
+              </w:rPr>
+              <w:t>float</w:t>
+            </w:r>
+          </w:p>
+        </w:tc>
+        <w:tc>
+          <w:tcPr>
+            <w:tcW w:w="5528" w:type="dxa"/>
+          </w:tcPr>
+          <w:p>
+            <w:pPr>
+              <w:rPr>
+                <w:sz w:val="20"/>
+              </w:rPr>
+            </w:pPr>
+            <w:r>
+              <w:rPr>
+                <w:sz w:val="20"/>
+              </w:rPr>
+              <w:t>Horizonal value that defines where the pen at that moment in time in the X axis</w:t>
+            </w:r>
+          </w:p>
+        </w:tc>
+      </w:tr>
+      <w:tr>
+        <w:trPr>
+          <w:trHeight w:val="547"/>
+        </w:trPr>
+        <w:tc>
+          <w:tcPr>
+            <w:tcW w:w="2263" w:type="dxa"/>
+          </w:tcPr>
+          <w:p>
+            <w:pPr>
+              <w:jc w:val="center"/>
+              <w:rPr>
+                <w:sz w:val="20"/>
+              </w:rPr>
+            </w:pPr>
+            <w:r>
+              <w:rPr>
+                <w:sz w:val="20"/>
+              </w:rPr>
+              <w:t>Pen_Coordinate_Y</w:t>
+            </w:r>
+          </w:p>
+          <w:p>
+            <w:pPr>
+              <w:jc w:val="center"/>
+              <w:rPr>
+                <w:sz w:val="20"/>
+              </w:rPr>
+            </w:pPr>
+          </w:p>
+        </w:tc>
+        <w:tc>
+          <w:tcPr>
+            <w:tcW w:w="1985" w:type="dxa"/>
+          </w:tcPr>
+          <w:p>
+            <w:pPr>
+              <w:jc w:val="center"/>
+              <w:rPr>
+                <w:sz w:val="20"/>
+              </w:rPr>
+            </w:pPr>
+            <w:r>
+              <w:rPr>
+                <w:sz w:val="20"/>
+              </w:rPr>
+              <w:t>float</w:t>
+            </w:r>
+          </w:p>
+        </w:tc>
+        <w:tc>
+          <w:tcPr>
+            <w:tcW w:w="5528" w:type="dxa"/>
+          </w:tcPr>
+          <w:p>
+            <w:pPr>
+              <w:rPr>
+                <w:sz w:val="20"/>
+              </w:rPr>
+            </w:pPr>
+            <w:r>
+              <w:rPr>
+                <w:sz w:val="20"/>
+              </w:rPr>
+              <w:t>Vertical value that defines where the pen at that moment in time in the Y axis</w:t>
+            </w:r>
+          </w:p>
+        </w:tc>
+      </w:tr>
+      <w:tr>
+        <w:trPr>
+          <w:trHeight w:val="547"/>
+        </w:trPr>
+        <w:tc>
+          <w:tcPr>
+            <w:tcW w:w="2263" w:type="dxa"/>
+          </w:tcPr>
+          <w:p>
+            <w:pPr>
+              <w:jc w:val="center"/>
+              <w:rPr>
+                <w:sz w:val="20"/>
+              </w:rPr>
+            </w:pPr>
+            <w:r>
+              <w:rPr>
+                <w:sz w:val="20"/>
+              </w:rPr>
+              <w:t>MyBuffer</w:t>
+            </w:r>
+            <w:r>
+              <w:rPr>
+                <w:sz w:val="20"/>
+              </w:rPr>
+              <w:t>[256]</w:t>
+            </w:r>
+          </w:p>
+          <w:p>
+            <w:pPr>
+              <w:jc w:val="center"/>
+              <w:rPr>
+                <w:sz w:val="20"/>
+              </w:rPr>
+            </w:pPr>
+          </w:p>
+        </w:tc>
+        <w:tc>
+          <w:tcPr>
+            <w:tcW w:w="1985" w:type="dxa"/>
+          </w:tcPr>
+          <w:p>
+            <w:pPr>
+              <w:jc w:val="center"/>
+              <w:rPr>
+                <w:sz w:val="20"/>
+              </w:rPr>
+            </w:pPr>
+            <w:r>
+              <w:rPr>
+                <w:sz w:val="20"/>
+              </w:rPr>
+              <w:t>char</w:t>
+            </w:r>
+          </w:p>
+        </w:tc>
+        <w:tc>
+          <w:tcPr>
+            <w:tcW w:w="5528" w:type="dxa"/>
+          </w:tcPr>
+          <w:p>
+            <w:pPr>
+              <w:rPr>
+                <w:sz w:val="20"/>
+              </w:rPr>
+            </w:pPr>
+            <w:r>
+              <w:rPr>
+                <w:sz w:val="20"/>
+              </w:rPr>
+              <w:t xml:space="preserve">A buffer used as temporal storage to </w:t>
+            </w:r>
+            <w:r>
+              <w:rPr>
+                <w:sz w:val="20"/>
+              </w:rPr>
+              <w:t>store each line in “SingleStrokeFont.txt” and input it into FontArray. Also used after to temporal store each GCode line to send to the robot.</w:t>
+            </w:r>
+          </w:p>
+        </w:tc>
+      </w:tr>
+      <w:tr>
+        <w:trPr>
+          <w:trHeight w:val="547"/>
+        </w:trPr>
+        <w:tc>
+          <w:tcPr>
+            <w:tcW w:w="2263" w:type="dxa"/>
+          </w:tcPr>
+          <w:p>
+            <w:pPr>
+              <w:jc w:val="center"/>
+              <w:rPr>
+                <w:sz w:val="20"/>
+              </w:rPr>
+            </w:pPr>
+            <w:r>
+              <w:rPr>
+                <w:sz w:val="20"/>
+              </w:rPr>
+              <w:t>Font_Size</w:t>
+            </w:r>
+          </w:p>
+          <w:p>
+            <w:pPr>
+              <w:jc w:val="center"/>
+              <w:rPr>
+                <w:sz w:val="20"/>
+              </w:rPr>
+            </w:pPr>
+          </w:p>
+        </w:tc>
+        <w:tc>
+          <w:tcPr>
+            <w:tcW w:w="1985" w:type="dxa"/>
+          </w:tcPr>
+          <w:p>
+            <w:pPr>
+              <w:jc w:val="center"/>
+              <w:rPr>
+                <w:sz w:val="20"/>
+              </w:rPr>
+            </w:pPr>
+            <w:r>
+              <w:rPr>
+                <w:sz w:val="20"/>
+              </w:rPr>
+              <w:t>float</w:t>
+            </w:r>
+          </w:p>
+        </w:tc>
+        <w:tc>
+          <w:tcPr>
+            <w:tcW w:w="5528" w:type="dxa"/>
+          </w:tcPr>
+          <w:p>
+            <w:pPr>
+              <w:rPr>
+                <w:sz w:val="20"/>
+              </w:rPr>
+            </w:pPr>
+            <w:r>
+              <w:rPr>
+                <w:sz w:val="20"/>
+              </w:rPr>
+              <w:t>A real number that the user inputs between 4 and 10</w:t>
+            </w:r>
+          </w:p>
+        </w:tc>
+      </w:tr>
+      <w:tr>
+        <w:trPr>
+          <w:trHeight w:val="547"/>
+        </w:trPr>
+        <w:tc>
+          <w:tcPr>
+            <w:tcW w:w="2263" w:type="dxa"/>
+          </w:tcPr>
+          <w:p>
+            <w:pPr>
+              <w:jc w:val="center"/>
+              <w:rPr>
+                <w:sz w:val="20"/>
+              </w:rPr>
+            </w:pPr>
+            <w:r>
+              <w:rPr>
+                <w:sz w:val="20"/>
+              </w:rPr>
+              <w:t>Font_Size_Fraction</w:t>
+            </w:r>
+          </w:p>
+          <w:p>
+            <w:pPr>
+              <w:jc w:val="center"/>
+              <w:rPr>
+                <w:sz w:val="20"/>
+              </w:rPr>
+            </w:pPr>
+          </w:p>
+        </w:tc>
+        <w:tc>
+          <w:tcPr>
+            <w:tcW w:w="1985" w:type="dxa"/>
+          </w:tcPr>
+          <w:p>
+            <w:pPr>
+              <w:jc w:val="center"/>
+              <w:rPr>
+                <w:sz w:val="20"/>
+              </w:rPr>
+            </w:pPr>
+            <w:r>
+              <w:rPr>
+                <w:sz w:val="20"/>
+              </w:rPr>
+              <w:t>float</w:t>
+            </w:r>
+          </w:p>
+        </w:tc>
+        <w:tc>
+          <w:tcPr>
+            <w:tcW w:w="5528" w:type="dxa"/>
+          </w:tcPr>
+          <w:p>
+            <w:pPr>
+              <w:rPr>
+                <w:sz w:val="20"/>
+              </w:rPr>
+            </w:pPr>
+            <w:r>
+              <w:rPr>
+                <w:sz w:val="20"/>
+              </w:rPr>
+              <w:t>The value I multiple the stroke coordinate by to draw the correctly sized characters</w:t>
+            </w:r>
+          </w:p>
+        </w:tc>
+      </w:tr>
+      <w:tr>
+        <w:trPr>
+          <w:trHeight w:val="547"/>
+        </w:trPr>
+        <w:tc>
+          <w:tcPr>
+            <w:tcW w:w="2263" w:type="dxa"/>
+          </w:tcPr>
+          <w:p>
+            <w:pPr>
+              <w:jc w:val="center"/>
+              <w:rPr>
+                <w:sz w:val="20"/>
+              </w:rPr>
+            </w:pPr>
+            <w:r>
+              <w:rPr>
+                <w:sz w:val="20"/>
+              </w:rPr>
+              <w:t>CharactersInWord</w:t>
+            </w:r>
+          </w:p>
+          <w:p>
+            <w:pPr>
+              <w:jc w:val="center"/>
+              <w:rPr>
+                <w:sz w:val="20"/>
+              </w:rPr>
+            </w:pPr>
+          </w:p>
+        </w:tc>
+        <w:tc>
+          <w:tcPr>
+            <w:tcW w:w="1985" w:type="dxa"/>
+          </w:tcPr>
+          <w:p>
+            <w:pPr>
+              <w:jc w:val="center"/>
+              <w:rPr>
+                <w:sz w:val="20"/>
+              </w:rPr>
+            </w:pPr>
+            <w:r>
+              <w:rPr>
+                <w:sz w:val="20"/>
+              </w:rPr>
+              <w:t>int</w:t>
+            </w:r>
+          </w:p>
+        </w:tc>
+        <w:tc>
+          <w:tcPr>
+            <w:tcW w:w="5528" w:type="dxa"/>
+          </w:tcPr>
+          <w:p>
+            <w:pPr>
+              <w:rPr>
+                <w:sz w:val="20"/>
+              </w:rPr>
+            </w:pPr>
+            <w:r>
+              <w:rPr>
+                <w:sz w:val="20"/>
+              </w:rPr>
+              <w:t>Value that determines how many characters are in each word and this includes the space after the word if there is one</w:t>
+            </w:r>
+          </w:p>
+        </w:tc>
+      </w:tr>
+      <w:tr>
+        <w:trPr>
+          <w:trHeight w:val="547"/>
+        </w:trPr>
+        <w:tc>
+          <w:tcPr>
+            <w:tcW w:w="2263" w:type="dxa"/>
+          </w:tcPr>
+          <w:p>
+            <w:pPr>
+              <w:jc w:val="center"/>
+              <w:rPr>
+                <w:sz w:val="20"/>
+              </w:rPr>
+            </w:pPr>
+            <w:r>
+              <w:rPr>
+                <w:sz w:val="20"/>
+              </w:rPr>
+              <w:t>char Character</w:t>
+            </w:r>
+          </w:p>
+          <w:p>
+            <w:pPr>
+              <w:jc w:val="center"/>
+              <w:rPr>
+                <w:sz w:val="20"/>
+              </w:rPr>
+            </w:pPr>
+          </w:p>
+        </w:tc>
+        <w:tc>
+          <w:tcPr>
+            <w:tcW w:w="1985" w:type="dxa"/>
+          </w:tcPr>
+          <w:p>
+            <w:pPr>
+              <w:jc w:val="center"/>
+              <w:rPr>
+                <w:sz w:val="20"/>
+              </w:rPr>
+            </w:pPr>
+            <w:r>
+              <w:rPr>
+                <w:sz w:val="20"/>
+              </w:rPr>
+              <w:t>char</w:t>
+            </w:r>
+          </w:p>
+        </w:tc>
+        <w:tc>
+          <w:tcPr>
+            <w:tcW w:w="5528" w:type="dxa"/>
+          </w:tcPr>
+          <w:p>
+            <w:pPr>
+              <w:rPr>
+                <w:sz w:val="20"/>
+              </w:rPr>
+            </w:pPr>
+          </w:p>
+        </w:tc>
+      </w:tr>
+      <w:tr>
+        <w:trPr>
+          <w:trHeight w:val="547"/>
+        </w:trPr>
+        <w:tc>
+          <w:tcPr>
+            <w:tcW w:w="2263" w:type="dxa"/>
+          </w:tcPr>
+          <w:p>
+            <w:pPr>
+              <w:jc w:val="center"/>
+              <w:rPr>
+                <w:sz w:val="20"/>
+              </w:rPr>
+            </w:pPr>
+            <w:r>
+              <w:rPr>
+                <w:sz w:val="20"/>
+              </w:rPr>
+              <w:t>Word[256]</w:t>
+            </w:r>
+          </w:p>
+          <w:p>
+            <w:pPr>
+              <w:jc w:val="center"/>
+              <w:rPr>
+                <w:sz w:val="20"/>
+              </w:rPr>
+            </w:pPr>
+          </w:p>
+        </w:tc>
+        <w:tc>
+          <w:tcPr>
+            <w:tcW w:w="1985" w:type="dxa"/>
+          </w:tcPr>
+          <w:p>
+            <w:pPr>
+              <w:jc w:val="center"/>
+              <w:rPr>
+                <w:sz w:val="20"/>
+              </w:rPr>
+            </w:pPr>
+            <w:r>
+              <w:rPr>
+                <w:sz w:val="20"/>
+              </w:rPr>
+              <w:t>int</w:t>
+            </w:r>
+          </w:p>
+        </w:tc>
+        <w:tc>
+          <w:tcPr>
+            <w:tcW w:w="5528" w:type="dxa"/>
+          </w:tcPr>
+          <w:p>
+            <w:pPr>
+              <w:rPr>
+                <w:sz w:val="20"/>
+              </w:rPr>
+            </w:pPr>
+            <w:r>
+              <w:rPr>
+                <w:sz w:val="20"/>
+              </w:rPr>
+              <w:t>A second buffer used as temporal storage to store each word of the input sentence so that the MyBuffer can store the GCode and not erase the word</w:t>
+            </w:r>
+          </w:p>
+        </w:tc>
+      </w:tr>
+      <w:tr>
+        <w:trPr>
+          <w:trHeight w:val="547"/>
+        </w:trPr>
+        <w:tc>
+          <w:tcPr>
+            <w:tcW w:w="2263" w:type="dxa"/>
+          </w:tcPr>
+          <w:p>
+            <w:pPr>
+              <w:jc w:val="center"/>
+              <w:rPr>
+                <w:sz w:val="20"/>
+              </w:rPr>
+            </w:pPr>
+            <w:r>
+              <w:rPr>
+                <w:sz w:val="20"/>
+              </w:rPr>
+              <w:t>Character_Length_X</w:t>
+            </w:r>
+          </w:p>
+          <w:p>
+            <w:pPr>
+              <w:jc w:val="center"/>
+              <w:rPr>
+                <w:sz w:val="20"/>
+              </w:rPr>
+            </w:pPr>
+          </w:p>
+        </w:tc>
+        <w:tc>
+          <w:tcPr>
+            <w:tcW w:w="1985" w:type="dxa"/>
+          </w:tcPr>
+          <w:p>
+            <w:pPr>
+              <w:jc w:val="center"/>
+              <w:rPr>
+                <w:sz w:val="20"/>
+              </w:rPr>
+            </w:pPr>
+            <w:r>
+              <w:rPr>
+                <w:sz w:val="20"/>
+              </w:rPr>
+              <w:t>float</w:t>
+            </w:r>
+          </w:p>
+        </w:tc>
+        <w:tc>
+          <w:tcPr>
+            <w:tcW w:w="5528" w:type="dxa"/>
+          </w:tcPr>
+          <w:p>
+            <w:pPr>
+              <w:rPr>
+                <w:sz w:val="20"/>
+              </w:rPr>
+            </w:pPr>
+            <w:r>
+              <w:rPr>
+                <w:sz w:val="20"/>
+              </w:rPr>
+              <w:t xml:space="preserve">The horizontal length that </w:t>
+            </w:r>
+            <w:r>
+              <w:rPr>
+                <w:sz w:val="20"/>
+              </w:rPr>
+              <w:t>each character</w:t>
+            </w:r>
+            <w:r>
+              <w:rPr>
+                <w:sz w:val="20"/>
+              </w:rPr>
+              <w:t xml:space="preserve"> takes</w:t>
+            </w:r>
+            <w:r>
+              <w:rPr>
+                <w:sz w:val="20"/>
+              </w:rPr>
+              <w:t xml:space="preserve"> up in the X axis. Used to calculate Word_Length_X</w:t>
+            </w:r>
+          </w:p>
+        </w:tc>
+      </w:tr>
+      <w:tr>
+        <w:trPr>
+          <w:trHeight w:val="547"/>
+        </w:trPr>
+        <w:tc>
+          <w:tcPr>
+            <w:tcW w:w="2263" w:type="dxa"/>
+          </w:tcPr>
+          <w:p>
+            <w:pPr>
+              <w:jc w:val="center"/>
+              <w:rPr>
+                <w:sz w:val="20"/>
+              </w:rPr>
+            </w:pPr>
+            <w:r>
+              <w:rPr>
+                <w:sz w:val="20"/>
+              </w:rPr>
+              <w:t>Word_Length_X</w:t>
+            </w:r>
+          </w:p>
+          <w:p>
+            <w:pPr>
+              <w:jc w:val="center"/>
+              <w:rPr>
+                <w:sz w:val="20"/>
+              </w:rPr>
+            </w:pPr>
+          </w:p>
+        </w:tc>
+        <w:tc>
+          <w:tcPr>
+            <w:tcW w:w="1985" w:type="dxa"/>
+          </w:tcPr>
+          <w:p>
+            <w:pPr>
+              <w:jc w:val="center"/>
+              <w:rPr>
+                <w:sz w:val="20"/>
+              </w:rPr>
+            </w:pPr>
+            <w:r>
+              <w:rPr>
+                <w:sz w:val="20"/>
+              </w:rPr>
+              <w:t>float</w:t>
+            </w:r>
+          </w:p>
+        </w:tc>
+        <w:tc>
+          <w:tcPr>
+            <w:tcW w:w="5528" w:type="dxa"/>
+          </w:tcPr>
+          <w:p>
+            <w:pPr>
+              <w:rPr>
+                <w:sz w:val="20"/>
+              </w:rPr>
+            </w:pPr>
+            <w:r>
+              <w:rPr>
+                <w:sz w:val="20"/>
+              </w:rPr>
+              <w:t>The horizontal length that each word takes up in the X axis. Used to make sure word fits on the page</w:t>
+            </w:r>
+          </w:p>
+        </w:tc>
+      </w:tr>
+      <w:tr>
+        <w:trPr>
+          <w:trHeight w:val="547"/>
+        </w:trPr>
+        <w:tc>
+          <w:tcPr>
+            <w:tcW w:w="2263" w:type="dxa"/>
+          </w:tcPr>
+          <w:p>
+            <w:pPr>
+              <w:jc w:val="center"/>
+              <w:rPr>
+                <w:sz w:val="20"/>
+              </w:rPr>
+            </w:pPr>
+            <w:r>
+              <w:rPr>
+                <w:sz w:val="20"/>
+              </w:rPr>
+              <w:t>NewLine</w:t>
+            </w:r>
+          </w:p>
+          <w:p>
+            <w:pPr>
+              <w:jc w:val="center"/>
+              <w:rPr>
+                <w:sz w:val="20"/>
+              </w:rPr>
+            </w:pPr>
+          </w:p>
+        </w:tc>
+        <w:tc>
+          <w:tcPr>
+            <w:tcW w:w="1985" w:type="dxa"/>
+          </w:tcPr>
+          <w:p>
+            <w:pPr>
+              <w:jc w:val="center"/>
+              <w:rPr>
+                <w:sz w:val="20"/>
+              </w:rPr>
+            </w:pPr>
+            <w:r>
+              <w:rPr>
+                <w:sz w:val="20"/>
+              </w:rPr>
+              <w:t>int</w:t>
+            </w:r>
+          </w:p>
+        </w:tc>
+        <w:tc>
+          <w:tcPr>
+            <w:tcW w:w="5528" w:type="dxa"/>
+          </w:tcPr>
+          <w:p>
+            <w:pPr>
+              <w:rPr>
+                <w:sz w:val="20"/>
+              </w:rPr>
+            </w:pPr>
+          </w:p>
+        </w:tc>
+      </w:tr>
+      <w:tr>
+        <w:trPr>
+          <w:trHeight w:val="547"/>
+        </w:trPr>
+        <w:tc>
+          <w:tcPr>
+            <w:tcW w:w="2263" w:type="dxa"/>
+          </w:tcPr>
+          <w:p>
+            <w:pPr>
+              <w:jc w:val="center"/>
+              <w:rPr>
+                <w:sz w:val="20"/>
+              </w:rPr>
+            </w:pPr>
+            <w:r>
+              <w:rPr>
+                <w:sz w:val="20"/>
+              </w:rPr>
+              <w:t>X</w:t>
+            </w:r>
+          </w:p>
+          <w:p>
+            <w:pPr>
+              <w:jc w:val="center"/>
+              <w:rPr>
+                <w:sz w:val="20"/>
+              </w:rPr>
+            </w:pPr>
+          </w:p>
+        </w:tc>
+        <w:tc>
+          <w:tcPr>
+            <w:tcW w:w="1985" w:type="dxa"/>
+          </w:tcPr>
+          <w:p>
+            <w:pPr>
+              <w:jc w:val="center"/>
+              <w:rPr>
+                <w:sz w:val="20"/>
+              </w:rPr>
+            </w:pPr>
+            <w:r>
+              <w:rPr>
+                <w:sz w:val="20"/>
+              </w:rPr>
+              <w:t>float</w:t>
+            </w:r>
+          </w:p>
+        </w:tc>
+        <w:tc>
+          <w:tcPr>
+            <w:tcW w:w="5528" w:type="dxa"/>
+          </w:tcPr>
+          <w:p>
+            <w:pPr>
+              <w:rPr>
+                <w:sz w:val="20"/>
+              </w:rPr>
+            </w:pPr>
+            <w:r>
+              <w:rPr>
+                <w:sz w:val="20"/>
+              </w:rPr>
+              <w:t>Defines the X value in each line of “SingleStrokeFont.txt”</w:t>
+            </w:r>
+          </w:p>
+        </w:tc>
+      </w:tr>
+      <w:tr>
+        <w:trPr>
+          <w:trHeight w:val="547"/>
+        </w:trPr>
+        <w:tc>
+          <w:tcPr>
+            <w:tcW w:w="2263" w:type="dxa"/>
+          </w:tcPr>
+          <w:p>
+            <w:pPr>
+              <w:jc w:val="center"/>
+              <w:rPr>
+                <w:sz w:val="20"/>
+              </w:rPr>
+            </w:pPr>
+            <w:r>
+              <w:rPr>
+                <w:sz w:val="20"/>
+              </w:rPr>
+              <w:t>Y</w:t>
+            </w:r>
+          </w:p>
+          <w:p>
+            <w:pPr>
+              <w:jc w:val="center"/>
+              <w:rPr>
+                <w:sz w:val="20"/>
+              </w:rPr>
+            </w:pPr>
+          </w:p>
+        </w:tc>
+        <w:tc>
+          <w:tcPr>
+            <w:tcW w:w="1985" w:type="dxa"/>
+          </w:tcPr>
+          <w:p>
+            <w:pPr>
+              <w:jc w:val="center"/>
+              <w:rPr>
+                <w:sz w:val="20"/>
+              </w:rPr>
+            </w:pPr>
+            <w:r>
+              <w:rPr>
+                <w:sz w:val="20"/>
+              </w:rPr>
+              <w:t>float</w:t>
+            </w:r>
+          </w:p>
+        </w:tc>
+        <w:tc>
+          <w:tcPr>
+            <w:tcW w:w="5528" w:type="dxa"/>
+          </w:tcPr>
+          <w:p>
+            <w:pPr>
+              <w:rPr>
+                <w:sz w:val="20"/>
+              </w:rPr>
+            </w:pPr>
+            <w:r>
+              <w:rPr>
+                <w:sz w:val="20"/>
+              </w:rPr>
+              <w:t>Defines the Y value in each line of “SingleStrokeFont.txt”</w:t>
+            </w:r>
+          </w:p>
+        </w:tc>
+      </w:tr>
+      <w:tr>
+        <w:trPr>
+          <w:trHeight w:val="547"/>
+        </w:trPr>
+        <w:tc>
+          <w:tcPr>
+            <w:tcW w:w="2263" w:type="dxa"/>
+          </w:tcPr>
+          <w:p>
+            <w:pPr>
+              <w:jc w:val="center"/>
+              <w:rPr>
+                <w:sz w:val="20"/>
+              </w:rPr>
+            </w:pPr>
+            <w:r>
+              <w:rPr>
+                <w:sz w:val="20"/>
+              </w:rPr>
+              <w:lastRenderedPageBreak/>
+              <w:t>P</w:t>
+            </w:r>
+          </w:p>
+          <w:p>
+            <w:pPr>
+              <w:jc w:val="center"/>
+              <w:rPr>
+                <w:sz w:val="20"/>
+              </w:rPr>
+            </w:pPr>
+          </w:p>
+        </w:tc>
+        <w:tc>
+          <w:tcPr>
+            <w:tcW w:w="1985" w:type="dxa"/>
+          </w:tcPr>
+          <w:p>
+            <w:pPr>
+              <w:jc w:val="center"/>
+              <w:rPr>
+                <w:sz w:val="20"/>
+              </w:rPr>
+            </w:pPr>
+            <w:r>
+              <w:rPr>
+                <w:sz w:val="20"/>
+              </w:rPr>
+              <w:t>int</w:t>
+            </w:r>
+          </w:p>
+        </w:tc>
+        <w:tc>
+          <w:tcPr>
+            <w:tcW w:w="5528" w:type="dxa"/>
+          </w:tcPr>
+          <w:p>
+            <w:pPr>
+              <w:rPr>
+                <w:sz w:val="20"/>
+              </w:rPr>
+            </w:pPr>
+            <w:r>
+              <w:rPr>
+                <w:sz w:val="20"/>
+              </w:rPr>
+              <w:t>Defines the P value in each line of “SingleStrokeFont.txt”</w:t>
+            </w:r>
+          </w:p>
+        </w:tc>
+      </w:tr>
+      <w:tr>
+        <w:trPr>
+          <w:trHeight w:val="547"/>
+        </w:trPr>
+        <w:tc>
+          <w:tcPr>
+            <w:tcW w:w="2263" w:type="dxa"/>
+          </w:tcPr>
+          <w:p>
+            <w:pPr>
+              <w:jc w:val="center"/>
+              <w:rPr>
+                <w:sz w:val="20"/>
+              </w:rPr>
+            </w:pPr>
+            <w:r>
+              <w:rPr>
+                <w:sz w:val="20"/>
+              </w:rPr>
+              <w:t>AsciiLine</w:t>
+            </w:r>
+          </w:p>
+          <w:p>
+            <w:pPr>
+              <w:jc w:val="center"/>
+              <w:rPr>
+                <w:sz w:val="20"/>
+              </w:rPr>
+            </w:pPr>
+          </w:p>
+        </w:tc>
+        <w:tc>
+          <w:tcPr>
+            <w:tcW w:w="1985" w:type="dxa"/>
+          </w:tcPr>
+          <w:p>
+            <w:pPr>
+              <w:jc w:val="center"/>
+              <w:rPr>
+                <w:sz w:val="20"/>
+              </w:rPr>
+            </w:pPr>
+            <w:r>
+              <w:rPr>
+                <w:sz w:val="20"/>
+              </w:rPr>
+              <w:t>struct</w:t>
+            </w:r>
+          </w:p>
+        </w:tc>
+        <w:tc>
+          <w:tcPr>
+            <w:tcW w:w="5528" w:type="dxa"/>
+          </w:tcPr>
+          <w:p>
+            <w:pPr>
+              <w:rPr>
+                <w:sz w:val="20"/>
+              </w:rPr>
+            </w:pPr>
+          </w:p>
+        </w:tc>
+      </w:tr>
+      <w:tr>
+        <w:trPr>
+          <w:trHeight w:val="547"/>
+        </w:trPr>
+        <w:tc>
+          <w:tcPr>
+            <w:tcW w:w="2263" w:type="dxa"/>
+          </w:tcPr>
+          <w:p>
+            <w:pPr>
+              <w:jc w:val="center"/>
+              <w:rPr>
+                <w:sz w:val="20"/>
+              </w:rPr>
+            </w:pPr>
+            <w:r>
+              <w:rPr>
+                <w:sz w:val="20"/>
+              </w:rPr>
+              <w:t>AsciiValue</w:t>
+            </w:r>
+          </w:p>
+          <w:p>
+            <w:pPr>
+              <w:jc w:val="center"/>
+              <w:rPr>
+                <w:sz w:val="20"/>
+              </w:rPr>
+            </w:pPr>
+          </w:p>
+        </w:tc>
+        <w:tc>
+          <w:tcPr>
+            <w:tcW w:w="1985" w:type="dxa"/>
+          </w:tcPr>
+          <w:p>
+            <w:pPr>
+              <w:jc w:val="center"/>
+              <w:rPr>
+                <w:sz w:val="20"/>
+              </w:rPr>
+            </w:pPr>
+            <w:r>
+              <w:rPr>
+                <w:sz w:val="20"/>
+              </w:rPr>
+              <w:t>int</w:t>
+            </w:r>
+          </w:p>
+        </w:tc>
+        <w:tc>
+          <w:tcPr>
+            <w:tcW w:w="5528" w:type="dxa"/>
+          </w:tcPr>
+          <w:p>
+            <w:pPr>
+              <w:rPr>
+                <w:sz w:val="20"/>
+              </w:rPr>
+            </w:pPr>
+            <w:r>
+              <w:rPr>
+                <w:sz w:val="20"/>
+              </w:rPr>
+              <w:t>Defines the Ascii number for each of the 128 characters in “SingleStrokeFont.txt”</w:t>
+            </w:r>
+          </w:p>
+        </w:tc>
+      </w:tr>
+      <w:tr>
+        <w:trPr>
+          <w:trHeight w:val="547"/>
+        </w:trPr>
+        <w:tc>
+          <w:tcPr>
+            <w:tcW w:w="2263" w:type="dxa"/>
+          </w:tcPr>
+          <w:p>
+            <w:pPr>
+              <w:jc w:val="center"/>
+              <w:rPr>
+                <w:sz w:val="20"/>
+              </w:rPr>
+            </w:pPr>
+            <w:r>
+              <w:rPr>
+                <w:sz w:val="20"/>
+              </w:rPr>
+              <w:t>NumberOfLines</w:t>
+            </w:r>
+          </w:p>
+          <w:p>
+            <w:pPr>
+              <w:jc w:val="center"/>
+              <w:rPr>
+                <w:sz w:val="20"/>
+              </w:rPr>
+            </w:pPr>
+          </w:p>
+        </w:tc>
+        <w:tc>
+          <w:tcPr>
+            <w:tcW w:w="1985" w:type="dxa"/>
+          </w:tcPr>
+          <w:p>
+            <w:pPr>
+              <w:jc w:val="center"/>
+              <w:rPr>
+                <w:sz w:val="20"/>
+              </w:rPr>
+            </w:pPr>
+            <w:r>
+              <w:rPr>
+                <w:sz w:val="20"/>
+              </w:rPr>
+              <w:t>int</w:t>
+            </w:r>
+          </w:p>
+        </w:tc>
+        <w:tc>
+          <w:tcPr>
+            <w:tcW w:w="5528" w:type="dxa"/>
+          </w:tcPr>
+          <w:p>
+            <w:pPr>
+              <w:rPr>
+                <w:sz w:val="20"/>
+              </w:rPr>
+            </w:pPr>
+            <w:r>
+              <w:rPr>
+                <w:sz w:val="20"/>
+              </w:rPr>
+              <w:t>Defines the number of stroke lines that each character has in it “SingleStrokeFont.txt”</w:t>
+            </w:r>
+          </w:p>
+        </w:tc>
+      </w:tr>
+      <w:tr>
+        <w:trPr>
+          <w:trHeight w:val="547"/>
+        </w:trPr>
+        <w:tc>
+          <w:tcPr>
+            <w:tcW w:w="2263" w:type="dxa"/>
+          </w:tcPr>
+          <w:p>
+            <w:pPr>
+              <w:jc w:val="center"/>
+              <w:rPr>
+                <w:sz w:val="20"/>
+              </w:rPr>
+            </w:pPr>
+            <w:r>
+              <w:rPr>
+                <w:sz w:val="20"/>
+              </w:rPr>
+              <w:t>*Lines[50]</w:t>
+            </w:r>
+          </w:p>
+          <w:p>
+            <w:pPr>
+              <w:jc w:val="center"/>
+              <w:rPr>
+                <w:sz w:val="20"/>
+              </w:rPr>
+            </w:pPr>
+          </w:p>
+        </w:tc>
+        <w:tc>
+          <w:tcPr>
+            <w:tcW w:w="1985" w:type="dxa"/>
+          </w:tcPr>
+          <w:p>
+            <w:pPr>
+              <w:jc w:val="center"/>
+              <w:rPr>
+                <w:sz w:val="20"/>
+              </w:rPr>
+            </w:pPr>
+            <w:r>
+              <w:rPr>
+                <w:sz w:val="20"/>
+              </w:rPr>
+              <w:t>char</w:t>
+            </w:r>
+          </w:p>
+        </w:tc>
+        <w:tc>
+          <w:tcPr>
+            <w:tcW w:w="5528" w:type="dxa"/>
+          </w:tcPr>
+          <w:p>
+            <w:pPr>
+              <w:rPr>
+                <w:sz w:val="20"/>
+              </w:rPr>
+            </w:pPr>
+          </w:p>
+        </w:tc>
+      </w:tr>
+      <w:tr>
+        <w:trPr>
+          <w:trHeight w:val="547"/>
+        </w:trPr>
+        <w:tc>
+          <w:tcPr>
+            <w:tcW w:w="2263" w:type="dxa"/>
+          </w:tcPr>
+          <w:p>
+            <w:pPr>
+              <w:jc w:val="center"/>
+              <w:rPr>
+                <w:sz w:val="20"/>
+              </w:rPr>
+            </w:pPr>
+            <w:r>
+              <w:rPr>
+                <w:sz w:val="20"/>
+              </w:rPr>
+              <w:t>*FontArray</w:t>
+            </w:r>
+          </w:p>
+          <w:p>
+            <w:pPr>
+              <w:jc w:val="center"/>
+              <w:rPr>
+                <w:sz w:val="20"/>
+              </w:rPr>
+            </w:pPr>
+          </w:p>
+        </w:tc>
+        <w:tc>
+          <w:tcPr>
+            <w:tcW w:w="1985" w:type="dxa"/>
+          </w:tcPr>
+          <w:p>
+            <w:pPr>
+              <w:jc w:val="center"/>
+              <w:rPr>
+                <w:sz w:val="20"/>
+              </w:rPr>
+            </w:pPr>
+            <w:r>
+              <w:rPr>
+                <w:sz w:val="20"/>
+              </w:rPr>
+              <w:t>array</w:t>
+            </w:r>
+          </w:p>
+        </w:tc>
+        <w:tc>
+          <w:tcPr>
+            <w:tcW w:w="5528" w:type="dxa"/>
+          </w:tcPr>
+          <w:p>
+            <w:pPr>
+              <w:rPr>
+                <w:sz w:val="20"/>
+              </w:rPr>
+            </w:pPr>
+            <w:r>
+              <w:rPr>
+                <w:sz w:val="20"/>
+              </w:rPr>
+              <w:t>An array that holds all of the stroke lines within “SingleStrokeFont.txt”</w:t>
+            </w:r>
+          </w:p>
+        </w:tc>
+      </w:tr>
+      <w:tr>
+        <w:trPr>
+          <w:trHeight w:val="547"/>
+        </w:trPr>
+        <w:tc>
+          <w:tcPr>
+            <w:tcW w:w="2263" w:type="dxa"/>
+          </w:tcPr>
+          <w:p>
+            <w:pPr>
+              <w:jc w:val="center"/>
+              <w:rPr>
+                <w:sz w:val="20"/>
+              </w:rPr>
+            </w:pPr>
+            <w:r>
+              <w:rPr>
+                <w:sz w:val="20"/>
+              </w:rPr>
+              <w:t>FontCount</w:t>
+            </w:r>
+          </w:p>
+          <w:p>
+            <w:pPr>
+              <w:jc w:val="center"/>
+              <w:rPr>
+                <w:sz w:val="20"/>
+              </w:rPr>
+            </w:pPr>
+          </w:p>
+        </w:tc>
+        <w:tc>
+          <w:tcPr>
+            <w:tcW w:w="1985" w:type="dxa"/>
+          </w:tcPr>
+          <w:p>
+            <w:pPr>
+              <w:jc w:val="center"/>
+              <w:rPr>
+                <w:sz w:val="20"/>
+              </w:rPr>
+            </w:pPr>
+            <w:r>
+              <w:rPr>
+                <w:sz w:val="20"/>
+              </w:rPr>
+              <w:t>int</w:t>
+            </w:r>
+          </w:p>
+        </w:tc>
+        <w:tc>
+          <w:tcPr>
+            <w:tcW w:w="5528" w:type="dxa"/>
+          </w:tcPr>
+          <w:p>
+            <w:pPr>
+              <w:rPr>
+                <w:sz w:val="20"/>
+              </w:rPr>
+            </w:pPr>
+            <w:r>
+              <w:rPr>
+                <w:sz w:val="20"/>
+              </w:rPr>
+              <w:t xml:space="preserve">Calculates how many characters that have been defined in “SingleStrokeFont.txt” </w:t>
+            </w:r>
+          </w:p>
+        </w:tc>
+      </w:tr>
+      <w:tr>
+        <w:trPr>
+          <w:trHeight w:val="547"/>
+        </w:trPr>
+        <w:tc>
+          <w:tcPr>
+            <w:tcW w:w="2263" w:type="dxa"/>
+          </w:tcPr>
+          <w:p>
+            <w:pPr>
+              <w:jc w:val="center"/>
+              <w:rPr>
+                <w:sz w:val="20"/>
+              </w:rPr>
+            </w:pPr>
+            <w:r>
+              <w:rPr>
+                <w:sz w:val="20"/>
+              </w:rPr>
+              <w:t>ScannedValue</w:t>
+            </w:r>
+          </w:p>
+          <w:p>
+            <w:pPr>
+              <w:jc w:val="center"/>
+              <w:rPr>
+                <w:sz w:val="20"/>
+              </w:rPr>
+            </w:pPr>
+          </w:p>
+        </w:tc>
+        <w:tc>
+          <w:tcPr>
+            <w:tcW w:w="1985" w:type="dxa"/>
+          </w:tcPr>
+          <w:p>
+            <w:pPr>
+              <w:jc w:val="center"/>
+              <w:rPr>
+                <w:sz w:val="20"/>
+              </w:rPr>
+            </w:pPr>
+            <w:r>
+              <w:rPr>
+                <w:sz w:val="20"/>
+              </w:rPr>
+              <w:t>int</w:t>
+            </w:r>
+          </w:p>
+        </w:tc>
+        <w:tc>
+          <w:tcPr>
+            <w:tcW w:w="5528" w:type="dxa"/>
+          </w:tcPr>
+          <w:p>
+            <w:pPr>
+              <w:rPr>
+                <w:sz w:val="20"/>
+              </w:rPr>
+            </w:pPr>
+            <w:r>
+              <w:rPr>
+                <w:sz w:val="20"/>
+              </w:rPr>
+              <w:t xml:space="preserve">Used to check if the number scanned in the “SingleStrokeFont.txt” is equal to 999 and if so </w:t>
+            </w:r>
+            <w:r>
+              <w:rPr>
+                <w:sz w:val="20"/>
+              </w:rPr>
+              <w:t>we know the next character’s stroke is being defined below</w:t>
+            </w:r>
+          </w:p>
+        </w:tc>
+      </w:tr>
+      <w:tr>
+        <w:trPr>
+          <w:trHeight w:val="547"/>
+        </w:trPr>
+        <w:tc>
+          <w:tcPr>
+            <w:tcW w:w="2263" w:type="dxa"/>
+          </w:tcPr>
+          <w:p>
+            <w:pPr>
+              <w:jc w:val="center"/>
+              <w:rPr>
+                <w:sz w:val="20"/>
+              </w:rPr>
+            </w:pPr>
+            <w:r>
+              <w:rPr>
+                <w:sz w:val="20"/>
+              </w:rPr>
+              <w:t>*OutFontCount</w:t>
+            </w:r>
+          </w:p>
+          <w:p>
+            <w:pPr>
+              <w:jc w:val="center"/>
+              <w:rPr>
+                <w:sz w:val="20"/>
+              </w:rPr>
+            </w:pPr>
+          </w:p>
+        </w:tc>
+        <w:tc>
+          <w:tcPr>
+            <w:tcW w:w="1985" w:type="dxa"/>
+          </w:tcPr>
+          <w:p>
+            <w:pPr>
+              <w:jc w:val="center"/>
+              <w:rPr>
+                <w:sz w:val="20"/>
+              </w:rPr>
+            </w:pPr>
+            <w:r>
+              <w:rPr>
+                <w:sz w:val="20"/>
+              </w:rPr>
+              <w:t>int</w:t>
+            </w:r>
+          </w:p>
+        </w:tc>
+        <w:tc>
+          <w:tcPr>
+            <w:tcW w:w="5528" w:type="dxa"/>
+          </w:tcPr>
+          <w:p>
+            <w:pPr>
+              <w:rPr>
+                <w:sz w:val="20"/>
+              </w:rPr>
+            </w:pPr>
+          </w:p>
+        </w:tc>
+      </w:tr>
+      <w:tr>
+        <w:trPr>
+          <w:trHeight w:val="547"/>
+        </w:trPr>
+        <w:tc>
+          <w:tcPr>
+            <w:tcW w:w="2263" w:type="dxa"/>
+          </w:tcPr>
+          <w:p>
+            <w:pPr>
+              <w:jc w:val="center"/>
+              <w:rPr>
+                <w:sz w:val="20"/>
+              </w:rPr>
+            </w:pPr>
+            <w:r>
+              <w:rPr>
+                <w:sz w:val="20"/>
+              </w:rPr>
+              <w:t>*FP</w:t>
+            </w:r>
+          </w:p>
+        </w:tc>
+        <w:tc>
+          <w:tcPr>
+            <w:tcW w:w="1985" w:type="dxa"/>
+          </w:tcPr>
+          <w:p>
+            <w:pPr>
+              <w:jc w:val="center"/>
+              <w:rPr>
+                <w:sz w:val="20"/>
+              </w:rPr>
+            </w:pPr>
+            <w:r>
+              <w:rPr>
+                <w:sz w:val="20"/>
+              </w:rPr>
+              <w:t>pointer</w:t>
+            </w:r>
+          </w:p>
+        </w:tc>
+        <w:tc>
+          <w:tcPr>
+            <w:tcW w:w="5528" w:type="dxa"/>
+          </w:tcPr>
+          <w:p>
+            <w:pPr>
+              <w:rPr>
+                <w:sz w:val="20"/>
+              </w:rPr>
+            </w:pPr>
+          </w:p>
+        </w:tc>
+      </w:tr>
+      <w:tr>
+        <w:trPr>
+          <w:trHeight w:val="547"/>
+        </w:trPr>
+        <w:tc>
+          <w:tcPr>
+            <w:tcW w:w="2263" w:type="dxa"/>
+          </w:tcPr>
+          <w:p>
+            <w:pPr>
+              <w:jc w:val="center"/>
+              <w:rPr>
+                <w:sz w:val="20"/>
+              </w:rPr>
+            </w:pPr>
+            <w:r>
+              <w:rPr>
+                <w:sz w:val="20"/>
+              </w:rPr>
+              <w:t>*Sentence</w:t>
+            </w:r>
+          </w:p>
+        </w:tc>
+        <w:tc>
+          <w:tcPr>
+            <w:tcW w:w="1985" w:type="dxa"/>
+          </w:tcPr>
+          <w:p>
+            <w:pPr>
+              <w:jc w:val="center"/>
+              <w:rPr>
+                <w:sz w:val="20"/>
+              </w:rPr>
+            </w:pPr>
+            <w:r>
+              <w:rPr>
+                <w:sz w:val="20"/>
+              </w:rPr>
+              <w:t>pointer</w:t>
+            </w:r>
+          </w:p>
+        </w:tc>
+        <w:tc>
+          <w:tcPr>
+            <w:tcW w:w="5528" w:type="dxa"/>
+          </w:tcPr>
+          <w:p>
+            <w:pPr>
+              <w:rPr>
+                <w:sz w:val="20"/>
+              </w:rPr>
+            </w:pPr>
+          </w:p>
+        </w:tc>
+      </w:tr>
+      <w:tr>
+        <w:trPr>
+          <w:trHeight w:val="547"/>
+        </w:trPr>
+        <w:tc>
+          <w:tcPr>
+            <w:tcW w:w="2263" w:type="dxa"/>
+          </w:tcPr>
+          <w:p>
+            <w:pPr>
+              <w:jc w:val="center"/>
+              <w:rPr>
+                <w:sz w:val="20"/>
+              </w:rPr>
+            </w:pPr>
+            <w:r>
+              <w:rPr>
+                <w:sz w:val="20"/>
+              </w:rPr>
+              <w:t>EndOfSentence</w:t>
+            </w:r>
+          </w:p>
+        </w:tc>
+        <w:tc>
+          <w:tcPr>
+            <w:tcW w:w="1985" w:type="dxa"/>
+          </w:tcPr>
+          <w:p>
+            <w:pPr>
+              <w:jc w:val="center"/>
+              <w:rPr>
+                <w:sz w:val="20"/>
+              </w:rPr>
+            </w:pPr>
+            <w:r>
+              <w:rPr>
+                <w:sz w:val="20"/>
+              </w:rPr>
+              <w:t>int</w:t>
+            </w:r>
+          </w:p>
+        </w:tc>
+        <w:tc>
+          <w:tcPr>
+            <w:tcW w:w="5528" w:type="dxa"/>
+          </w:tcPr>
+          <w:p>
+            <w:pPr>
+              <w:rPr>
+                <w:sz w:val="20"/>
+              </w:rPr>
+            </w:pPr>
+          </w:p>
         </w:tc>
       </w:tr>
     </w:tbl>
@@ -181,199 +2075,415 @@
     <w:p>
       <w:pPr>
         <w:rPr>
-          <w:i/>
-          <w:iCs/>
+          <w:b/>
+          <w:bCs/>
         </w:rPr>
       </w:pPr>
       <w:r>
         <w:rPr>
-          <w:i/>
-          <w:iCs/>
-        </w:rPr>
-        <w:t>Only include functions that you have written yourself.</w:t>
+          <w:b/>
+          <w:bCs/>
+        </w:rPr>
+        <w:t>LoadData(int *OutFontCount)</w:t>
+      </w:r>
+    </w:p>
+    <w:p>
+      <w:r>
+        <w:t>Parameters:</w:t>
       </w:r>
     </w:p>
     <w:p>
       <w:pPr>
         <w:rPr>
-          <w:i/>
-          <w:iCs/>
+          <w:b/>
+          <w:bCs/>
         </w:rPr>
       </w:pPr>
-      <w:r>
-        <w:rPr>
-          <w:i/>
-          <w:iCs/>
-        </w:rPr>
-        <w:t>Example (remove</w:t>
-      </w:r>
-      <w:r>
-        <w:rPr>
-          <w:i/>
-          <w:iCs/>
-        </w:rPr>
-        <w:t xml:space="preserve"> before submission)</w:t>
-      </w:r>
     </w:p>
     <w:p>
       <w:pPr>
         <w:rPr>
-          <w:i/>
-          <w:iCs/>
+          <w:b/>
+          <w:bCs/>
         </w:rPr>
       </w:pPr>
       <w:r>
         <w:rPr>
-          <w:i/>
-          <w:iCs/>
-        </w:rPr>
-        <w:t>Short description (one or two lines)</w:t>
+          <w:b/>
+          <w:bCs/>
+        </w:rPr>
+        <w:t>int main(void)</w:t>
+      </w:r>
+    </w:p>
+    <w:p>
+      <w:r>
+        <w:t>Parameters:</w:t>
+      </w:r>
+    </w:p>
+    <w:p/>
+    <w:p>
+      <w:pPr>
+        <w:rPr>
+          <w:b/>
+          <w:bCs/>
+        </w:rPr>
+      </w:pPr>
+      <w:r>
+        <w:rPr>
+          <w:b/>
+          <w:bCs/>
+        </w:rPr>
+        <w:t>float FontSize(void)</w:t>
+      </w:r>
+    </w:p>
+    <w:p>
+      <w:r>
+        <w:t>Parameters:</w:t>
+      </w:r>
+    </w:p>
+    <w:p/>
+    <w:p>
+      <w:pPr>
+        <w:rPr>
+          <w:b/>
+          <w:bCs/>
+        </w:rPr>
+      </w:pPr>
+      <w:r>
+        <w:rPr>
+          <w:b/>
+          <w:bCs/>
+        </w:rPr>
+        <w:t>void ReadAndSendNextWord(void)</w:t>
+      </w:r>
+    </w:p>
+    <w:p>
+      <w:r>
+        <w:t>Parameters:</w:t>
       </w:r>
     </w:p>
     <w:p>
       <w:pPr>
         <w:rPr>
-          <w:i/>
-          <w:iCs/>
+          <w:b/>
+          <w:bCs/>
         </w:rPr>
       </w:pPr>
-      <w:r>
-        <w:rPr>
-          <w:i/>
-          <w:iCs/>
-        </w:rPr>
-        <w:t>i</w:t>
-      </w:r>
-      <w:r>
-        <w:rPr>
-          <w:i/>
-          <w:iCs/>
-        </w:rPr>
-        <w:t xml:space="preserve">nt </w:t>
-      </w:r>
-      <w:proofErr w:type="spellStart"/>
-      <w:r>
-        <w:rPr>
-          <w:i/>
-          <w:iCs/>
-        </w:rPr>
-        <w:t>Temp</w:t>
-      </w:r>
-      <w:r>
-        <w:rPr>
-          <w:i/>
-          <w:iCs/>
-        </w:rPr>
-        <w:t>erature</w:t>
-      </w:r>
-      <w:r>
-        <w:rPr>
-          <w:i/>
-          <w:iCs/>
-        </w:rPr>
-        <w:t>Conversion</w:t>
-      </w:r>
-      <w:proofErr w:type="spellEnd"/>
-      <w:r>
-        <w:rPr>
-          <w:i/>
-          <w:iCs/>
-        </w:rPr>
-        <w:t xml:space="preserve">( </w:t>
-      </w:r>
-      <w:r>
-        <w:rPr>
-          <w:i/>
-          <w:iCs/>
-        </w:rPr>
-        <w:t xml:space="preserve">int </w:t>
-      </w:r>
-      <w:proofErr w:type="spellStart"/>
-      <w:r>
-        <w:rPr>
-          <w:i/>
-          <w:iCs/>
-        </w:rPr>
-        <w:t>Input</w:t>
-      </w:r>
-      <w:r>
-        <w:rPr>
-          <w:i/>
-          <w:iCs/>
-        </w:rPr>
-        <w:t>Temp</w:t>
-      </w:r>
-      <w:proofErr w:type="spellEnd"/>
-      <w:r>
-        <w:rPr>
-          <w:i/>
-          <w:iCs/>
-        </w:rPr>
-        <w:t>,</w:t>
-      </w:r>
-      <w:r>
-        <w:rPr>
-          <w:i/>
-          <w:iCs/>
-        </w:rPr>
-        <w:t xml:space="preserve"> </w:t>
-      </w:r>
-      <w:r>
-        <w:rPr>
-          <w:i/>
-          <w:iCs/>
-        </w:rPr>
-        <w:t xml:space="preserve"> float* </w:t>
-      </w:r>
-      <w:proofErr w:type="spellStart"/>
-      <w:r>
-        <w:rPr>
-          <w:i/>
-          <w:iCs/>
-        </w:rPr>
-        <w:t>Output</w:t>
-      </w:r>
-      <w:r>
-        <w:rPr>
-          <w:i/>
-          <w:iCs/>
-        </w:rPr>
-        <w:t>Temp</w:t>
-      </w:r>
-      <w:proofErr w:type="spellEnd"/>
-      <w:r>
-        <w:rPr>
-          <w:i/>
-          <w:iCs/>
-        </w:rPr>
-        <w:t xml:space="preserve"> </w:t>
-      </w:r>
-      <w:r>
-        <w:rPr>
-          <w:i/>
-          <w:iCs/>
-        </w:rPr>
-        <w:t>)</w:t>
-      </w:r>
     </w:p>
     <w:p>
       <w:pPr>
         <w:rPr>
-          <w:i/>
-          <w:iCs/>
+          <w:b/>
+          <w:bCs/>
         </w:rPr>
       </w:pPr>
       <w:r>
         <w:rPr>
-          <w:i/>
-          <w:iCs/>
-        </w:rPr>
+          <w:b/>
+          <w:bCs/>
+        </w:rPr>
+        <w:t>float WordLength(void)</w:t>
+      </w:r>
+    </w:p>
+    <w:p>
+      <w:r>
         <w:t>Parameters:</w:t>
       </w:r>
-      <w:r>
-        <w:rPr>
-          <w:i/>
-          <w:iCs/>
+    </w:p>
+    <w:p/>
+    <w:p>
+      <w:pPr>
+        <w:rPr>
+          <w:b/>
+          <w:bCs/>
+        </w:rPr>
+      </w:pPr>
+      <w:r>
+        <w:rPr>
+          <w:b/>
+          <w:bCs/>
+        </w:rPr>
+        <w:t>void SetNewLine(void)</w:t>
+      </w:r>
+    </w:p>
+    <w:p>
+      <w:r>
+        <w:t>Parameters:</w:t>
+      </w:r>
+    </w:p>
+    <w:p>
+      <w:pPr>
+        <w:rPr>
+          <w:b/>
+          <w:bCs/>
+        </w:rPr>
+      </w:pPr>
+    </w:p>
+    <w:p>
+      <w:pPr>
+        <w:rPr>
+          <w:b/>
+          <w:bCs/>
+        </w:rPr>
+      </w:pPr>
+      <w:r>
+        <w:rPr>
+          <w:b/>
+          <w:bCs/>
+        </w:rPr>
+        <w:t>void CharacterGCode(void)</w:t>
+      </w:r>
+    </w:p>
+    <w:p>
+      <w:r>
+        <w:t>Parameters:</w:t>
+      </w:r>
+    </w:p>
+    <w:p/>
+    <w:p>
+      <w:pPr>
+        <w:rPr>
+          <w:b/>
+          <w:bCs/>
+        </w:rPr>
+      </w:pPr>
+      <w:r>
+        <w:rPr>
+          <w:b/>
+          <w:bCs/>
+        </w:rPr>
+        <w:t>void SetRobot(void)</w:t>
+      </w:r>
+    </w:p>
+    <w:p>
+      <w:r>
+        <w:t>Parameters:</w:t>
+      </w:r>
+    </w:p>
+    <w:p/>
+    <w:p>
+      <w:pPr>
+        <w:rPr>
+          <w:i/>
+          <w:iCs/>
+          <w:color w:val="EE0000"/>
+        </w:rPr>
+      </w:pPr>
+      <w:r>
+        <w:rPr>
+          <w:i/>
+          <w:iCs/>
+          <w:color w:val="EE0000"/>
+        </w:rPr>
+        <w:t>Only include functions that you have written yourself.</w:t>
+      </w:r>
+    </w:p>
+    <w:p>
+      <w:pPr>
+        <w:rPr>
+          <w:i/>
+          <w:iCs/>
+          <w:color w:val="EE0000"/>
+        </w:rPr>
+      </w:pPr>
+      <w:r>
+        <w:rPr>
+          <w:i/>
+          <w:iCs/>
+          <w:color w:val="EE0000"/>
+        </w:rPr>
+        <w:t>Example (remove</w:t>
+      </w:r>
+      <w:r>
+        <w:rPr>
+          <w:i/>
+          <w:iCs/>
+          <w:color w:val="EE0000"/>
+        </w:rPr>
+        <w:t xml:space="preserve"> before submission)</w:t>
+      </w:r>
+    </w:p>
+    <w:p>
+      <w:pPr>
+        <w:rPr>
+          <w:i/>
+          <w:iCs/>
+          <w:color w:val="EE0000"/>
+        </w:rPr>
+      </w:pPr>
+      <w:r>
+        <w:rPr>
+          <w:i/>
+          <w:iCs/>
+          <w:color w:val="EE0000"/>
+        </w:rPr>
+        <w:t>Short description (one or two lines)</w:t>
+      </w:r>
+    </w:p>
+    <w:p>
+      <w:pPr>
+        <w:rPr>
+          <w:i/>
+          <w:iCs/>
+          <w:color w:val="EE0000"/>
+        </w:rPr>
+      </w:pPr>
+      <w:r>
+        <w:rPr>
+          <w:i/>
+          <w:iCs/>
+          <w:color w:val="EE0000"/>
+        </w:rPr>
+        <w:t>i</w:t>
+      </w:r>
+      <w:r>
+        <w:rPr>
+          <w:i/>
+          <w:iCs/>
+          <w:color w:val="EE0000"/>
+        </w:rPr>
+        <w:t xml:space="preserve">nt </w:t>
+      </w:r>
+      <w:proofErr w:type="spellStart"/>
+      <w:r>
+        <w:rPr>
+          <w:i/>
+          <w:iCs/>
+          <w:color w:val="EE0000"/>
+        </w:rPr>
+        <w:t>Temp</w:t>
+      </w:r>
+      <w:r>
+        <w:rPr>
+          <w:i/>
+          <w:iCs/>
+          <w:color w:val="EE0000"/>
+        </w:rPr>
+        <w:t>erature</w:t>
+      </w:r>
+      <w:r>
+        <w:rPr>
+          <w:i/>
+          <w:iCs/>
+          <w:color w:val="EE0000"/>
+        </w:rPr>
+        <w:t>Conversion</w:t>
+      </w:r>
+      <w:proofErr w:type="spellEnd"/>
+      <w:r>
+        <w:rPr>
+          <w:i/>
+          <w:iCs/>
+          <w:color w:val="EE0000"/>
+        </w:rPr>
+        <w:t xml:space="preserve">( </w:t>
+      </w:r>
+      <w:r>
+        <w:rPr>
+          <w:i/>
+          <w:iCs/>
+          <w:color w:val="EE0000"/>
+        </w:rPr>
+        <w:t xml:space="preserve">int </w:t>
+      </w:r>
+      <w:proofErr w:type="spellStart"/>
+      <w:r>
+        <w:rPr>
+          <w:i/>
+          <w:iCs/>
+          <w:color w:val="EE0000"/>
+        </w:rPr>
+        <w:t>Input</w:t>
+      </w:r>
+      <w:r>
+        <w:rPr>
+          <w:i/>
+          <w:iCs/>
+          <w:color w:val="EE0000"/>
+        </w:rPr>
+        <w:t>Temp</w:t>
+      </w:r>
+      <w:proofErr w:type="spellEnd"/>
+      <w:r>
+        <w:rPr>
+          <w:i/>
+          <w:iCs/>
+          <w:color w:val="EE0000"/>
+        </w:rPr>
+        <w:t>,</w:t>
+      </w:r>
+      <w:r>
+        <w:rPr>
+          <w:i/>
+          <w:iCs/>
+          <w:color w:val="EE0000"/>
+        </w:rPr>
+        <w:t xml:space="preserve"> </w:t>
+      </w:r>
+      <w:r>
+        <w:rPr>
+          <w:i/>
+          <w:iCs/>
+          <w:color w:val="EE0000"/>
+        </w:rPr>
+        <w:t xml:space="preserve"> float* </w:t>
+      </w:r>
+      <w:proofErr w:type="spellStart"/>
+      <w:r>
+        <w:rPr>
+          <w:i/>
+          <w:iCs/>
+          <w:color w:val="EE0000"/>
+        </w:rPr>
+        <w:t>Output</w:t>
+      </w:r>
+      <w:r>
+        <w:rPr>
+          <w:i/>
+          <w:iCs/>
+          <w:color w:val="EE0000"/>
+        </w:rPr>
+        <w:t>Temp</w:t>
+      </w:r>
+      <w:proofErr w:type="spellEnd"/>
+      <w:r>
+        <w:rPr>
+          <w:i/>
+          <w:iCs/>
+          <w:color w:val="EE0000"/>
+        </w:rPr>
+        <w:t xml:space="preserve"> </w:t>
+      </w:r>
+      <w:r>
+        <w:rPr>
+          <w:i/>
+          <w:iCs/>
+          <w:color w:val="EE0000"/>
+        </w:rPr>
+        <w:t>)</w:t>
+      </w:r>
+    </w:p>
+    <w:p>
+      <w:pPr>
+        <w:rPr>
+          <w:i/>
+          <w:iCs/>
+          <w:color w:val="EE0000"/>
+        </w:rPr>
+      </w:pPr>
+      <w:r>
+        <w:rPr>
+          <w:i/>
+          <w:iCs/>
+          <w:color w:val="EE0000"/>
+        </w:rPr>
+        <w:t>Parameters:</w:t>
+      </w:r>
+      <w:r>
+        <w:rPr>
+          <w:i/>
+          <w:iCs/>
+          <w:color w:val="EE0000"/>
         </w:rPr>
         <w:t xml:space="preserve"> </w:t>
       </w:r>
@@ -384,6 +2494,7 @@
         <w:rPr>
           <w:i/>
           <w:iCs/>
+          <w:color w:val="EE0000"/>
         </w:rPr>
       </w:pPr>
       <w:proofErr w:type="spellStart"/>
@@ -391,6 +2502,7 @@
         <w:rPr>
           <w:i/>
           <w:iCs/>
+          <w:color w:val="EE0000"/>
         </w:rPr>
         <w:t>InputTemp</w:t>
       </w:r>
@@ -399,6 +2511,7 @@
         <w:rPr>
           <w:i/>
           <w:iCs/>
+          <w:color w:val="EE0000"/>
         </w:rPr>
         <w:t xml:space="preserve"> </w:t>
       </w:r>
@@ -406,6 +2519,7 @@
         <w:rPr>
           <w:i/>
           <w:iCs/>
+          <w:color w:val="EE0000"/>
         </w:rPr>
         <w:t>–</w:t>
       </w:r>
@@ -413,6 +2527,7 @@
         <w:rPr>
           <w:i/>
           <w:iCs/>
+          <w:color w:val="EE0000"/>
         </w:rPr>
         <w:t xml:space="preserve"> </w:t>
       </w:r>
@@ -420,6 +2535,7 @@
         <w:rPr>
           <w:i/>
           <w:iCs/>
+          <w:color w:val="EE0000"/>
         </w:rPr>
         <w:t>input temperature in degrees C</w:t>
       </w:r>
@@ -430,6 +2546,7 @@
         <w:rPr>
           <w:i/>
           <w:iCs/>
+          <w:color w:val="EE0000"/>
         </w:rPr>
       </w:pPr>
       <w:proofErr w:type="spellStart"/>
@@ -437,6 +2554,7 @@
         <w:rPr>
           <w:i/>
           <w:iCs/>
+          <w:color w:val="EE0000"/>
         </w:rPr>
         <w:t>Ou</w:t>
       </w:r>
@@ -444,6 +2562,7 @@
         <w:rPr>
           <w:i/>
           <w:iCs/>
+          <w:color w:val="EE0000"/>
         </w:rPr>
         <w:t>t</w:t>
       </w:r>
@@ -451,6 +2570,7 @@
         <w:rPr>
           <w:i/>
           <w:iCs/>
+          <w:color w:val="EE0000"/>
         </w:rPr>
         <w:t>putTemp</w:t>
       </w:r>
@@ -459,6 +2579,7 @@
         <w:rPr>
           <w:i/>
           <w:iCs/>
+          <w:color w:val="EE0000"/>
         </w:rPr>
         <w:t xml:space="preserve"> </w:t>
       </w:r>
@@ -466,6 +2587,7 @@
         <w:rPr>
           <w:i/>
           <w:iCs/>
+          <w:color w:val="EE0000"/>
         </w:rPr>
         <w:t>–</w:t>
       </w:r>
@@ -473,6 +2595,7 @@
         <w:rPr>
           <w:i/>
           <w:iCs/>
+          <w:color w:val="EE0000"/>
         </w:rPr>
         <w:t xml:space="preserve"> </w:t>
       </w:r>
@@ -480,6 +2603,7 @@
         <w:rPr>
           <w:i/>
           <w:iCs/>
+          <w:color w:val="EE0000"/>
         </w:rPr>
         <w:t xml:space="preserve">pointer to </w:t>
       </w:r>
@@ -487,6 +2611,7 @@
         <w:rPr>
           <w:i/>
           <w:iCs/>
+          <w:color w:val="EE0000"/>
         </w:rPr>
         <w:t xml:space="preserve">return </w:t>
       </w:r>
@@ -494,6 +2619,7 @@
         <w:rPr>
           <w:i/>
           <w:iCs/>
+          <w:color w:val="EE0000"/>
         </w:rPr>
         <w:t>output temperature in degrees F</w:t>
       </w:r>
@@ -504,12 +2630,14 @@
         <w:rPr>
           <w:i/>
           <w:iCs/>
+          <w:color w:val="EE0000"/>
         </w:rPr>
       </w:pPr>
       <w:r>
         <w:rPr>
           <w:i/>
           <w:iCs/>
+          <w:color w:val="EE0000"/>
         </w:rPr>
         <w:t>Return value – returns 1 if successful, 0 if failed</w:t>
       </w:r>
@@ -603,25 +2731,199 @@
           <w:tcPr>
             <w:tcW w:w="1271" w:type="dxa"/>
           </w:tcPr>
-          <w:p/>
+          <w:p>
+            <w:proofErr w:type="spellStart"/>
+            <w:r>
+              <w:t>LoadData</w:t>
+            </w:r>
+            <w:proofErr w:type="spellEnd"/>
+            <w:r>
+              <w:t>()</w:t>
+            </w:r>
+          </w:p>
         </w:tc>
         <w:tc>
           <w:tcPr>
             <w:tcW w:w="1985" w:type="dxa"/>
           </w:tcPr>
-          <w:p/>
+          <w:p>
+            <w:pPr>
+              <w:rPr>
+                <w:sz w:val="16"/>
+                <w:szCs w:val="16"/>
+              </w:rPr>
+            </w:pPr>
+            <w:r>
+              <w:rPr>
+                <w:sz w:val="16"/>
+                <w:szCs w:val="16"/>
+              </w:rPr>
+              <w:t>No “SingleStrokeFont.txt” file</w:t>
+            </w:r>
+          </w:p>
+          <w:p>
+            <w:pPr>
+              <w:rPr>
+                <w:sz w:val="16"/>
+                <w:szCs w:val="16"/>
+              </w:rPr>
+            </w:pPr>
+          </w:p>
+          <w:p>
+            <w:pPr>
+              <w:rPr>
+                <w:b/>
+                <w:bCs/>
+                <w:sz w:val="16"/>
+                <w:szCs w:val="16"/>
+              </w:rPr>
+            </w:pPr>
+            <w:r>
+              <w:rPr>
+                <w:b/>
+                <w:bCs/>
+                <w:sz w:val="16"/>
+                <w:szCs w:val="16"/>
+              </w:rPr>
+              <w:t>MAYBE ADD:</w:t>
+            </w:r>
+          </w:p>
+          <w:p>
+            <w:pPr>
+              <w:rPr>
+                <w:sz w:val="16"/>
+                <w:szCs w:val="16"/>
+              </w:rPr>
+            </w:pPr>
+            <w:r>
+              <w:rPr>
+                <w:sz w:val="16"/>
+                <w:szCs w:val="16"/>
+              </w:rPr>
+              <w:t>Check to see if fount count = 128</w:t>
+            </w:r>
+          </w:p>
         </w:tc>
         <w:tc>
           <w:tcPr>
             <w:tcW w:w="2835" w:type="dxa"/>
           </w:tcPr>
-          <w:p/>
+          <w:p>
+            <w:pPr>
+              <w:rPr>
+                <w:sz w:val="16"/>
+                <w:szCs w:val="16"/>
+              </w:rPr>
+            </w:pPr>
+            <w:r>
+              <w:rPr>
+                <w:sz w:val="16"/>
+                <w:szCs w:val="16"/>
+              </w:rPr>
+              <w:t xml:space="preserve">Remove </w:t>
+            </w:r>
+            <w:r>
+              <w:rPr>
+                <w:sz w:val="16"/>
+                <w:szCs w:val="16"/>
+              </w:rPr>
+              <w:t>“SingleStrokeFont.txt”</w:t>
+            </w:r>
+            <w:r>
+              <w:rPr>
+                <w:sz w:val="16"/>
+                <w:szCs w:val="16"/>
+              </w:rPr>
+              <w:t xml:space="preserve"> from Robot writer folder and then run the </w:t>
+            </w:r>
+            <w:proofErr w:type="spellStart"/>
+            <w:r>
+              <w:rPr>
+                <w:sz w:val="16"/>
+                <w:szCs w:val="16"/>
+              </w:rPr>
+              <w:t>main.c</w:t>
+            </w:r>
+            <w:proofErr w:type="spellEnd"/>
+            <w:r>
+              <w:rPr>
+                <w:sz w:val="16"/>
+                <w:szCs w:val="16"/>
+              </w:rPr>
+              <w:t xml:space="preserve"> </w:t>
+            </w:r>
+          </w:p>
+          <w:p>
+            <w:pPr>
+              <w:rPr>
+                <w:sz w:val="16"/>
+                <w:szCs w:val="16"/>
+              </w:rPr>
+            </w:pPr>
+          </w:p>
+          <w:p>
+            <w:pPr>
+              <w:rPr>
+                <w:sz w:val="16"/>
+                <w:szCs w:val="16"/>
+              </w:rPr>
+            </w:pPr>
+            <w:r>
+              <w:rPr>
+                <w:sz w:val="16"/>
+                <w:szCs w:val="16"/>
+              </w:rPr>
+              <w:t>Call a file</w:t>
+            </w:r>
+            <w:r>
+              <w:rPr>
+                <w:sz w:val="16"/>
+                <w:szCs w:val="16"/>
+              </w:rPr>
+              <w:t xml:space="preserve"> “SingleStrokeFont.txt</w:t>
+            </w:r>
+            <w:r>
+              <w:rPr>
+                <w:sz w:val="16"/>
+                <w:szCs w:val="16"/>
+              </w:rPr>
+              <w:t>” but only half of the ascii characters in it</w:t>
+            </w:r>
+          </w:p>
         </w:tc>
         <w:tc>
           <w:tcPr>
             <w:tcW w:w="2925" w:type="dxa"/>
           </w:tcPr>
-          <w:p/>
+          <w:p>
+            <w:pPr>
+              <w:rPr>
+                <w:sz w:val="16"/>
+                <w:szCs w:val="16"/>
+              </w:rPr>
+            </w:pPr>
+            <w:r>
+              <w:rPr>
+                <w:sz w:val="16"/>
+                <w:szCs w:val="16"/>
+              </w:rPr>
+              <w:t xml:space="preserve">FP (file pointer) equals null, therefore user is told that </w:t>
+            </w:r>
+            <w:r>
+              <w:rPr>
+                <w:sz w:val="16"/>
+                <w:szCs w:val="16"/>
+              </w:rPr>
+              <w:t>“SingleStrokeFont.txt</w:t>
+            </w:r>
+            <w:r>
+              <w:rPr>
+                <w:sz w:val="16"/>
+                <w:szCs w:val="16"/>
+              </w:rPr>
+              <w:t>” couldn’t be found and the programme immediately ends</w:t>
+            </w:r>
+          </w:p>
         </w:tc>
       </w:tr>
       <w:tr>
@@ -638,19 +2940,40 @@
           <w:tcPr>
             <w:tcW w:w="1985" w:type="dxa"/>
           </w:tcPr>
-          <w:p/>
+          <w:p>
+            <w:pPr>
+              <w:rPr>
+                <w:sz w:val="16"/>
+                <w:szCs w:val="16"/>
+              </w:rPr>
+            </w:pPr>
+          </w:p>
         </w:tc>
         <w:tc>
           <w:tcPr>
             <w:tcW w:w="2835" w:type="dxa"/>
           </w:tcPr>
-          <w:p/>
+          <w:p>
+            <w:pPr>
+              <w:rPr>
+                <w:sz w:val="16"/>
+                <w:szCs w:val="16"/>
+              </w:rPr>
+            </w:pPr>
+          </w:p>
         </w:tc>
         <w:tc>
           <w:tcPr>
             <w:tcW w:w="2925" w:type="dxa"/>
           </w:tcPr>
-          <w:p/>
+          <w:p>
+            <w:pPr>
+              <w:rPr>
+                <w:sz w:val="16"/>
+                <w:szCs w:val="16"/>
+              </w:rPr>
+            </w:pPr>
+          </w:p>
         </w:tc>
       </w:tr>
     </w:tbl>
@@ -682,7 +3005,6 @@
         <w:pStyle w:val="Heading1"/>
       </w:pPr>
       <w:r>
-        <w:lastRenderedPageBreak/>
         <w:t>AI Statement</w:t>
       </w:r>
     </w:p>

</xml_diff>

<commit_message>
Fixing Function Folder Overdefining Issue
</commit_message>
<xml_diff>
--- a/SystemManualTemplate25-26.docx
+++ b/SystemManualTemplate25-26.docx
@@ -103,15 +103,38 @@
         <w:t>(Maximum 1 page)</w:t>
       </w:r>
     </w:p>
+    <w:p/>
+    <w:p/>
+    <w:p/>
+    <w:p/>
+    <w:p/>
+    <w:p/>
+    <w:p/>
+    <w:p/>
+    <w:p/>
+    <w:p/>
+    <w:p/>
+    <w:p/>
+    <w:p/>
+    <w:p/>
+    <w:p/>
+    <w:p/>
+    <w:p/>
+    <w:p/>
+    <w:p/>
+    <w:p/>
+    <w:p/>
+    <w:p/>
+    <w:p/>
     <w:p>
       <w:pPr>
         <w:pStyle w:val="Heading1"/>
       </w:pPr>
       <w:r>
+        <w:lastRenderedPageBreak/>
         <w:t>Key Data Items</w:t>
       </w:r>
     </w:p>
-    <w:p/>
     <w:tbl>
       <w:tblPr>
         <w:tblStyle w:val="TableGrid"/>
@@ -119,14 +142,14 @@
         <w:tblLook w:val="04A0" w:firstRow="1" w:lastRow="0" w:firstColumn="1" w:lastColumn="0" w:noHBand="0" w:noVBand="1"/>
       </w:tblPr>
       <w:tblGrid>
-        <w:gridCol w:w="2263"/>
-        <w:gridCol w:w="1985"/>
+        <w:gridCol w:w="1980"/>
+        <w:gridCol w:w="2268"/>
         <w:gridCol w:w="5528"/>
       </w:tblGrid>
       <w:tr>
         <w:tc>
           <w:tcPr>
-            <w:tcW w:w="2263" w:type="dxa"/>
+            <w:tcW w:w="1980" w:type="dxa"/>
           </w:tcPr>
           <w:p>
             <w:pPr>
@@ -151,7 +174,7 @@
         </w:tc>
         <w:tc>
           <w:tcPr>
-            <w:tcW w:w="1985" w:type="dxa"/>
+            <w:tcW w:w="2268" w:type="dxa"/>
           </w:tcPr>
           <w:p>
             <w:pPr>
@@ -202,30 +225,36 @@
       </w:tr>
       <w:tr>
         <w:trPr>
-          <w:trHeight w:val="539"/>
+          <w:trHeight w:val="72"/>
         </w:trPr>
         <w:tc>
           <w:tcPr>
-            <w:tcW w:w="2263" w:type="dxa"/>
-          </w:tcPr>
-          <w:p>
-            <w:pPr>
-              <w:jc w:val="center"/>
-              <w:rPr>
-                <w:sz w:val="20"/>
-              </w:rPr>
-            </w:pPr>
-            <w:r>
-              <w:rPr>
+            <w:tcW w:w="1980" w:type="dxa"/>
+          </w:tcPr>
+          <w:p>
+            <w:pPr>
+              <w:jc w:val="center"/>
+              <w:rPr>
+                <w:b/>
+                <w:bCs/>
+                <w:sz w:val="20"/>
+              </w:rPr>
+            </w:pPr>
+            <w:proofErr w:type="spellStart"/>
+            <w:r>
+              <w:rPr>
+                <w:b/>
+                <w:bCs/>
                 <w:sz w:val="20"/>
               </w:rPr>
               <w:t>i</w:t>
             </w:r>
-          </w:p>
-        </w:tc>
-        <w:tc>
-          <w:tcPr>
-            <w:tcW w:w="1985" w:type="dxa"/>
+            <w:proofErr w:type="spellEnd"/>
+          </w:p>
+        </w:tc>
+        <w:tc>
+          <w:tcPr>
+            <w:tcW w:w="2268" w:type="dxa"/>
           </w:tcPr>
           <w:p>
             <w:pPr>
@@ -267,17 +296,21 @@
         </w:trPr>
         <w:tc>
           <w:tcPr>
-            <w:tcW w:w="2263" w:type="dxa"/>
-          </w:tcPr>
-          <w:p>
-            <w:pPr>
-              <w:jc w:val="center"/>
-              <w:rPr>
-                <w:sz w:val="20"/>
-              </w:rPr>
-            </w:pPr>
-            <w:r>
-              <w:rPr>
+            <w:tcW w:w="1980" w:type="dxa"/>
+          </w:tcPr>
+          <w:p>
+            <w:pPr>
+              <w:jc w:val="center"/>
+              <w:rPr>
+                <w:b/>
+                <w:bCs/>
+                <w:sz w:val="20"/>
+              </w:rPr>
+            </w:pPr>
+            <w:r>
+              <w:rPr>
+                <w:b/>
+                <w:bCs/>
                 <w:sz w:val="20"/>
               </w:rPr>
               <w:t>j</w:t>
@@ -286,7 +319,7 @@
         </w:tc>
         <w:tc>
           <w:tcPr>
-            <w:tcW w:w="1985" w:type="dxa"/>
+            <w:tcW w:w="2268" w:type="dxa"/>
           </w:tcPr>
           <w:p>
             <w:pPr>
@@ -360,6 +393,160 @@
                 <w:sz w:val="20"/>
               </w:rPr>
               <w:t>and we therefore don’t want to reset the i value in the outer loop</w:t>
+            </w:r>
+          </w:p>
+        </w:tc>
+      </w:tr>
+      <w:tr>
+        <w:trPr>
+          <w:trHeight w:val="214"/>
+        </w:trPr>
+        <w:tc>
+          <w:tcPr>
+            <w:tcW w:w="1980" w:type="dxa"/>
+          </w:tcPr>
+          <w:p>
+            <w:pPr>
+              <w:jc w:val="center"/>
+              <w:rPr>
+                <w:b/>
+                <w:bCs/>
+                <w:sz w:val="20"/>
+              </w:rPr>
+            </w:pPr>
+            <w:proofErr w:type="spellStart"/>
+            <w:r>
+              <w:rPr>
+                <w:b/>
+                <w:bCs/>
+                <w:sz w:val="20"/>
+              </w:rPr>
+              <w:t>Pen_Coordinate_X</w:t>
+            </w:r>
+            <w:proofErr w:type="spellEnd"/>
+          </w:p>
+          <w:p>
+            <w:pPr>
+              <w:jc w:val="center"/>
+              <w:rPr>
+                <w:b/>
+                <w:bCs/>
+                <w:sz w:val="20"/>
+              </w:rPr>
+            </w:pPr>
+          </w:p>
+        </w:tc>
+        <w:tc>
+          <w:tcPr>
+            <w:tcW w:w="2268" w:type="dxa"/>
+          </w:tcPr>
+          <w:p>
+            <w:pPr>
+              <w:jc w:val="center"/>
+              <w:rPr>
+                <w:sz w:val="20"/>
+              </w:rPr>
+            </w:pPr>
+            <w:r>
+              <w:rPr>
+                <w:sz w:val="20"/>
+              </w:rPr>
+              <w:t>float</w:t>
+            </w:r>
+          </w:p>
+        </w:tc>
+        <w:tc>
+          <w:tcPr>
+            <w:tcW w:w="5528" w:type="dxa"/>
+          </w:tcPr>
+          <w:p>
+            <w:pPr>
+              <w:rPr>
+                <w:sz w:val="20"/>
+              </w:rPr>
+            </w:pPr>
+            <w:r>
+              <w:rPr>
+                <w:sz w:val="20"/>
+              </w:rPr>
+              <w:t>Horizonal value that defines where the pen at that moment in time in the X axis</w:t>
+            </w:r>
+          </w:p>
+        </w:tc>
+      </w:tr>
+      <w:tr>
+        <w:trPr>
+          <w:trHeight w:val="136"/>
+        </w:trPr>
+        <w:tc>
+          <w:tcPr>
+            <w:tcW w:w="1980" w:type="dxa"/>
+          </w:tcPr>
+          <w:p>
+            <w:pPr>
+              <w:jc w:val="center"/>
+              <w:rPr>
+                <w:b/>
+                <w:bCs/>
+                <w:sz w:val="20"/>
+              </w:rPr>
+            </w:pPr>
+            <w:proofErr w:type="spellStart"/>
+            <w:r>
+              <w:rPr>
+                <w:b/>
+                <w:bCs/>
+                <w:sz w:val="20"/>
+              </w:rPr>
+              <w:t>Pen_Coordinate_Y</w:t>
+            </w:r>
+            <w:proofErr w:type="spellEnd"/>
+          </w:p>
+          <w:p>
+            <w:pPr>
+              <w:jc w:val="center"/>
+              <w:rPr>
+                <w:b/>
+                <w:bCs/>
+                <w:sz w:val="20"/>
+              </w:rPr>
+            </w:pPr>
+          </w:p>
+        </w:tc>
+        <w:tc>
+          <w:tcPr>
+            <w:tcW w:w="2268" w:type="dxa"/>
+          </w:tcPr>
+          <w:p>
+            <w:pPr>
+              <w:jc w:val="center"/>
+              <w:rPr>
+                <w:sz w:val="20"/>
+              </w:rPr>
+            </w:pPr>
+            <w:r>
+              <w:rPr>
+                <w:sz w:val="20"/>
+              </w:rPr>
+              <w:t>float</w:t>
+            </w:r>
+          </w:p>
+        </w:tc>
+        <w:tc>
+          <w:tcPr>
+            <w:tcW w:w="5528" w:type="dxa"/>
+          </w:tcPr>
+          <w:p>
+            <w:pPr>
+              <w:rPr>
+                <w:sz w:val="20"/>
+              </w:rPr>
+            </w:pPr>
+            <w:r>
+              <w:rPr>
+                <w:sz w:val="20"/>
+              </w:rPr>
+              <w:t>Vertical value that defines where the pen at that moment in time in the Y axis</w:t>
             </w:r>
           </w:p>
         </w:tc>
@@ -370,34 +557,118 @@
         </w:trPr>
         <w:tc>
           <w:tcPr>
-            <w:tcW w:w="2263" w:type="dxa"/>
-          </w:tcPr>
-          <w:p>
-            <w:pPr>
-              <w:jc w:val="center"/>
-              <w:rPr>
-                <w:sz w:val="20"/>
-              </w:rPr>
-            </w:pPr>
-            <w:r>
-              <w:rPr>
-                <w:sz w:val="20"/>
-              </w:rPr>
-              <w:t>Pen_Coordinate_X</w:t>
-            </w:r>
-          </w:p>
-          <w:p>
-            <w:pPr>
-              <w:jc w:val="center"/>
-              <w:rPr>
-                <w:sz w:val="20"/>
-              </w:rPr>
-            </w:pPr>
-          </w:p>
-        </w:tc>
-        <w:tc>
-          <w:tcPr>
-            <w:tcW w:w="1985" w:type="dxa"/>
+            <w:tcW w:w="1980" w:type="dxa"/>
+          </w:tcPr>
+          <w:p>
+            <w:pPr>
+              <w:jc w:val="center"/>
+              <w:rPr>
+                <w:b/>
+                <w:bCs/>
+                <w:sz w:val="20"/>
+              </w:rPr>
+            </w:pPr>
+            <w:r>
+              <w:rPr>
+                <w:b/>
+                <w:bCs/>
+                <w:sz w:val="20"/>
+              </w:rPr>
+              <w:t>MyBuffer[256]</w:t>
+            </w:r>
+          </w:p>
+          <w:p>
+            <w:pPr>
+              <w:rPr>
+                <w:b/>
+                <w:bCs/>
+                <w:sz w:val="20"/>
+              </w:rPr>
+            </w:pPr>
+          </w:p>
+        </w:tc>
+        <w:tc>
+          <w:tcPr>
+            <w:tcW w:w="2268" w:type="dxa"/>
+          </w:tcPr>
+          <w:p>
+            <w:pPr>
+              <w:jc w:val="center"/>
+              <w:rPr>
+                <w:sz w:val="20"/>
+              </w:rPr>
+            </w:pPr>
+            <w:r>
+              <w:rPr>
+                <w:sz w:val="20"/>
+              </w:rPr>
+              <w:t xml:space="preserve">Array (Buffer) of </w:t>
+            </w:r>
+            <w:r>
+              <w:rPr>
+                <w:sz w:val="20"/>
+              </w:rPr>
+              <w:t>char</w:t>
+            </w:r>
+            <w:r>
+              <w:rPr>
+                <w:sz w:val="20"/>
+              </w:rPr>
+              <w:t>s</w:t>
+            </w:r>
+          </w:p>
+        </w:tc>
+        <w:tc>
+          <w:tcPr>
+            <w:tcW w:w="5528" w:type="dxa"/>
+          </w:tcPr>
+          <w:p>
+            <w:pPr>
+              <w:rPr>
+                <w:sz w:val="20"/>
+              </w:rPr>
+            </w:pPr>
+            <w:r>
+              <w:rPr>
+                <w:sz w:val="20"/>
+              </w:rPr>
+              <w:t>A buffer used as temporal storage to store each line in “SingleStrokeFont.txt” and input it into FontArray. Also used after to temporal store each GCode line to send to the robot.</w:t>
+            </w:r>
+          </w:p>
+        </w:tc>
+      </w:tr>
+      <w:tr>
+        <w:trPr>
+          <w:trHeight w:val="168"/>
+        </w:trPr>
+        <w:tc>
+          <w:tcPr>
+            <w:tcW w:w="1980" w:type="dxa"/>
+          </w:tcPr>
+          <w:p>
+            <w:pPr>
+              <w:jc w:val="center"/>
+              <w:rPr>
+                <w:b/>
+                <w:bCs/>
+                <w:sz w:val="20"/>
+              </w:rPr>
+            </w:pPr>
+            <w:proofErr w:type="spellStart"/>
+            <w:r>
+              <w:rPr>
+                <w:b/>
+                <w:bCs/>
+                <w:sz w:val="20"/>
+              </w:rPr>
+              <w:t>Font_Size</w:t>
+            </w:r>
+            <w:proofErr w:type="spellEnd"/>
+          </w:p>
+        </w:tc>
+        <w:tc>
+          <w:tcPr>
+            <w:tcW w:w="2268" w:type="dxa"/>
           </w:tcPr>
           <w:p>
             <w:pPr>
@@ -428,7 +699,466 @@
               <w:rPr>
                 <w:sz w:val="20"/>
               </w:rPr>
-              <w:t>Horizonal value that defines where the pen at that moment in time in the X axis</w:t>
+              <w:t>A real number that the user inputs between 4 and 10</w:t>
+            </w:r>
+          </w:p>
+        </w:tc>
+      </w:tr>
+      <w:tr>
+        <w:trPr>
+          <w:trHeight w:val="199"/>
+        </w:trPr>
+        <w:tc>
+          <w:tcPr>
+            <w:tcW w:w="1980" w:type="dxa"/>
+          </w:tcPr>
+          <w:p>
+            <w:pPr>
+              <w:jc w:val="center"/>
+              <w:rPr>
+                <w:b/>
+                <w:bCs/>
+                <w:sz w:val="20"/>
+              </w:rPr>
+            </w:pPr>
+            <w:proofErr w:type="spellStart"/>
+            <w:r>
+              <w:rPr>
+                <w:b/>
+                <w:bCs/>
+                <w:sz w:val="20"/>
+              </w:rPr>
+              <w:t>Font_Size_Fraction</w:t>
+            </w:r>
+            <w:proofErr w:type="spellEnd"/>
+          </w:p>
+        </w:tc>
+        <w:tc>
+          <w:tcPr>
+            <w:tcW w:w="2268" w:type="dxa"/>
+          </w:tcPr>
+          <w:p>
+            <w:pPr>
+              <w:jc w:val="center"/>
+              <w:rPr>
+                <w:sz w:val="20"/>
+              </w:rPr>
+            </w:pPr>
+            <w:r>
+              <w:rPr>
+                <w:sz w:val="20"/>
+              </w:rPr>
+              <w:t>float</w:t>
+            </w:r>
+          </w:p>
+        </w:tc>
+        <w:tc>
+          <w:tcPr>
+            <w:tcW w:w="5528" w:type="dxa"/>
+          </w:tcPr>
+          <w:p>
+            <w:pPr>
+              <w:rPr>
+                <w:sz w:val="20"/>
+              </w:rPr>
+            </w:pPr>
+            <w:r>
+              <w:rPr>
+                <w:sz w:val="20"/>
+              </w:rPr>
+              <w:t>The value I multiple the stroke coordinate by to draw the correctly sized characters</w:t>
+            </w:r>
+          </w:p>
+        </w:tc>
+      </w:tr>
+      <w:tr>
+        <w:trPr>
+          <w:trHeight w:val="405"/>
+        </w:trPr>
+        <w:tc>
+          <w:tcPr>
+            <w:tcW w:w="1980" w:type="dxa"/>
+          </w:tcPr>
+          <w:p>
+            <w:pPr>
+              <w:jc w:val="center"/>
+              <w:rPr>
+                <w:b/>
+                <w:bCs/>
+                <w:sz w:val="20"/>
+              </w:rPr>
+            </w:pPr>
+            <w:proofErr w:type="spellStart"/>
+            <w:r>
+              <w:rPr>
+                <w:b/>
+                <w:bCs/>
+                <w:sz w:val="20"/>
+              </w:rPr>
+              <w:t>CharactersInWord</w:t>
+            </w:r>
+            <w:proofErr w:type="spellEnd"/>
+          </w:p>
+          <w:p>
+            <w:pPr>
+              <w:jc w:val="center"/>
+              <w:rPr>
+                <w:b/>
+                <w:bCs/>
+                <w:sz w:val="20"/>
+              </w:rPr>
+            </w:pPr>
+          </w:p>
+        </w:tc>
+        <w:tc>
+          <w:tcPr>
+            <w:tcW w:w="2268" w:type="dxa"/>
+          </w:tcPr>
+          <w:p>
+            <w:pPr>
+              <w:jc w:val="center"/>
+              <w:rPr>
+                <w:sz w:val="20"/>
+              </w:rPr>
+            </w:pPr>
+            <w:r>
+              <w:rPr>
+                <w:sz w:val="20"/>
+              </w:rPr>
+              <w:t>int</w:t>
+            </w:r>
+          </w:p>
+        </w:tc>
+        <w:tc>
+          <w:tcPr>
+            <w:tcW w:w="5528" w:type="dxa"/>
+          </w:tcPr>
+          <w:p>
+            <w:pPr>
+              <w:rPr>
+                <w:sz w:val="20"/>
+              </w:rPr>
+            </w:pPr>
+            <w:r>
+              <w:rPr>
+                <w:sz w:val="20"/>
+              </w:rPr>
+              <w:t>Value that determines how many characters are in each word and this includes the space after the word if there is one</w:t>
+            </w:r>
+          </w:p>
+        </w:tc>
+      </w:tr>
+      <w:tr>
+        <w:trPr>
+          <w:trHeight w:val="589"/>
+        </w:trPr>
+        <w:tc>
+          <w:tcPr>
+            <w:tcW w:w="1980" w:type="dxa"/>
+          </w:tcPr>
+          <w:p>
+            <w:pPr>
+              <w:jc w:val="center"/>
+              <w:rPr>
+                <w:b/>
+                <w:bCs/>
+                <w:sz w:val="20"/>
+              </w:rPr>
+            </w:pPr>
+            <w:r>
+              <w:rPr>
+                <w:b/>
+                <w:bCs/>
+                <w:sz w:val="20"/>
+              </w:rPr>
+              <w:t>char Character</w:t>
+            </w:r>
+          </w:p>
+          <w:p>
+            <w:pPr>
+              <w:rPr>
+                <w:b/>
+                <w:bCs/>
+                <w:sz w:val="20"/>
+              </w:rPr>
+            </w:pPr>
+          </w:p>
+        </w:tc>
+        <w:tc>
+          <w:tcPr>
+            <w:tcW w:w="2268" w:type="dxa"/>
+          </w:tcPr>
+          <w:p>
+            <w:pPr>
+              <w:jc w:val="center"/>
+              <w:rPr>
+                <w:sz w:val="20"/>
+              </w:rPr>
+            </w:pPr>
+            <w:r>
+              <w:rPr>
+                <w:sz w:val="20"/>
+              </w:rPr>
+              <w:t>cha</w:t>
+            </w:r>
+            <w:r>
+              <w:rPr>
+                <w:sz w:val="20"/>
+              </w:rPr>
+              <w:t>r</w:t>
+            </w:r>
+          </w:p>
+        </w:tc>
+        <w:tc>
+          <w:tcPr>
+            <w:tcW w:w="5528" w:type="dxa"/>
+          </w:tcPr>
+          <w:p>
+            <w:pPr>
+              <w:rPr>
+                <w:sz w:val="20"/>
+              </w:rPr>
+            </w:pPr>
+          </w:p>
+        </w:tc>
+      </w:tr>
+      <w:tr>
+        <w:trPr>
+          <w:trHeight w:val="307"/>
+        </w:trPr>
+        <w:tc>
+          <w:tcPr>
+            <w:tcW w:w="1980" w:type="dxa"/>
+          </w:tcPr>
+          <w:p>
+            <w:pPr>
+              <w:jc w:val="center"/>
+              <w:rPr>
+                <w:b/>
+                <w:bCs/>
+                <w:sz w:val="20"/>
+              </w:rPr>
+            </w:pPr>
+            <w:r>
+              <w:rPr>
+                <w:b/>
+                <w:bCs/>
+                <w:sz w:val="20"/>
+              </w:rPr>
+              <w:t>Word[256]</w:t>
+            </w:r>
+          </w:p>
+          <w:p>
+            <w:pPr>
+              <w:jc w:val="center"/>
+              <w:rPr>
+                <w:b/>
+                <w:bCs/>
+                <w:sz w:val="20"/>
+              </w:rPr>
+            </w:pPr>
+          </w:p>
+        </w:tc>
+        <w:tc>
+          <w:tcPr>
+            <w:tcW w:w="2268" w:type="dxa"/>
+          </w:tcPr>
+          <w:p>
+            <w:pPr>
+              <w:jc w:val="center"/>
+              <w:rPr>
+                <w:sz w:val="20"/>
+              </w:rPr>
+            </w:pPr>
+            <w:r>
+              <w:rPr>
+                <w:sz w:val="20"/>
+              </w:rPr>
+              <w:t xml:space="preserve">Array (Buffer) of </w:t>
+            </w:r>
+            <w:r>
+              <w:rPr>
+                <w:sz w:val="20"/>
+              </w:rPr>
+              <w:t>char</w:t>
+            </w:r>
+            <w:r>
+              <w:rPr>
+                <w:sz w:val="20"/>
+              </w:rPr>
+              <w:t>s</w:t>
+            </w:r>
+          </w:p>
+        </w:tc>
+        <w:tc>
+          <w:tcPr>
+            <w:tcW w:w="5528" w:type="dxa"/>
+          </w:tcPr>
+          <w:p>
+            <w:pPr>
+              <w:rPr>
+                <w:sz w:val="20"/>
+              </w:rPr>
+            </w:pPr>
+            <w:r>
+              <w:rPr>
+                <w:sz w:val="20"/>
+              </w:rPr>
+              <w:t>A second buffer used as temporal storage to store each word of the input sentence so that the MyBuffer can store the GCode and not erase the word</w:t>
+            </w:r>
+          </w:p>
+        </w:tc>
+      </w:tr>
+      <w:tr>
+        <w:trPr>
+          <w:trHeight w:val="275"/>
+        </w:trPr>
+        <w:tc>
+          <w:tcPr>
+            <w:tcW w:w="1980" w:type="dxa"/>
+          </w:tcPr>
+          <w:p>
+            <w:pPr>
+              <w:jc w:val="center"/>
+              <w:rPr>
+                <w:b/>
+                <w:bCs/>
+                <w:sz w:val="20"/>
+              </w:rPr>
+            </w:pPr>
+            <w:proofErr w:type="spellStart"/>
+            <w:r>
+              <w:rPr>
+                <w:b/>
+                <w:bCs/>
+                <w:sz w:val="20"/>
+              </w:rPr>
+              <w:t>Character_Length_X</w:t>
+            </w:r>
+            <w:proofErr w:type="spellEnd"/>
+          </w:p>
+          <w:p>
+            <w:pPr>
+              <w:jc w:val="center"/>
+              <w:rPr>
+                <w:b/>
+                <w:bCs/>
+                <w:sz w:val="20"/>
+              </w:rPr>
+            </w:pPr>
+          </w:p>
+        </w:tc>
+        <w:tc>
+          <w:tcPr>
+            <w:tcW w:w="2268" w:type="dxa"/>
+          </w:tcPr>
+          <w:p>
+            <w:pPr>
+              <w:jc w:val="center"/>
+              <w:rPr>
+                <w:sz w:val="20"/>
+              </w:rPr>
+            </w:pPr>
+            <w:r>
+              <w:rPr>
+                <w:sz w:val="20"/>
+              </w:rPr>
+              <w:t>float</w:t>
+            </w:r>
+          </w:p>
+        </w:tc>
+        <w:tc>
+          <w:tcPr>
+            <w:tcW w:w="5528" w:type="dxa"/>
+          </w:tcPr>
+          <w:p>
+            <w:pPr>
+              <w:rPr>
+                <w:sz w:val="20"/>
+              </w:rPr>
+            </w:pPr>
+            <w:r>
+              <w:rPr>
+                <w:sz w:val="20"/>
+              </w:rPr>
+              <w:t>The horizontal length that each character takes up in the X axis. Used to calculate Word_Length_X</w:t>
+            </w:r>
+          </w:p>
+        </w:tc>
+      </w:tr>
+      <w:tr>
+        <w:trPr>
+          <w:trHeight w:val="56"/>
+        </w:trPr>
+        <w:tc>
+          <w:tcPr>
+            <w:tcW w:w="1980" w:type="dxa"/>
+          </w:tcPr>
+          <w:p>
+            <w:pPr>
+              <w:jc w:val="center"/>
+              <w:rPr>
+                <w:b/>
+                <w:bCs/>
+                <w:sz w:val="20"/>
+              </w:rPr>
+            </w:pPr>
+            <w:proofErr w:type="spellStart"/>
+            <w:r>
+              <w:rPr>
+                <w:b/>
+                <w:bCs/>
+                <w:sz w:val="20"/>
+              </w:rPr>
+              <w:t>Word_Length_X</w:t>
+            </w:r>
+            <w:proofErr w:type="spellEnd"/>
+          </w:p>
+          <w:p>
+            <w:pPr>
+              <w:jc w:val="center"/>
+              <w:rPr>
+                <w:b/>
+                <w:bCs/>
+                <w:sz w:val="20"/>
+              </w:rPr>
+            </w:pPr>
+          </w:p>
+        </w:tc>
+        <w:tc>
+          <w:tcPr>
+            <w:tcW w:w="2268" w:type="dxa"/>
+          </w:tcPr>
+          <w:p>
+            <w:pPr>
+              <w:jc w:val="center"/>
+              <w:rPr>
+                <w:sz w:val="20"/>
+              </w:rPr>
+            </w:pPr>
+            <w:r>
+              <w:rPr>
+                <w:sz w:val="20"/>
+              </w:rPr>
+              <w:t>float</w:t>
+            </w:r>
+          </w:p>
+        </w:tc>
+        <w:tc>
+          <w:tcPr>
+            <w:tcW w:w="5528" w:type="dxa"/>
+          </w:tcPr>
+          <w:p>
+            <w:pPr>
+              <w:rPr>
+                <w:sz w:val="20"/>
+              </w:rPr>
+            </w:pPr>
+            <w:r>
+              <w:rPr>
+                <w:sz w:val="20"/>
+              </w:rPr>
+              <w:t>The horizontal length that each word takes up in the X axis. Used to make sure word fits on the page</w:t>
             </w:r>
           </w:p>
         </w:tc>
@@ -439,34 +1169,101 @@
         </w:trPr>
         <w:tc>
           <w:tcPr>
-            <w:tcW w:w="2263" w:type="dxa"/>
-          </w:tcPr>
-          <w:p>
-            <w:pPr>
-              <w:jc w:val="center"/>
-              <w:rPr>
-                <w:sz w:val="20"/>
-              </w:rPr>
-            </w:pPr>
-            <w:r>
-              <w:rPr>
-                <w:sz w:val="20"/>
-              </w:rPr>
-              <w:t>Pen_Coordinate_Y</w:t>
-            </w:r>
-          </w:p>
-          <w:p>
-            <w:pPr>
-              <w:jc w:val="center"/>
-              <w:rPr>
-                <w:sz w:val="20"/>
-              </w:rPr>
-            </w:pPr>
-          </w:p>
-        </w:tc>
-        <w:tc>
-          <w:tcPr>
-            <w:tcW w:w="1985" w:type="dxa"/>
+            <w:tcW w:w="1980" w:type="dxa"/>
+          </w:tcPr>
+          <w:p>
+            <w:pPr>
+              <w:jc w:val="center"/>
+              <w:rPr>
+                <w:b/>
+                <w:bCs/>
+                <w:sz w:val="20"/>
+              </w:rPr>
+            </w:pPr>
+            <w:proofErr w:type="spellStart"/>
+            <w:r>
+              <w:rPr>
+                <w:b/>
+                <w:bCs/>
+                <w:sz w:val="20"/>
+              </w:rPr>
+              <w:t>NewLine</w:t>
+            </w:r>
+            <w:proofErr w:type="spellEnd"/>
+          </w:p>
+          <w:p>
+            <w:pPr>
+              <w:jc w:val="center"/>
+              <w:rPr>
+                <w:b/>
+                <w:bCs/>
+                <w:sz w:val="20"/>
+              </w:rPr>
+            </w:pPr>
+          </w:p>
+        </w:tc>
+        <w:tc>
+          <w:tcPr>
+            <w:tcW w:w="2268" w:type="dxa"/>
+          </w:tcPr>
+          <w:p>
+            <w:pPr>
+              <w:jc w:val="center"/>
+              <w:rPr>
+                <w:sz w:val="20"/>
+              </w:rPr>
+            </w:pPr>
+            <w:r>
+              <w:rPr>
+                <w:sz w:val="20"/>
+              </w:rPr>
+              <w:t>int</w:t>
+            </w:r>
+          </w:p>
+        </w:tc>
+        <w:tc>
+          <w:tcPr>
+            <w:tcW w:w="5528" w:type="dxa"/>
+          </w:tcPr>
+          <w:p>
+            <w:pPr>
+              <w:rPr>
+                <w:sz w:val="20"/>
+              </w:rPr>
+            </w:pPr>
+          </w:p>
+        </w:tc>
+      </w:tr>
+      <w:tr>
+        <w:trPr>
+          <w:trHeight w:val="262"/>
+        </w:trPr>
+        <w:tc>
+          <w:tcPr>
+            <w:tcW w:w="1980" w:type="dxa"/>
+          </w:tcPr>
+          <w:p>
+            <w:pPr>
+              <w:jc w:val="center"/>
+              <w:rPr>
+                <w:b/>
+                <w:bCs/>
+                <w:sz w:val="20"/>
+              </w:rPr>
+            </w:pPr>
+            <w:r>
+              <w:rPr>
+                <w:b/>
+                <w:bCs/>
+                <w:sz w:val="20"/>
+              </w:rPr>
+              <w:t>X</w:t>
+            </w:r>
+          </w:p>
+        </w:tc>
+        <w:tc>
+          <w:tcPr>
+            <w:tcW w:w="2268" w:type="dxa"/>
           </w:tcPr>
           <w:p>
             <w:pPr>
@@ -497,7 +1294,137 @@
               <w:rPr>
                 <w:sz w:val="20"/>
               </w:rPr>
-              <w:t>Vertical value that defines where the pen at that moment in time in the Y axis</w:t>
+              <w:t>Defines the X value in each line of “SingleStrokeFont.txt”</w:t>
+            </w:r>
+          </w:p>
+        </w:tc>
+      </w:tr>
+      <w:tr>
+        <w:trPr>
+          <w:trHeight w:val="279"/>
+        </w:trPr>
+        <w:tc>
+          <w:tcPr>
+            <w:tcW w:w="1980" w:type="dxa"/>
+          </w:tcPr>
+          <w:p>
+            <w:pPr>
+              <w:jc w:val="center"/>
+              <w:rPr>
+                <w:b/>
+                <w:bCs/>
+                <w:sz w:val="20"/>
+              </w:rPr>
+            </w:pPr>
+            <w:r>
+              <w:rPr>
+                <w:b/>
+                <w:bCs/>
+                <w:sz w:val="20"/>
+              </w:rPr>
+              <w:t>Y</w:t>
+            </w:r>
+          </w:p>
+        </w:tc>
+        <w:tc>
+          <w:tcPr>
+            <w:tcW w:w="2268" w:type="dxa"/>
+          </w:tcPr>
+          <w:p>
+            <w:pPr>
+              <w:jc w:val="center"/>
+              <w:rPr>
+                <w:sz w:val="20"/>
+              </w:rPr>
+            </w:pPr>
+            <w:r>
+              <w:rPr>
+                <w:sz w:val="20"/>
+              </w:rPr>
+              <w:t>float</w:t>
+            </w:r>
+          </w:p>
+        </w:tc>
+        <w:tc>
+          <w:tcPr>
+            <w:tcW w:w="5528" w:type="dxa"/>
+          </w:tcPr>
+          <w:p>
+            <w:pPr>
+              <w:rPr>
+                <w:sz w:val="20"/>
+              </w:rPr>
+            </w:pPr>
+            <w:r>
+              <w:rPr>
+                <w:sz w:val="20"/>
+              </w:rPr>
+              <w:t>Defines the Y value in each line of “SingleStrokeFont.txt”</w:t>
+            </w:r>
+          </w:p>
+        </w:tc>
+      </w:tr>
+      <w:tr>
+        <w:trPr>
+          <w:trHeight w:val="270"/>
+        </w:trPr>
+        <w:tc>
+          <w:tcPr>
+            <w:tcW w:w="1980" w:type="dxa"/>
+          </w:tcPr>
+          <w:p>
+            <w:pPr>
+              <w:jc w:val="center"/>
+              <w:rPr>
+                <w:b/>
+                <w:bCs/>
+                <w:sz w:val="20"/>
+              </w:rPr>
+            </w:pPr>
+            <w:r>
+              <w:rPr>
+                <w:b/>
+                <w:bCs/>
+                <w:sz w:val="20"/>
+              </w:rPr>
+              <w:t>P</w:t>
+            </w:r>
+          </w:p>
+        </w:tc>
+        <w:tc>
+          <w:tcPr>
+            <w:tcW w:w="2268" w:type="dxa"/>
+          </w:tcPr>
+          <w:p>
+            <w:pPr>
+              <w:jc w:val="center"/>
+              <w:rPr>
+                <w:sz w:val="20"/>
+              </w:rPr>
+            </w:pPr>
+            <w:r>
+              <w:rPr>
+                <w:sz w:val="20"/>
+              </w:rPr>
+              <w:t>int</w:t>
+            </w:r>
+          </w:p>
+        </w:tc>
+        <w:tc>
+          <w:tcPr>
+            <w:tcW w:w="5528" w:type="dxa"/>
+          </w:tcPr>
+          <w:p>
+            <w:pPr>
+              <w:rPr>
+                <w:sz w:val="20"/>
+              </w:rPr>
+            </w:pPr>
+            <w:r>
+              <w:rPr>
+                <w:sz w:val="20"/>
+              </w:rPr>
+              <w:t>Defines the P value in each line of “SingleStrokeFont.txt”</w:t>
             </w:r>
           </w:p>
         </w:tc>
@@ -508,53 +1435,55 @@
         </w:trPr>
         <w:tc>
           <w:tcPr>
-            <w:tcW w:w="2263" w:type="dxa"/>
-          </w:tcPr>
-          <w:p>
-            <w:pPr>
-              <w:jc w:val="center"/>
-              <w:rPr>
-                <w:sz w:val="20"/>
-              </w:rPr>
-            </w:pPr>
-            <w:r>
-              <w:rPr>
-                <w:sz w:val="20"/>
-              </w:rPr>
-              <w:t>MyBuffer</w:t>
-            </w:r>
-            <w:r>
-              <w:rPr>
-                <w:sz w:val="20"/>
-              </w:rPr>
-              <w:t>[256]</w:t>
-            </w:r>
-          </w:p>
-          <w:p>
-            <w:pPr>
-              <w:jc w:val="center"/>
-              <w:rPr>
-                <w:sz w:val="20"/>
-              </w:rPr>
-            </w:pPr>
-          </w:p>
-        </w:tc>
-        <w:tc>
-          <w:tcPr>
-            <w:tcW w:w="1985" w:type="dxa"/>
-          </w:tcPr>
-          <w:p>
-            <w:pPr>
-              <w:jc w:val="center"/>
-              <w:rPr>
-                <w:sz w:val="20"/>
-              </w:rPr>
-            </w:pPr>
-            <w:r>
-              <w:rPr>
-                <w:sz w:val="20"/>
-              </w:rPr>
-              <w:t>char</w:t>
+            <w:tcW w:w="1980" w:type="dxa"/>
+          </w:tcPr>
+          <w:p>
+            <w:pPr>
+              <w:jc w:val="center"/>
+              <w:rPr>
+                <w:b/>
+                <w:bCs/>
+                <w:sz w:val="20"/>
+              </w:rPr>
+            </w:pPr>
+            <w:proofErr w:type="spellStart"/>
+            <w:r>
+              <w:rPr>
+                <w:b/>
+                <w:bCs/>
+                <w:sz w:val="20"/>
+              </w:rPr>
+              <w:t>AsciiLine</w:t>
+            </w:r>
+            <w:proofErr w:type="spellEnd"/>
+          </w:p>
+          <w:p>
+            <w:pPr>
+              <w:jc w:val="center"/>
+              <w:rPr>
+                <w:b/>
+                <w:bCs/>
+                <w:sz w:val="20"/>
+              </w:rPr>
+            </w:pPr>
+          </w:p>
+        </w:tc>
+        <w:tc>
+          <w:tcPr>
+            <w:tcW w:w="2268" w:type="dxa"/>
+          </w:tcPr>
+          <w:p>
+            <w:pPr>
+              <w:jc w:val="center"/>
+              <w:rPr>
+                <w:sz w:val="20"/>
+              </w:rPr>
+            </w:pPr>
+            <w:r>
+              <w:rPr>
+                <w:sz w:val="20"/>
+              </w:rPr>
+              <w:t>struct</w:t>
             </w:r>
           </w:p>
         </w:tc>
@@ -568,17 +1497,159 @@
                 <w:sz w:val="20"/>
               </w:rPr>
             </w:pPr>
-            <w:r>
-              <w:rPr>
-                <w:sz w:val="20"/>
-              </w:rPr>
-              <w:t xml:space="preserve">A buffer used as temporal storage to </w:t>
-            </w:r>
-            <w:r>
-              <w:rPr>
-                <w:sz w:val="20"/>
-              </w:rPr>
-              <w:t>store each line in “SingleStrokeFont.txt” and input it into FontArray. Also used after to temporal store each GCode line to send to the robot.</w:t>
+          </w:p>
+        </w:tc>
+      </w:tr>
+      <w:tr>
+        <w:trPr>
+          <w:trHeight w:val="147"/>
+        </w:trPr>
+        <w:tc>
+          <w:tcPr>
+            <w:tcW w:w="1980" w:type="dxa"/>
+          </w:tcPr>
+          <w:p>
+            <w:pPr>
+              <w:jc w:val="center"/>
+              <w:rPr>
+                <w:b/>
+                <w:bCs/>
+                <w:sz w:val="20"/>
+              </w:rPr>
+            </w:pPr>
+            <w:proofErr w:type="spellStart"/>
+            <w:r>
+              <w:rPr>
+                <w:b/>
+                <w:bCs/>
+                <w:sz w:val="20"/>
+              </w:rPr>
+              <w:t>AsciiValue</w:t>
+            </w:r>
+            <w:proofErr w:type="spellEnd"/>
+          </w:p>
+          <w:p>
+            <w:pPr>
+              <w:jc w:val="center"/>
+              <w:rPr>
+                <w:b/>
+                <w:bCs/>
+                <w:sz w:val="20"/>
+              </w:rPr>
+            </w:pPr>
+          </w:p>
+        </w:tc>
+        <w:tc>
+          <w:tcPr>
+            <w:tcW w:w="2268" w:type="dxa"/>
+          </w:tcPr>
+          <w:p>
+            <w:pPr>
+              <w:jc w:val="center"/>
+              <w:rPr>
+                <w:sz w:val="20"/>
+              </w:rPr>
+            </w:pPr>
+            <w:r>
+              <w:rPr>
+                <w:sz w:val="20"/>
+              </w:rPr>
+              <w:t>int</w:t>
+            </w:r>
+          </w:p>
+        </w:tc>
+        <w:tc>
+          <w:tcPr>
+            <w:tcW w:w="5528" w:type="dxa"/>
+          </w:tcPr>
+          <w:p>
+            <w:pPr>
+              <w:rPr>
+                <w:sz w:val="20"/>
+              </w:rPr>
+            </w:pPr>
+            <w:r>
+              <w:rPr>
+                <w:sz w:val="20"/>
+              </w:rPr>
+              <w:t>Defines the Ascii number for each of the 128 characters in “SingleStrokeFont.txt”</w:t>
+            </w:r>
+          </w:p>
+        </w:tc>
+      </w:tr>
+      <w:tr>
+        <w:trPr>
+          <w:trHeight w:val="83"/>
+        </w:trPr>
+        <w:tc>
+          <w:tcPr>
+            <w:tcW w:w="1980" w:type="dxa"/>
+          </w:tcPr>
+          <w:p>
+            <w:pPr>
+              <w:jc w:val="center"/>
+              <w:rPr>
+                <w:b/>
+                <w:bCs/>
+                <w:sz w:val="20"/>
+              </w:rPr>
+            </w:pPr>
+            <w:proofErr w:type="spellStart"/>
+            <w:r>
+              <w:rPr>
+                <w:b/>
+                <w:bCs/>
+                <w:sz w:val="20"/>
+              </w:rPr>
+              <w:t>NumberOfLines</w:t>
+            </w:r>
+            <w:proofErr w:type="spellEnd"/>
+          </w:p>
+          <w:p>
+            <w:pPr>
+              <w:jc w:val="center"/>
+              <w:rPr>
+                <w:b/>
+                <w:bCs/>
+                <w:sz w:val="20"/>
+              </w:rPr>
+            </w:pPr>
+          </w:p>
+        </w:tc>
+        <w:tc>
+          <w:tcPr>
+            <w:tcW w:w="2268" w:type="dxa"/>
+          </w:tcPr>
+          <w:p>
+            <w:pPr>
+              <w:jc w:val="center"/>
+              <w:rPr>
+                <w:sz w:val="20"/>
+              </w:rPr>
+            </w:pPr>
+            <w:r>
+              <w:rPr>
+                <w:sz w:val="20"/>
+              </w:rPr>
+              <w:t>int</w:t>
+            </w:r>
+          </w:p>
+        </w:tc>
+        <w:tc>
+          <w:tcPr>
+            <w:tcW w:w="5528" w:type="dxa"/>
+          </w:tcPr>
+          <w:p>
+            <w:pPr>
+              <w:rPr>
+                <w:sz w:val="20"/>
+              </w:rPr>
+            </w:pPr>
+            <w:r>
+              <w:rPr>
+                <w:sz w:val="20"/>
+              </w:rPr>
+              <w:t>Defines the number of stroke lines that each character has in it “SingleStrokeFont.txt”</w:t>
             </w:r>
           </w:p>
         </w:tc>
@@ -589,47 +1660,65 @@
         </w:trPr>
         <w:tc>
           <w:tcPr>
-            <w:tcW w:w="2263" w:type="dxa"/>
-          </w:tcPr>
-          <w:p>
-            <w:pPr>
-              <w:jc w:val="center"/>
-              <w:rPr>
-                <w:sz w:val="20"/>
-              </w:rPr>
-            </w:pPr>
-            <w:r>
-              <w:rPr>
-                <w:sz w:val="20"/>
-              </w:rPr>
-              <w:t>Font_Size</w:t>
-            </w:r>
-          </w:p>
-          <w:p>
-            <w:pPr>
-              <w:jc w:val="center"/>
-              <w:rPr>
-                <w:sz w:val="20"/>
-              </w:rPr>
-            </w:pPr>
-          </w:p>
-        </w:tc>
-        <w:tc>
-          <w:tcPr>
-            <w:tcW w:w="1985" w:type="dxa"/>
-          </w:tcPr>
-          <w:p>
-            <w:pPr>
-              <w:jc w:val="center"/>
-              <w:rPr>
-                <w:sz w:val="20"/>
-              </w:rPr>
-            </w:pPr>
-            <w:r>
-              <w:rPr>
-                <w:sz w:val="20"/>
-              </w:rPr>
-              <w:t>float</w:t>
+            <w:tcW w:w="1980" w:type="dxa"/>
+          </w:tcPr>
+          <w:p>
+            <w:pPr>
+              <w:jc w:val="center"/>
+              <w:rPr>
+                <w:b/>
+                <w:bCs/>
+                <w:sz w:val="20"/>
+              </w:rPr>
+            </w:pPr>
+            <w:r>
+              <w:rPr>
+                <w:b/>
+                <w:bCs/>
+                <w:sz w:val="20"/>
+              </w:rPr>
+              <w:t>*Lines[50]</w:t>
+            </w:r>
+          </w:p>
+          <w:p>
+            <w:pPr>
+              <w:jc w:val="center"/>
+              <w:rPr>
+                <w:b/>
+                <w:bCs/>
+                <w:sz w:val="20"/>
+              </w:rPr>
+            </w:pPr>
+          </w:p>
+        </w:tc>
+        <w:tc>
+          <w:tcPr>
+            <w:tcW w:w="2268" w:type="dxa"/>
+          </w:tcPr>
+          <w:p>
+            <w:pPr>
+              <w:jc w:val="center"/>
+              <w:rPr>
+                <w:sz w:val="20"/>
+              </w:rPr>
+            </w:pPr>
+            <w:r>
+              <w:rPr>
+                <w:sz w:val="20"/>
+              </w:rPr>
+              <w:t xml:space="preserve">Array (Buffer) of </w:t>
+            </w:r>
+            <w:r>
+              <w:rPr>
+                <w:sz w:val="20"/>
+              </w:rPr>
+              <w:t>char</w:t>
+            </w:r>
+            <w:r>
+              <w:rPr>
+                <w:sz w:val="20"/>
+              </w:rPr>
+              <w:t>s</w:t>
             </w:r>
           </w:p>
         </w:tc>
@@ -643,11 +1732,292 @@
                 <w:sz w:val="20"/>
               </w:rPr>
             </w:pPr>
-            <w:r>
-              <w:rPr>
-                <w:sz w:val="20"/>
-              </w:rPr>
-              <w:t>A real number that the user inputs between 4 and 10</w:t>
+          </w:p>
+        </w:tc>
+      </w:tr>
+      <w:tr>
+        <w:trPr>
+          <w:trHeight w:val="155"/>
+        </w:trPr>
+        <w:tc>
+          <w:tcPr>
+            <w:tcW w:w="1980" w:type="dxa"/>
+          </w:tcPr>
+          <w:p>
+            <w:pPr>
+              <w:jc w:val="center"/>
+              <w:rPr>
+                <w:b/>
+                <w:bCs/>
+                <w:sz w:val="20"/>
+              </w:rPr>
+            </w:pPr>
+            <w:r>
+              <w:rPr>
+                <w:b/>
+                <w:bCs/>
+                <w:sz w:val="20"/>
+              </w:rPr>
+              <w:t>*</w:t>
+            </w:r>
+            <w:proofErr w:type="spellStart"/>
+            <w:r>
+              <w:rPr>
+                <w:b/>
+                <w:bCs/>
+                <w:sz w:val="20"/>
+              </w:rPr>
+              <w:t>FontArray</w:t>
+            </w:r>
+            <w:proofErr w:type="spellEnd"/>
+          </w:p>
+          <w:p>
+            <w:pPr>
+              <w:jc w:val="center"/>
+              <w:rPr>
+                <w:b/>
+                <w:bCs/>
+                <w:sz w:val="20"/>
+              </w:rPr>
+            </w:pPr>
+          </w:p>
+        </w:tc>
+        <w:tc>
+          <w:tcPr>
+            <w:tcW w:w="2268" w:type="dxa"/>
+          </w:tcPr>
+          <w:p>
+            <w:pPr>
+              <w:jc w:val="center"/>
+              <w:rPr>
+                <w:sz w:val="20"/>
+              </w:rPr>
+            </w:pPr>
+            <w:r>
+              <w:rPr>
+                <w:sz w:val="20"/>
+              </w:rPr>
+              <w:t>array</w:t>
+            </w:r>
+          </w:p>
+        </w:tc>
+        <w:tc>
+          <w:tcPr>
+            <w:tcW w:w="5528" w:type="dxa"/>
+          </w:tcPr>
+          <w:p>
+            <w:pPr>
+              <w:rPr>
+                <w:sz w:val="20"/>
+              </w:rPr>
+            </w:pPr>
+            <w:r>
+              <w:rPr>
+                <w:sz w:val="20"/>
+              </w:rPr>
+              <w:t>An array that holds all of the stroke lines within “SingleStrokeFont.txt”</w:t>
+            </w:r>
+          </w:p>
+        </w:tc>
+      </w:tr>
+      <w:tr>
+        <w:trPr>
+          <w:trHeight w:val="220"/>
+        </w:trPr>
+        <w:tc>
+          <w:tcPr>
+            <w:tcW w:w="1980" w:type="dxa"/>
+          </w:tcPr>
+          <w:p>
+            <w:pPr>
+              <w:jc w:val="center"/>
+              <w:rPr>
+                <w:b/>
+                <w:bCs/>
+                <w:sz w:val="20"/>
+              </w:rPr>
+            </w:pPr>
+            <w:proofErr w:type="spellStart"/>
+            <w:r>
+              <w:rPr>
+                <w:b/>
+                <w:bCs/>
+                <w:sz w:val="20"/>
+              </w:rPr>
+              <w:t>FontCount</w:t>
+            </w:r>
+            <w:proofErr w:type="spellEnd"/>
+          </w:p>
+          <w:p>
+            <w:pPr>
+              <w:jc w:val="center"/>
+              <w:rPr>
+                <w:b/>
+                <w:bCs/>
+                <w:sz w:val="20"/>
+              </w:rPr>
+            </w:pPr>
+          </w:p>
+        </w:tc>
+        <w:tc>
+          <w:tcPr>
+            <w:tcW w:w="2268" w:type="dxa"/>
+          </w:tcPr>
+          <w:p>
+            <w:pPr>
+              <w:jc w:val="center"/>
+              <w:rPr>
+                <w:sz w:val="20"/>
+              </w:rPr>
+            </w:pPr>
+            <w:r>
+              <w:rPr>
+                <w:sz w:val="20"/>
+              </w:rPr>
+              <w:t>int</w:t>
+            </w:r>
+          </w:p>
+        </w:tc>
+        <w:tc>
+          <w:tcPr>
+            <w:tcW w:w="5528" w:type="dxa"/>
+          </w:tcPr>
+          <w:p>
+            <w:pPr>
+              <w:rPr>
+                <w:sz w:val="20"/>
+              </w:rPr>
+            </w:pPr>
+            <w:r>
+              <w:rPr>
+                <w:sz w:val="20"/>
+              </w:rPr>
+              <w:t xml:space="preserve">Calculates how many characters that have been defined in “SingleStrokeFont.txt” </w:t>
+            </w:r>
+          </w:p>
+        </w:tc>
+      </w:tr>
+      <w:tr>
+        <w:trPr>
+          <w:trHeight w:val="297"/>
+        </w:trPr>
+        <w:tc>
+          <w:tcPr>
+            <w:tcW w:w="1980" w:type="dxa"/>
+          </w:tcPr>
+          <w:p>
+            <w:pPr>
+              <w:jc w:val="center"/>
+              <w:rPr>
+                <w:b/>
+                <w:bCs/>
+                <w:sz w:val="20"/>
+              </w:rPr>
+            </w:pPr>
+            <w:proofErr w:type="spellStart"/>
+            <w:r>
+              <w:rPr>
+                <w:b/>
+                <w:bCs/>
+                <w:sz w:val="20"/>
+              </w:rPr>
+              <w:t>ScannedValue</w:t>
+            </w:r>
+            <w:proofErr w:type="spellEnd"/>
+          </w:p>
+          <w:p>
+            <w:pPr>
+              <w:jc w:val="center"/>
+              <w:rPr>
+                <w:b/>
+                <w:bCs/>
+                <w:sz w:val="20"/>
+              </w:rPr>
+            </w:pPr>
+          </w:p>
+        </w:tc>
+        <w:tc>
+          <w:tcPr>
+            <w:tcW w:w="2268" w:type="dxa"/>
+          </w:tcPr>
+          <w:p>
+            <w:pPr>
+              <w:jc w:val="center"/>
+              <w:rPr>
+                <w:sz w:val="20"/>
+              </w:rPr>
+            </w:pPr>
+            <w:r>
+              <w:rPr>
+                <w:sz w:val="20"/>
+              </w:rPr>
+              <w:t>int</w:t>
+            </w:r>
+          </w:p>
+        </w:tc>
+        <w:tc>
+          <w:tcPr>
+            <w:tcW w:w="5528" w:type="dxa"/>
+          </w:tcPr>
+          <w:p>
+            <w:pPr>
+              <w:rPr>
+                <w:sz w:val="20"/>
+              </w:rPr>
+            </w:pPr>
+            <w:r>
+              <w:rPr>
+                <w:sz w:val="20"/>
+              </w:rPr>
+              <w:t>C</w:t>
+            </w:r>
+            <w:r>
+              <w:rPr>
+                <w:sz w:val="20"/>
+              </w:rPr>
+              <w:t>heck</w:t>
+            </w:r>
+            <w:r>
+              <w:rPr>
+                <w:sz w:val="20"/>
+              </w:rPr>
+              <w:t>s</w:t>
+            </w:r>
+            <w:r>
+              <w:rPr>
+                <w:sz w:val="20"/>
+              </w:rPr>
+              <w:t xml:space="preserve"> if the number scanned in the “SingleStrokeFont.txt” is equal to 999</w:t>
+            </w:r>
+            <w:r>
+              <w:rPr>
+                <w:sz w:val="20"/>
+              </w:rPr>
+              <w:t xml:space="preserve">, </w:t>
+            </w:r>
+            <w:r>
+              <w:rPr>
+                <w:sz w:val="20"/>
+              </w:rPr>
+              <w:t xml:space="preserve">so we know </w:t>
+            </w:r>
+            <w:r>
+              <w:rPr>
+                <w:sz w:val="20"/>
+              </w:rPr>
+              <w:t xml:space="preserve">when </w:t>
+            </w:r>
+            <w:r>
+              <w:rPr>
+                <w:sz w:val="20"/>
+              </w:rPr>
+              <w:t>the next character’s stroke is being defined below</w:t>
+            </w:r>
+            <w:r>
+              <w:rPr>
+                <w:sz w:val="20"/>
+              </w:rPr>
+              <w:t>.</w:t>
             </w:r>
           </w:p>
         </w:tc>
@@ -658,47 +2028,63 @@
         </w:trPr>
         <w:tc>
           <w:tcPr>
-            <w:tcW w:w="2263" w:type="dxa"/>
-          </w:tcPr>
-          <w:p>
-            <w:pPr>
-              <w:jc w:val="center"/>
-              <w:rPr>
-                <w:sz w:val="20"/>
-              </w:rPr>
-            </w:pPr>
-            <w:r>
-              <w:rPr>
-                <w:sz w:val="20"/>
-              </w:rPr>
-              <w:t>Font_Size_Fraction</w:t>
-            </w:r>
-          </w:p>
-          <w:p>
-            <w:pPr>
-              <w:jc w:val="center"/>
-              <w:rPr>
-                <w:sz w:val="20"/>
-              </w:rPr>
-            </w:pPr>
-          </w:p>
-        </w:tc>
-        <w:tc>
-          <w:tcPr>
-            <w:tcW w:w="1985" w:type="dxa"/>
-          </w:tcPr>
-          <w:p>
-            <w:pPr>
-              <w:jc w:val="center"/>
-              <w:rPr>
-                <w:sz w:val="20"/>
-              </w:rPr>
-            </w:pPr>
-            <w:r>
-              <w:rPr>
-                <w:sz w:val="20"/>
-              </w:rPr>
-              <w:t>float</w:t>
+            <w:tcW w:w="1980" w:type="dxa"/>
+          </w:tcPr>
+          <w:p>
+            <w:pPr>
+              <w:jc w:val="center"/>
+              <w:rPr>
+                <w:b/>
+                <w:bCs/>
+                <w:sz w:val="20"/>
+              </w:rPr>
+            </w:pPr>
+            <w:r>
+              <w:rPr>
+                <w:b/>
+                <w:bCs/>
+                <w:sz w:val="20"/>
+              </w:rPr>
+              <w:t>*</w:t>
+            </w:r>
+            <w:proofErr w:type="spellStart"/>
+            <w:r>
+              <w:rPr>
+                <w:b/>
+                <w:bCs/>
+                <w:sz w:val="20"/>
+              </w:rPr>
+              <w:t>OutFontCount</w:t>
+            </w:r>
+            <w:proofErr w:type="spellEnd"/>
+          </w:p>
+          <w:p>
+            <w:pPr>
+              <w:jc w:val="center"/>
+              <w:rPr>
+                <w:b/>
+                <w:bCs/>
+                <w:sz w:val="20"/>
+              </w:rPr>
+            </w:pPr>
+          </w:p>
+        </w:tc>
+        <w:tc>
+          <w:tcPr>
+            <w:tcW w:w="2268" w:type="dxa"/>
+          </w:tcPr>
+          <w:p>
+            <w:pPr>
+              <w:jc w:val="center"/>
+              <w:rPr>
+                <w:sz w:val="20"/>
+              </w:rPr>
+            </w:pPr>
+            <w:r>
+              <w:rPr>
+                <w:sz w:val="20"/>
+              </w:rPr>
+              <w:t>int</w:t>
             </w:r>
           </w:p>
         </w:tc>
@@ -712,12 +2098,6 @@
                 <w:sz w:val="20"/>
               </w:rPr>
             </w:pPr>
-            <w:r>
-              <w:rPr>
-                <w:sz w:val="20"/>
-              </w:rPr>
-              <w:t>The value I multiple the stroke coordinate by to draw the correctly sized characters</w:t>
-            </w:r>
           </w:p>
         </w:tc>
       </w:tr>
@@ -727,47 +2107,43 @@
         </w:trPr>
         <w:tc>
           <w:tcPr>
-            <w:tcW w:w="2263" w:type="dxa"/>
-          </w:tcPr>
-          <w:p>
-            <w:pPr>
-              <w:jc w:val="center"/>
-              <w:rPr>
-                <w:sz w:val="20"/>
-              </w:rPr>
-            </w:pPr>
-            <w:r>
-              <w:rPr>
-                <w:sz w:val="20"/>
-              </w:rPr>
-              <w:t>CharactersInWord</w:t>
-            </w:r>
-          </w:p>
-          <w:p>
-            <w:pPr>
-              <w:jc w:val="center"/>
-              <w:rPr>
-                <w:sz w:val="20"/>
-              </w:rPr>
-            </w:pPr>
-          </w:p>
-        </w:tc>
-        <w:tc>
-          <w:tcPr>
-            <w:tcW w:w="1985" w:type="dxa"/>
-          </w:tcPr>
-          <w:p>
-            <w:pPr>
-              <w:jc w:val="center"/>
-              <w:rPr>
-                <w:sz w:val="20"/>
-              </w:rPr>
-            </w:pPr>
-            <w:r>
-              <w:rPr>
-                <w:sz w:val="20"/>
-              </w:rPr>
-              <w:t>int</w:t>
+            <w:tcW w:w="1980" w:type="dxa"/>
+          </w:tcPr>
+          <w:p>
+            <w:pPr>
+              <w:jc w:val="center"/>
+              <w:rPr>
+                <w:b/>
+                <w:bCs/>
+                <w:sz w:val="20"/>
+              </w:rPr>
+            </w:pPr>
+            <w:r>
+              <w:rPr>
+                <w:b/>
+                <w:bCs/>
+                <w:sz w:val="20"/>
+              </w:rPr>
+              <w:t>*FP</w:t>
+            </w:r>
+          </w:p>
+        </w:tc>
+        <w:tc>
+          <w:tcPr>
+            <w:tcW w:w="2268" w:type="dxa"/>
+          </w:tcPr>
+          <w:p>
+            <w:pPr>
+              <w:jc w:val="center"/>
+              <w:rPr>
+                <w:sz w:val="20"/>
+              </w:rPr>
+            </w:pPr>
+            <w:r>
+              <w:rPr>
+                <w:sz w:val="20"/>
+              </w:rPr>
+              <w:t>pointer</w:t>
             </w:r>
           </w:p>
         </w:tc>
@@ -781,12 +2157,6 @@
                 <w:sz w:val="20"/>
               </w:rPr>
             </w:pPr>
-            <w:r>
-              <w:rPr>
-                <w:sz w:val="20"/>
-              </w:rPr>
-              <w:t>Value that determines how many characters are in each word and this includes the space after the word if there is one</w:t>
-            </w:r>
           </w:p>
         </w:tc>
       </w:tr>
@@ -796,47 +2166,43 @@
         </w:trPr>
         <w:tc>
           <w:tcPr>
-            <w:tcW w:w="2263" w:type="dxa"/>
-          </w:tcPr>
-          <w:p>
-            <w:pPr>
-              <w:jc w:val="center"/>
-              <w:rPr>
-                <w:sz w:val="20"/>
-              </w:rPr>
-            </w:pPr>
-            <w:r>
-              <w:rPr>
-                <w:sz w:val="20"/>
-              </w:rPr>
-              <w:t>char Character</w:t>
-            </w:r>
-          </w:p>
-          <w:p>
-            <w:pPr>
-              <w:jc w:val="center"/>
-              <w:rPr>
-                <w:sz w:val="20"/>
-              </w:rPr>
-            </w:pPr>
-          </w:p>
-        </w:tc>
-        <w:tc>
-          <w:tcPr>
-            <w:tcW w:w="1985" w:type="dxa"/>
-          </w:tcPr>
-          <w:p>
-            <w:pPr>
-              <w:jc w:val="center"/>
-              <w:rPr>
-                <w:sz w:val="20"/>
-              </w:rPr>
-            </w:pPr>
-            <w:r>
-              <w:rPr>
-                <w:sz w:val="20"/>
-              </w:rPr>
-              <w:t>char</w:t>
+            <w:tcW w:w="1980" w:type="dxa"/>
+          </w:tcPr>
+          <w:p>
+            <w:pPr>
+              <w:jc w:val="center"/>
+              <w:rPr>
+                <w:b/>
+                <w:bCs/>
+                <w:sz w:val="20"/>
+              </w:rPr>
+            </w:pPr>
+            <w:r>
+              <w:rPr>
+                <w:b/>
+                <w:bCs/>
+                <w:sz w:val="20"/>
+              </w:rPr>
+              <w:t>*Sentence</w:t>
+            </w:r>
+          </w:p>
+        </w:tc>
+        <w:tc>
+          <w:tcPr>
+            <w:tcW w:w="2268" w:type="dxa"/>
+          </w:tcPr>
+          <w:p>
+            <w:pPr>
+              <w:jc w:val="center"/>
+              <w:rPr>
+                <w:sz w:val="20"/>
+              </w:rPr>
+            </w:pPr>
+            <w:r>
+              <w:rPr>
+                <w:sz w:val="20"/>
+              </w:rPr>
+              <w:t>pointer</w:t>
             </w:r>
           </w:p>
         </w:tc>
@@ -859,1163 +2225,21 @@
         </w:trPr>
         <w:tc>
           <w:tcPr>
-            <w:tcW w:w="2263" w:type="dxa"/>
-          </w:tcPr>
-          <w:p>
-            <w:pPr>
-              <w:jc w:val="center"/>
-              <w:rPr>
-                <w:sz w:val="20"/>
-              </w:rPr>
-            </w:pPr>
-            <w:r>
-              <w:rPr>
-                <w:sz w:val="20"/>
-              </w:rPr>
-              <w:t>Word[256]</w:t>
-            </w:r>
-          </w:p>
-          <w:p>
-            <w:pPr>
-              <w:jc w:val="center"/>
-              <w:rPr>
-                <w:sz w:val="20"/>
-              </w:rPr>
-            </w:pPr>
-          </w:p>
-        </w:tc>
-        <w:tc>
-          <w:tcPr>
-            <w:tcW w:w="1985" w:type="dxa"/>
-          </w:tcPr>
-          <w:p>
-            <w:pPr>
-              <w:jc w:val="center"/>
-              <w:rPr>
-                <w:sz w:val="20"/>
-              </w:rPr>
-            </w:pPr>
-            <w:r>
-              <w:rPr>
-                <w:sz w:val="20"/>
-              </w:rPr>
-              <w:t>int</w:t>
-            </w:r>
-          </w:p>
-        </w:tc>
-        <w:tc>
-          <w:tcPr>
-            <w:tcW w:w="5528" w:type="dxa"/>
-          </w:tcPr>
-          <w:p>
-            <w:pPr>
-              <w:rPr>
-                <w:sz w:val="20"/>
-              </w:rPr>
-            </w:pPr>
-            <w:r>
-              <w:rPr>
-                <w:sz w:val="20"/>
-              </w:rPr>
-              <w:t>A second buffer used as temporal storage to store each word of the input sentence so that the MyBuffer can store the GCode and not erase the word</w:t>
-            </w:r>
-          </w:p>
-        </w:tc>
-      </w:tr>
-      <w:tr>
-        <w:trPr>
-          <w:trHeight w:val="547"/>
-        </w:trPr>
-        <w:tc>
-          <w:tcPr>
-            <w:tcW w:w="2263" w:type="dxa"/>
-          </w:tcPr>
-          <w:p>
-            <w:pPr>
-              <w:jc w:val="center"/>
-              <w:rPr>
-                <w:sz w:val="20"/>
-              </w:rPr>
-            </w:pPr>
-            <w:r>
-              <w:rPr>
-                <w:sz w:val="20"/>
-              </w:rPr>
-              <w:t>Character_Length_X</w:t>
-            </w:r>
-          </w:p>
-          <w:p>
-            <w:pPr>
-              <w:jc w:val="center"/>
-              <w:rPr>
-                <w:sz w:val="20"/>
-              </w:rPr>
-            </w:pPr>
-          </w:p>
-        </w:tc>
-        <w:tc>
-          <w:tcPr>
-            <w:tcW w:w="1985" w:type="dxa"/>
-          </w:tcPr>
-          <w:p>
-            <w:pPr>
-              <w:jc w:val="center"/>
-              <w:rPr>
-                <w:sz w:val="20"/>
-              </w:rPr>
-            </w:pPr>
-            <w:r>
-              <w:rPr>
-                <w:sz w:val="20"/>
-              </w:rPr>
-              <w:t>float</w:t>
-            </w:r>
-          </w:p>
-        </w:tc>
-        <w:tc>
-          <w:tcPr>
-            <w:tcW w:w="5528" w:type="dxa"/>
-          </w:tcPr>
-          <w:p>
-            <w:pPr>
-              <w:rPr>
-                <w:sz w:val="20"/>
-              </w:rPr>
-            </w:pPr>
-            <w:r>
-              <w:rPr>
-                <w:sz w:val="20"/>
-              </w:rPr>
-              <w:t xml:space="preserve">The horizontal length that </w:t>
-            </w:r>
-            <w:r>
-              <w:rPr>
-                <w:sz w:val="20"/>
-              </w:rPr>
-              <w:t>each character</w:t>
-            </w:r>
-            <w:r>
-              <w:rPr>
-                <w:sz w:val="20"/>
-              </w:rPr>
-              <w:t xml:space="preserve"> takes</w:t>
-            </w:r>
-            <w:r>
-              <w:rPr>
-                <w:sz w:val="20"/>
-              </w:rPr>
-              <w:t xml:space="preserve"> up in the X axis. Used to calculate Word_Length_X</w:t>
-            </w:r>
-          </w:p>
-        </w:tc>
-      </w:tr>
-      <w:tr>
-        <w:trPr>
-          <w:trHeight w:val="547"/>
-        </w:trPr>
-        <w:tc>
-          <w:tcPr>
-            <w:tcW w:w="2263" w:type="dxa"/>
-          </w:tcPr>
-          <w:p>
-            <w:pPr>
-              <w:jc w:val="center"/>
-              <w:rPr>
-                <w:sz w:val="20"/>
-              </w:rPr>
-            </w:pPr>
-            <w:r>
-              <w:rPr>
-                <w:sz w:val="20"/>
-              </w:rPr>
-              <w:t>Word_Length_X</w:t>
-            </w:r>
-          </w:p>
-          <w:p>
-            <w:pPr>
-              <w:jc w:val="center"/>
-              <w:rPr>
-                <w:sz w:val="20"/>
-              </w:rPr>
-            </w:pPr>
-          </w:p>
-        </w:tc>
-        <w:tc>
-          <w:tcPr>
-            <w:tcW w:w="1985" w:type="dxa"/>
-          </w:tcPr>
-          <w:p>
-            <w:pPr>
-              <w:jc w:val="center"/>
-              <w:rPr>
-                <w:sz w:val="20"/>
-              </w:rPr>
-            </w:pPr>
-            <w:r>
-              <w:rPr>
-                <w:sz w:val="20"/>
-              </w:rPr>
-              <w:t>float</w:t>
-            </w:r>
-          </w:p>
-        </w:tc>
-        <w:tc>
-          <w:tcPr>
-            <w:tcW w:w="5528" w:type="dxa"/>
-          </w:tcPr>
-          <w:p>
-            <w:pPr>
-              <w:rPr>
-                <w:sz w:val="20"/>
-              </w:rPr>
-            </w:pPr>
-            <w:r>
-              <w:rPr>
-                <w:sz w:val="20"/>
-              </w:rPr>
-              <w:t>The horizontal length that each word takes up in the X axis. Used to make sure word fits on the page</w:t>
-            </w:r>
-          </w:p>
-        </w:tc>
-      </w:tr>
-      <w:tr>
-        <w:trPr>
-          <w:trHeight w:val="547"/>
-        </w:trPr>
-        <w:tc>
-          <w:tcPr>
-            <w:tcW w:w="2263" w:type="dxa"/>
-          </w:tcPr>
-          <w:p>
-            <w:pPr>
-              <w:jc w:val="center"/>
-              <w:rPr>
-                <w:sz w:val="20"/>
-              </w:rPr>
-            </w:pPr>
-            <w:r>
-              <w:rPr>
-                <w:sz w:val="20"/>
-              </w:rPr>
-              <w:t>NewLine</w:t>
-            </w:r>
-          </w:p>
-          <w:p>
-            <w:pPr>
-              <w:jc w:val="center"/>
-              <w:rPr>
-                <w:sz w:val="20"/>
-              </w:rPr>
-            </w:pPr>
-          </w:p>
-        </w:tc>
-        <w:tc>
-          <w:tcPr>
-            <w:tcW w:w="1985" w:type="dxa"/>
-          </w:tcPr>
-          <w:p>
-            <w:pPr>
-              <w:jc w:val="center"/>
-              <w:rPr>
-                <w:sz w:val="20"/>
-              </w:rPr>
-            </w:pPr>
-            <w:r>
-              <w:rPr>
-                <w:sz w:val="20"/>
-              </w:rPr>
-              <w:t>int</w:t>
-            </w:r>
-          </w:p>
-        </w:tc>
-        <w:tc>
-          <w:tcPr>
-            <w:tcW w:w="5528" w:type="dxa"/>
-          </w:tcPr>
-          <w:p>
-            <w:pPr>
-              <w:rPr>
-                <w:sz w:val="20"/>
-              </w:rPr>
-            </w:pPr>
-          </w:p>
-        </w:tc>
-      </w:tr>
-      <w:tr>
-        <w:trPr>
-          <w:trHeight w:val="547"/>
-        </w:trPr>
-        <w:tc>
-          <w:tcPr>
-            <w:tcW w:w="2263" w:type="dxa"/>
-          </w:tcPr>
-          <w:p>
-            <w:pPr>
-              <w:jc w:val="center"/>
-              <w:rPr>
-                <w:sz w:val="20"/>
-              </w:rPr>
-            </w:pPr>
-            <w:r>
-              <w:rPr>
-                <w:sz w:val="20"/>
-              </w:rPr>
-              <w:t>X</w:t>
-            </w:r>
-          </w:p>
-          <w:p>
-            <w:pPr>
-              <w:jc w:val="center"/>
-              <w:rPr>
-                <w:sz w:val="20"/>
-              </w:rPr>
-            </w:pPr>
-          </w:p>
-        </w:tc>
-        <w:tc>
-          <w:tcPr>
-            <w:tcW w:w="1985" w:type="dxa"/>
-          </w:tcPr>
-          <w:p>
-            <w:pPr>
-              <w:jc w:val="center"/>
-              <w:rPr>
-                <w:sz w:val="20"/>
-              </w:rPr>
-            </w:pPr>
-            <w:r>
-              <w:rPr>
-                <w:sz w:val="20"/>
-              </w:rPr>
-              <w:t>float</w:t>
-            </w:r>
-          </w:p>
-        </w:tc>
-        <w:tc>
-          <w:tcPr>
-            <w:tcW w:w="5528" w:type="dxa"/>
-          </w:tcPr>
-          <w:p>
-            <w:pPr>
-              <w:rPr>
-                <w:sz w:val="20"/>
-              </w:rPr>
-            </w:pPr>
-            <w:r>
-              <w:rPr>
-                <w:sz w:val="20"/>
-              </w:rPr>
-              <w:t>Defines the X value in each line of “SingleStrokeFont.txt”</w:t>
-            </w:r>
-          </w:p>
-        </w:tc>
-      </w:tr>
-      <w:tr>
-        <w:trPr>
-          <w:trHeight w:val="547"/>
-        </w:trPr>
-        <w:tc>
-          <w:tcPr>
-            <w:tcW w:w="2263" w:type="dxa"/>
-          </w:tcPr>
-          <w:p>
-            <w:pPr>
-              <w:jc w:val="center"/>
-              <w:rPr>
-                <w:sz w:val="20"/>
-              </w:rPr>
-            </w:pPr>
-            <w:r>
-              <w:rPr>
-                <w:sz w:val="20"/>
-              </w:rPr>
-              <w:t>Y</w:t>
-            </w:r>
-          </w:p>
-          <w:p>
-            <w:pPr>
-              <w:jc w:val="center"/>
-              <w:rPr>
-                <w:sz w:val="20"/>
-              </w:rPr>
-            </w:pPr>
-          </w:p>
-        </w:tc>
-        <w:tc>
-          <w:tcPr>
-            <w:tcW w:w="1985" w:type="dxa"/>
-          </w:tcPr>
-          <w:p>
-            <w:pPr>
-              <w:jc w:val="center"/>
-              <w:rPr>
-                <w:sz w:val="20"/>
-              </w:rPr>
-            </w:pPr>
-            <w:r>
-              <w:rPr>
-                <w:sz w:val="20"/>
-              </w:rPr>
-              <w:t>float</w:t>
-            </w:r>
-          </w:p>
-        </w:tc>
-        <w:tc>
-          <w:tcPr>
-            <w:tcW w:w="5528" w:type="dxa"/>
-          </w:tcPr>
-          <w:p>
-            <w:pPr>
-              <w:rPr>
-                <w:sz w:val="20"/>
-              </w:rPr>
-            </w:pPr>
-            <w:r>
-              <w:rPr>
-                <w:sz w:val="20"/>
-              </w:rPr>
-              <w:t>Defines the Y value in each line of “SingleStrokeFont.txt”</w:t>
-            </w:r>
-          </w:p>
-        </w:tc>
-      </w:tr>
-      <w:tr>
-        <w:trPr>
-          <w:trHeight w:val="547"/>
-        </w:trPr>
-        <w:tc>
-          <w:tcPr>
-            <w:tcW w:w="2263" w:type="dxa"/>
-          </w:tcPr>
-          <w:p>
-            <w:pPr>
-              <w:jc w:val="center"/>
-              <w:rPr>
-                <w:sz w:val="20"/>
-              </w:rPr>
-            </w:pPr>
-            <w:r>
-              <w:rPr>
-                <w:sz w:val="20"/>
-              </w:rPr>
-              <w:lastRenderedPageBreak/>
-              <w:t>P</w:t>
-            </w:r>
-          </w:p>
-          <w:p>
-            <w:pPr>
-              <w:jc w:val="center"/>
-              <w:rPr>
-                <w:sz w:val="20"/>
-              </w:rPr>
-            </w:pPr>
-          </w:p>
-        </w:tc>
-        <w:tc>
-          <w:tcPr>
-            <w:tcW w:w="1985" w:type="dxa"/>
-          </w:tcPr>
-          <w:p>
-            <w:pPr>
-              <w:jc w:val="center"/>
-              <w:rPr>
-                <w:sz w:val="20"/>
-              </w:rPr>
-            </w:pPr>
-            <w:r>
-              <w:rPr>
-                <w:sz w:val="20"/>
-              </w:rPr>
-              <w:t>int</w:t>
-            </w:r>
-          </w:p>
-        </w:tc>
-        <w:tc>
-          <w:tcPr>
-            <w:tcW w:w="5528" w:type="dxa"/>
-          </w:tcPr>
-          <w:p>
-            <w:pPr>
-              <w:rPr>
-                <w:sz w:val="20"/>
-              </w:rPr>
-            </w:pPr>
-            <w:r>
-              <w:rPr>
-                <w:sz w:val="20"/>
-              </w:rPr>
-              <w:t>Defines the P value in each line of “SingleStrokeFont.txt”</w:t>
-            </w:r>
-          </w:p>
-        </w:tc>
-      </w:tr>
-      <w:tr>
-        <w:trPr>
-          <w:trHeight w:val="547"/>
-        </w:trPr>
-        <w:tc>
-          <w:tcPr>
-            <w:tcW w:w="2263" w:type="dxa"/>
-          </w:tcPr>
-          <w:p>
-            <w:pPr>
-              <w:jc w:val="center"/>
-              <w:rPr>
-                <w:sz w:val="20"/>
-              </w:rPr>
-            </w:pPr>
-            <w:r>
-              <w:rPr>
-                <w:sz w:val="20"/>
-              </w:rPr>
-              <w:t>AsciiLine</w:t>
-            </w:r>
-          </w:p>
-          <w:p>
-            <w:pPr>
-              <w:jc w:val="center"/>
-              <w:rPr>
-                <w:sz w:val="20"/>
-              </w:rPr>
-            </w:pPr>
-          </w:p>
-        </w:tc>
-        <w:tc>
-          <w:tcPr>
-            <w:tcW w:w="1985" w:type="dxa"/>
-          </w:tcPr>
-          <w:p>
-            <w:pPr>
-              <w:jc w:val="center"/>
-              <w:rPr>
-                <w:sz w:val="20"/>
-              </w:rPr>
-            </w:pPr>
-            <w:r>
-              <w:rPr>
-                <w:sz w:val="20"/>
-              </w:rPr>
-              <w:t>struct</w:t>
-            </w:r>
-          </w:p>
-        </w:tc>
-        <w:tc>
-          <w:tcPr>
-            <w:tcW w:w="5528" w:type="dxa"/>
-          </w:tcPr>
-          <w:p>
-            <w:pPr>
-              <w:rPr>
-                <w:sz w:val="20"/>
-              </w:rPr>
-            </w:pPr>
-          </w:p>
-        </w:tc>
-      </w:tr>
-      <w:tr>
-        <w:trPr>
-          <w:trHeight w:val="547"/>
-        </w:trPr>
-        <w:tc>
-          <w:tcPr>
-            <w:tcW w:w="2263" w:type="dxa"/>
-          </w:tcPr>
-          <w:p>
-            <w:pPr>
-              <w:jc w:val="center"/>
-              <w:rPr>
-                <w:sz w:val="20"/>
-              </w:rPr>
-            </w:pPr>
-            <w:r>
-              <w:rPr>
-                <w:sz w:val="20"/>
-              </w:rPr>
-              <w:t>AsciiValue</w:t>
-            </w:r>
-          </w:p>
-          <w:p>
-            <w:pPr>
-              <w:jc w:val="center"/>
-              <w:rPr>
-                <w:sz w:val="20"/>
-              </w:rPr>
-            </w:pPr>
-          </w:p>
-        </w:tc>
-        <w:tc>
-          <w:tcPr>
-            <w:tcW w:w="1985" w:type="dxa"/>
-          </w:tcPr>
-          <w:p>
-            <w:pPr>
-              <w:jc w:val="center"/>
-              <w:rPr>
-                <w:sz w:val="20"/>
-              </w:rPr>
-            </w:pPr>
-            <w:r>
-              <w:rPr>
-                <w:sz w:val="20"/>
-              </w:rPr>
-              <w:t>int</w:t>
-            </w:r>
-          </w:p>
-        </w:tc>
-        <w:tc>
-          <w:tcPr>
-            <w:tcW w:w="5528" w:type="dxa"/>
-          </w:tcPr>
-          <w:p>
-            <w:pPr>
-              <w:rPr>
-                <w:sz w:val="20"/>
-              </w:rPr>
-            </w:pPr>
-            <w:r>
-              <w:rPr>
-                <w:sz w:val="20"/>
-              </w:rPr>
-              <w:t>Defines the Ascii number for each of the 128 characters in “SingleStrokeFont.txt”</w:t>
-            </w:r>
-          </w:p>
-        </w:tc>
-      </w:tr>
-      <w:tr>
-        <w:trPr>
-          <w:trHeight w:val="547"/>
-        </w:trPr>
-        <w:tc>
-          <w:tcPr>
-            <w:tcW w:w="2263" w:type="dxa"/>
-          </w:tcPr>
-          <w:p>
-            <w:pPr>
-              <w:jc w:val="center"/>
-              <w:rPr>
-                <w:sz w:val="20"/>
-              </w:rPr>
-            </w:pPr>
-            <w:r>
-              <w:rPr>
-                <w:sz w:val="20"/>
-              </w:rPr>
-              <w:t>NumberOfLines</w:t>
-            </w:r>
-          </w:p>
-          <w:p>
-            <w:pPr>
-              <w:jc w:val="center"/>
-              <w:rPr>
-                <w:sz w:val="20"/>
-              </w:rPr>
-            </w:pPr>
-          </w:p>
-        </w:tc>
-        <w:tc>
-          <w:tcPr>
-            <w:tcW w:w="1985" w:type="dxa"/>
-          </w:tcPr>
-          <w:p>
-            <w:pPr>
-              <w:jc w:val="center"/>
-              <w:rPr>
-                <w:sz w:val="20"/>
-              </w:rPr>
-            </w:pPr>
-            <w:r>
-              <w:rPr>
-                <w:sz w:val="20"/>
-              </w:rPr>
-              <w:t>int</w:t>
-            </w:r>
-          </w:p>
-        </w:tc>
-        <w:tc>
-          <w:tcPr>
-            <w:tcW w:w="5528" w:type="dxa"/>
-          </w:tcPr>
-          <w:p>
-            <w:pPr>
-              <w:rPr>
-                <w:sz w:val="20"/>
-              </w:rPr>
-            </w:pPr>
-            <w:r>
-              <w:rPr>
-                <w:sz w:val="20"/>
-              </w:rPr>
-              <w:t>Defines the number of stroke lines that each character has in it “SingleStrokeFont.txt”</w:t>
-            </w:r>
-          </w:p>
-        </w:tc>
-      </w:tr>
-      <w:tr>
-        <w:trPr>
-          <w:trHeight w:val="547"/>
-        </w:trPr>
-        <w:tc>
-          <w:tcPr>
-            <w:tcW w:w="2263" w:type="dxa"/>
-          </w:tcPr>
-          <w:p>
-            <w:pPr>
-              <w:jc w:val="center"/>
-              <w:rPr>
-                <w:sz w:val="20"/>
-              </w:rPr>
-            </w:pPr>
-            <w:r>
-              <w:rPr>
-                <w:sz w:val="20"/>
-              </w:rPr>
-              <w:t>*Lines[50]</w:t>
-            </w:r>
-          </w:p>
-          <w:p>
-            <w:pPr>
-              <w:jc w:val="center"/>
-              <w:rPr>
-                <w:sz w:val="20"/>
-              </w:rPr>
-            </w:pPr>
-          </w:p>
-        </w:tc>
-        <w:tc>
-          <w:tcPr>
-            <w:tcW w:w="1985" w:type="dxa"/>
-          </w:tcPr>
-          <w:p>
-            <w:pPr>
-              <w:jc w:val="center"/>
-              <w:rPr>
-                <w:sz w:val="20"/>
-              </w:rPr>
-            </w:pPr>
-            <w:r>
-              <w:rPr>
-                <w:sz w:val="20"/>
-              </w:rPr>
-              <w:t>char</w:t>
-            </w:r>
-          </w:p>
-        </w:tc>
-        <w:tc>
-          <w:tcPr>
-            <w:tcW w:w="5528" w:type="dxa"/>
-          </w:tcPr>
-          <w:p>
-            <w:pPr>
-              <w:rPr>
-                <w:sz w:val="20"/>
-              </w:rPr>
-            </w:pPr>
-          </w:p>
-        </w:tc>
-      </w:tr>
-      <w:tr>
-        <w:trPr>
-          <w:trHeight w:val="547"/>
-        </w:trPr>
-        <w:tc>
-          <w:tcPr>
-            <w:tcW w:w="2263" w:type="dxa"/>
-          </w:tcPr>
-          <w:p>
-            <w:pPr>
-              <w:jc w:val="center"/>
-              <w:rPr>
-                <w:sz w:val="20"/>
-              </w:rPr>
-            </w:pPr>
-            <w:r>
-              <w:rPr>
-                <w:sz w:val="20"/>
-              </w:rPr>
-              <w:t>*FontArray</w:t>
-            </w:r>
-          </w:p>
-          <w:p>
-            <w:pPr>
-              <w:jc w:val="center"/>
-              <w:rPr>
-                <w:sz w:val="20"/>
-              </w:rPr>
-            </w:pPr>
-          </w:p>
-        </w:tc>
-        <w:tc>
-          <w:tcPr>
-            <w:tcW w:w="1985" w:type="dxa"/>
-          </w:tcPr>
-          <w:p>
-            <w:pPr>
-              <w:jc w:val="center"/>
-              <w:rPr>
-                <w:sz w:val="20"/>
-              </w:rPr>
-            </w:pPr>
-            <w:r>
-              <w:rPr>
-                <w:sz w:val="20"/>
-              </w:rPr>
-              <w:t>array</w:t>
-            </w:r>
-          </w:p>
-        </w:tc>
-        <w:tc>
-          <w:tcPr>
-            <w:tcW w:w="5528" w:type="dxa"/>
-          </w:tcPr>
-          <w:p>
-            <w:pPr>
-              <w:rPr>
-                <w:sz w:val="20"/>
-              </w:rPr>
-            </w:pPr>
-            <w:r>
-              <w:rPr>
-                <w:sz w:val="20"/>
-              </w:rPr>
-              <w:t>An array that holds all of the stroke lines within “SingleStrokeFont.txt”</w:t>
-            </w:r>
-          </w:p>
-        </w:tc>
-      </w:tr>
-      <w:tr>
-        <w:trPr>
-          <w:trHeight w:val="547"/>
-        </w:trPr>
-        <w:tc>
-          <w:tcPr>
-            <w:tcW w:w="2263" w:type="dxa"/>
-          </w:tcPr>
-          <w:p>
-            <w:pPr>
-              <w:jc w:val="center"/>
-              <w:rPr>
-                <w:sz w:val="20"/>
-              </w:rPr>
-            </w:pPr>
-            <w:r>
-              <w:rPr>
-                <w:sz w:val="20"/>
-              </w:rPr>
-              <w:t>FontCount</w:t>
-            </w:r>
-          </w:p>
-          <w:p>
-            <w:pPr>
-              <w:jc w:val="center"/>
-              <w:rPr>
-                <w:sz w:val="20"/>
-              </w:rPr>
-            </w:pPr>
-          </w:p>
-        </w:tc>
-        <w:tc>
-          <w:tcPr>
-            <w:tcW w:w="1985" w:type="dxa"/>
-          </w:tcPr>
-          <w:p>
-            <w:pPr>
-              <w:jc w:val="center"/>
-              <w:rPr>
-                <w:sz w:val="20"/>
-              </w:rPr>
-            </w:pPr>
-            <w:r>
-              <w:rPr>
-                <w:sz w:val="20"/>
-              </w:rPr>
-              <w:t>int</w:t>
-            </w:r>
-          </w:p>
-        </w:tc>
-        <w:tc>
-          <w:tcPr>
-            <w:tcW w:w="5528" w:type="dxa"/>
-          </w:tcPr>
-          <w:p>
-            <w:pPr>
-              <w:rPr>
-                <w:sz w:val="20"/>
-              </w:rPr>
-            </w:pPr>
-            <w:r>
-              <w:rPr>
-                <w:sz w:val="20"/>
-              </w:rPr>
-              <w:t xml:space="preserve">Calculates how many characters that have been defined in “SingleStrokeFont.txt” </w:t>
-            </w:r>
-          </w:p>
-        </w:tc>
-      </w:tr>
-      <w:tr>
-        <w:trPr>
-          <w:trHeight w:val="547"/>
-        </w:trPr>
-        <w:tc>
-          <w:tcPr>
-            <w:tcW w:w="2263" w:type="dxa"/>
-          </w:tcPr>
-          <w:p>
-            <w:pPr>
-              <w:jc w:val="center"/>
-              <w:rPr>
-                <w:sz w:val="20"/>
-              </w:rPr>
-            </w:pPr>
-            <w:r>
-              <w:rPr>
-                <w:sz w:val="20"/>
-              </w:rPr>
-              <w:t>ScannedValue</w:t>
-            </w:r>
-          </w:p>
-          <w:p>
-            <w:pPr>
-              <w:jc w:val="center"/>
-              <w:rPr>
-                <w:sz w:val="20"/>
-              </w:rPr>
-            </w:pPr>
-          </w:p>
-        </w:tc>
-        <w:tc>
-          <w:tcPr>
-            <w:tcW w:w="1985" w:type="dxa"/>
-          </w:tcPr>
-          <w:p>
-            <w:pPr>
-              <w:jc w:val="center"/>
-              <w:rPr>
-                <w:sz w:val="20"/>
-              </w:rPr>
-            </w:pPr>
-            <w:r>
-              <w:rPr>
-                <w:sz w:val="20"/>
-              </w:rPr>
-              <w:t>int</w:t>
-            </w:r>
-          </w:p>
-        </w:tc>
-        <w:tc>
-          <w:tcPr>
-            <w:tcW w:w="5528" w:type="dxa"/>
-          </w:tcPr>
-          <w:p>
-            <w:pPr>
-              <w:rPr>
-                <w:sz w:val="20"/>
-              </w:rPr>
-            </w:pPr>
-            <w:r>
-              <w:rPr>
-                <w:sz w:val="20"/>
-              </w:rPr>
-              <w:t xml:space="preserve">Used to check if the number scanned in the “SingleStrokeFont.txt” is equal to 999 and if so </w:t>
-            </w:r>
-            <w:r>
-              <w:rPr>
-                <w:sz w:val="20"/>
-              </w:rPr>
-              <w:t>we know the next character’s stroke is being defined below</w:t>
-            </w:r>
-          </w:p>
-        </w:tc>
-      </w:tr>
-      <w:tr>
-        <w:trPr>
-          <w:trHeight w:val="547"/>
-        </w:trPr>
-        <w:tc>
-          <w:tcPr>
-            <w:tcW w:w="2263" w:type="dxa"/>
-          </w:tcPr>
-          <w:p>
-            <w:pPr>
-              <w:jc w:val="center"/>
-              <w:rPr>
-                <w:sz w:val="20"/>
-              </w:rPr>
-            </w:pPr>
-            <w:r>
-              <w:rPr>
-                <w:sz w:val="20"/>
-              </w:rPr>
-              <w:t>*OutFontCount</w:t>
-            </w:r>
-          </w:p>
-          <w:p>
-            <w:pPr>
-              <w:jc w:val="center"/>
-              <w:rPr>
-                <w:sz w:val="20"/>
-              </w:rPr>
-            </w:pPr>
-          </w:p>
-        </w:tc>
-        <w:tc>
-          <w:tcPr>
-            <w:tcW w:w="1985" w:type="dxa"/>
-          </w:tcPr>
-          <w:p>
-            <w:pPr>
-              <w:jc w:val="center"/>
-              <w:rPr>
-                <w:sz w:val="20"/>
-              </w:rPr>
-            </w:pPr>
-            <w:r>
-              <w:rPr>
-                <w:sz w:val="20"/>
-              </w:rPr>
-              <w:t>int</w:t>
-            </w:r>
-          </w:p>
-        </w:tc>
-        <w:tc>
-          <w:tcPr>
-            <w:tcW w:w="5528" w:type="dxa"/>
-          </w:tcPr>
-          <w:p>
-            <w:pPr>
-              <w:rPr>
-                <w:sz w:val="20"/>
-              </w:rPr>
-            </w:pPr>
-          </w:p>
-        </w:tc>
-      </w:tr>
-      <w:tr>
-        <w:trPr>
-          <w:trHeight w:val="547"/>
-        </w:trPr>
-        <w:tc>
-          <w:tcPr>
-            <w:tcW w:w="2263" w:type="dxa"/>
-          </w:tcPr>
-          <w:p>
-            <w:pPr>
-              <w:jc w:val="center"/>
-              <w:rPr>
-                <w:sz w:val="20"/>
-              </w:rPr>
-            </w:pPr>
-            <w:r>
-              <w:rPr>
-                <w:sz w:val="20"/>
-              </w:rPr>
-              <w:t>*FP</w:t>
-            </w:r>
-          </w:p>
-        </w:tc>
-        <w:tc>
-          <w:tcPr>
-            <w:tcW w:w="1985" w:type="dxa"/>
-          </w:tcPr>
-          <w:p>
-            <w:pPr>
-              <w:jc w:val="center"/>
-              <w:rPr>
-                <w:sz w:val="20"/>
-              </w:rPr>
-            </w:pPr>
-            <w:r>
-              <w:rPr>
-                <w:sz w:val="20"/>
-              </w:rPr>
-              <w:t>pointer</w:t>
-            </w:r>
-          </w:p>
-        </w:tc>
-        <w:tc>
-          <w:tcPr>
-            <w:tcW w:w="5528" w:type="dxa"/>
-          </w:tcPr>
-          <w:p>
-            <w:pPr>
-              <w:rPr>
-                <w:sz w:val="20"/>
-              </w:rPr>
-            </w:pPr>
-          </w:p>
-        </w:tc>
-      </w:tr>
-      <w:tr>
-        <w:trPr>
-          <w:trHeight w:val="547"/>
-        </w:trPr>
-        <w:tc>
-          <w:tcPr>
-            <w:tcW w:w="2263" w:type="dxa"/>
-          </w:tcPr>
-          <w:p>
-            <w:pPr>
-              <w:jc w:val="center"/>
-              <w:rPr>
-                <w:sz w:val="20"/>
-              </w:rPr>
-            </w:pPr>
-            <w:r>
-              <w:rPr>
-                <w:sz w:val="20"/>
-              </w:rPr>
-              <w:t>*Sentence</w:t>
-            </w:r>
-          </w:p>
-        </w:tc>
-        <w:tc>
-          <w:tcPr>
-            <w:tcW w:w="1985" w:type="dxa"/>
-          </w:tcPr>
-          <w:p>
-            <w:pPr>
-              <w:jc w:val="center"/>
-              <w:rPr>
-                <w:sz w:val="20"/>
-              </w:rPr>
-            </w:pPr>
-            <w:r>
-              <w:rPr>
-                <w:sz w:val="20"/>
-              </w:rPr>
-              <w:t>pointer</w:t>
-            </w:r>
-          </w:p>
-        </w:tc>
-        <w:tc>
-          <w:tcPr>
-            <w:tcW w:w="5528" w:type="dxa"/>
-          </w:tcPr>
-          <w:p>
-            <w:pPr>
-              <w:rPr>
-                <w:sz w:val="20"/>
-              </w:rPr>
-            </w:pPr>
-          </w:p>
-        </w:tc>
-      </w:tr>
-      <w:tr>
-        <w:trPr>
-          <w:trHeight w:val="547"/>
-        </w:trPr>
-        <w:tc>
-          <w:tcPr>
-            <w:tcW w:w="2263" w:type="dxa"/>
-          </w:tcPr>
-          <w:p>
-            <w:pPr>
-              <w:jc w:val="center"/>
-              <w:rPr>
-                <w:sz w:val="20"/>
-              </w:rPr>
-            </w:pPr>
-            <w:r>
-              <w:rPr>
+            <w:tcW w:w="1980" w:type="dxa"/>
+          </w:tcPr>
+          <w:p>
+            <w:pPr>
+              <w:jc w:val="center"/>
+              <w:rPr>
+                <w:b/>
+                <w:bCs/>
+                <w:sz w:val="20"/>
+              </w:rPr>
+            </w:pPr>
+            <w:r>
+              <w:rPr>
+                <w:b/>
+                <w:bCs/>
                 <w:sz w:val="20"/>
               </w:rPr>
               <w:t>EndOfSentence</w:t>
@@ -2024,7 +2248,7 @@
         </w:tc>
         <w:tc>
           <w:tcPr>
-            <w:tcW w:w="1985" w:type="dxa"/>
+            <w:tcW w:w="2268" w:type="dxa"/>
           </w:tcPr>
           <w:p>
             <w:pPr>
@@ -2066,6 +2290,7 @@
         <w:pStyle w:val="Heading1"/>
       </w:pPr>
       <w:r>
+        <w:lastRenderedPageBreak/>
         <w:t>Function</w:t>
       </w:r>
       <w:r>
@@ -2154,7 +2379,7 @@
           <w:b/>
           <w:bCs/>
         </w:rPr>
-        <w:t>void ReadAndSendNextWord(void)</w:t>
+        <w:t>void ReadNextWord(void)</w:t>
       </w:r>
     </w:p>
     <w:p>
@@ -2646,11 +2871,22 @@
       <w:pPr>
         <w:pStyle w:val="Heading1"/>
       </w:pPr>
-      <w:r>
-        <w:t>Testing Information</w:t>
-      </w:r>
     </w:p>
     <w:p/>
+    <w:p>
+      <w:pPr>
+        <w:pStyle w:val="Heading1"/>
+      </w:pPr>
+      <w:r>
+        <w:lastRenderedPageBreak/>
+        <w:t>Testing Information</w:t>
+      </w:r>
+    </w:p>
+    <w:p>
+      <w:r>
+        <w:t>(Some function that I have don’t have any test functions so I just put N/A)</w:t>
+      </w:r>
+    </w:p>
     <w:tbl>
       <w:tblPr>
         <w:tblStyle w:val="TableGrid"/>
@@ -2658,15 +2894,15 @@
         <w:tblLook w:val="04A0" w:firstRow="1" w:lastRow="0" w:firstColumn="1" w:lastColumn="0" w:noHBand="0" w:noVBand="1"/>
       </w:tblPr>
       <w:tblGrid>
-        <w:gridCol w:w="1271"/>
+        <w:gridCol w:w="1696"/>
         <w:gridCol w:w="1985"/>
-        <w:gridCol w:w="2835"/>
+        <w:gridCol w:w="2410"/>
         <w:gridCol w:w="2925"/>
       </w:tblGrid>
       <w:tr>
         <w:tc>
           <w:tcPr>
-            <w:tcW w:w="1271" w:type="dxa"/>
+            <w:tcW w:w="1696" w:type="dxa"/>
           </w:tcPr>
           <w:p>
             <w:pPr>
@@ -2692,7 +2928,7 @@
         </w:tc>
         <w:tc>
           <w:tcPr>
-            <w:tcW w:w="2835" w:type="dxa"/>
+            <w:tcW w:w="2410" w:type="dxa"/>
           </w:tcPr>
           <w:p>
             <w:pPr>
@@ -2729,16 +2965,25 @@
         </w:trPr>
         <w:tc>
           <w:tcPr>
-            <w:tcW w:w="1271" w:type="dxa"/>
-          </w:tcPr>
-          <w:p>
-            <w:proofErr w:type="spellStart"/>
-            <w:r>
-              <w:t>LoadData</w:t>
-            </w:r>
-            <w:proofErr w:type="spellEnd"/>
-            <w:r>
-              <w:t>()</w:t>
+            <w:tcW w:w="1696" w:type="dxa"/>
+          </w:tcPr>
+          <w:p>
+            <w:pPr>
+              <w:rPr>
+                <w:b/>
+                <w:bCs/>
+                <w:sz w:val="20"/>
+                <w:szCs w:val="18"/>
+              </w:rPr>
+            </w:pPr>
+            <w:r>
+              <w:rPr>
+                <w:b/>
+                <w:bCs/>
+                <w:sz w:val="20"/>
+                <w:szCs w:val="18"/>
+              </w:rPr>
+              <w:t>LoadData()</w:t>
             </w:r>
           </w:p>
         </w:tc>
@@ -2757,6 +3002,7 @@
               <w:rPr>
                 <w:sz w:val="16"/>
                 <w:szCs w:val="16"/>
+                <w:highlight w:val="green"/>
               </w:rPr>
               <w:t>No “SingleStrokeFont.txt” file</w:t>
             </w:r>
@@ -2799,26 +3045,52 @@
               <w:rPr>
                 <w:sz w:val="16"/>
                 <w:szCs w:val="16"/>
-              </w:rPr>
-              <w:t>Check to see if fount count = 128</w:t>
-            </w:r>
-          </w:p>
-        </w:tc>
-        <w:tc>
-          <w:tcPr>
-            <w:tcW w:w="2835" w:type="dxa"/>
-          </w:tcPr>
-          <w:p>
-            <w:pPr>
-              <w:rPr>
-                <w:sz w:val="16"/>
-                <w:szCs w:val="16"/>
-              </w:rPr>
-            </w:pPr>
-            <w:r>
-              <w:rPr>
-                <w:sz w:val="16"/>
-                <w:szCs w:val="16"/>
+                <w:highlight w:val="cyan"/>
+              </w:rPr>
+              <w:t>“SingleStrokeFont.txt</w:t>
+            </w:r>
+            <w:r>
+              <w:rPr>
+                <w:sz w:val="16"/>
+                <w:szCs w:val="16"/>
+                <w:highlight w:val="cyan"/>
+              </w:rPr>
+              <w:t>” doesn’t contain all the data</w:t>
+            </w:r>
+          </w:p>
+          <w:p>
+            <w:pPr>
+              <w:rPr>
+                <w:sz w:val="16"/>
+                <w:szCs w:val="16"/>
+              </w:rPr>
+            </w:pPr>
+          </w:p>
+          <w:p>
+            <w:pPr>
+              <w:rPr>
+                <w:sz w:val="16"/>
+                <w:szCs w:val="16"/>
+              </w:rPr>
+            </w:pPr>
+          </w:p>
+        </w:tc>
+        <w:tc>
+          <w:tcPr>
+            <w:tcW w:w="2410" w:type="dxa"/>
+          </w:tcPr>
+          <w:p>
+            <w:pPr>
+              <w:rPr>
+                <w:sz w:val="16"/>
+                <w:szCs w:val="16"/>
+              </w:rPr>
+            </w:pPr>
+            <w:r>
+              <w:rPr>
+                <w:sz w:val="16"/>
+                <w:szCs w:val="16"/>
+                <w:highlight w:val="green"/>
               </w:rPr>
               <w:t xml:space="preserve">Remove </w:t>
             </w:r>
@@ -2826,6 +3098,7 @@
               <w:rPr>
                 <w:sz w:val="16"/>
                 <w:szCs w:val="16"/>
+                <w:highlight w:val="green"/>
               </w:rPr>
               <w:t>“SingleStrokeFont.txt”</w:t>
             </w:r>
@@ -2833,18 +3106,10 @@
               <w:rPr>
                 <w:sz w:val="16"/>
                 <w:szCs w:val="16"/>
-              </w:rPr>
-              <w:t xml:space="preserve"> from Robot writer folder and then run the </w:t>
-            </w:r>
-            <w:proofErr w:type="spellStart"/>
-            <w:r>
-              <w:rPr>
-                <w:sz w:val="16"/>
-                <w:szCs w:val="16"/>
-              </w:rPr>
-              <w:t>main.c</w:t>
-            </w:r>
-            <w:proofErr w:type="spellEnd"/>
+                <w:highlight w:val="green"/>
+              </w:rPr>
+              <w:t xml:space="preserve"> from Robot writer folder</w:t>
+            </w:r>
             <w:r>
               <w:rPr>
                 <w:sz w:val="16"/>
@@ -2864,21 +3129,42 @@
           <w:p>
             <w:pPr>
               <w:rPr>
-                <w:sz w:val="16"/>
-                <w:szCs w:val="16"/>
-              </w:rPr>
-            </w:pPr>
-            <w:r>
-              <w:rPr>
-                <w:sz w:val="16"/>
-                <w:szCs w:val="16"/>
-              </w:rPr>
-              <w:t>Call a file</w:t>
-            </w:r>
-            <w:r>
-              <w:rPr>
-                <w:sz w:val="16"/>
-                <w:szCs w:val="16"/>
+                <w:b/>
+                <w:bCs/>
+                <w:sz w:val="16"/>
+                <w:szCs w:val="16"/>
+              </w:rPr>
+            </w:pPr>
+            <w:r>
+              <w:rPr>
+                <w:b/>
+                <w:bCs/>
+                <w:sz w:val="16"/>
+                <w:szCs w:val="16"/>
+              </w:rPr>
+              <w:t>MAYBE ADD:</w:t>
+            </w:r>
+          </w:p>
+          <w:p>
+            <w:pPr>
+              <w:rPr>
+                <w:sz w:val="16"/>
+                <w:szCs w:val="16"/>
+              </w:rPr>
+            </w:pPr>
+            <w:r>
+              <w:rPr>
+                <w:sz w:val="16"/>
+                <w:szCs w:val="16"/>
+                <w:highlight w:val="cyan"/>
+              </w:rPr>
+              <w:t>Remove half of the stroke lines in</w:t>
+            </w:r>
+            <w:r>
+              <w:rPr>
+                <w:sz w:val="16"/>
+                <w:szCs w:val="16"/>
+                <w:highlight w:val="cyan"/>
               </w:rPr>
               <w:t xml:space="preserve"> “SingleStrokeFont.txt</w:t>
             </w:r>
@@ -2886,8 +3172,16 @@
               <w:rPr>
                 <w:sz w:val="16"/>
                 <w:szCs w:val="16"/>
-              </w:rPr>
-              <w:t>” but only half of the ascii characters in it</w:t>
+                <w:highlight w:val="cyan"/>
+              </w:rPr>
+              <w:t>”</w:t>
+            </w:r>
+            <w:r>
+              <w:rPr>
+                <w:sz w:val="16"/>
+                <w:szCs w:val="16"/>
+              </w:rPr>
+              <w:t xml:space="preserve"> </w:t>
             </w:r>
           </w:p>
         </w:tc>
@@ -2906,6 +3200,7 @@
               <w:rPr>
                 <w:sz w:val="16"/>
                 <w:szCs w:val="16"/>
+                <w:highlight w:val="green"/>
               </w:rPr>
               <w:t xml:space="preserve">FP (file pointer) equals null, therefore user is told that </w:t>
             </w:r>
@@ -2913,6 +3208,7 @@
               <w:rPr>
                 <w:sz w:val="16"/>
                 <w:szCs w:val="16"/>
+                <w:highlight w:val="green"/>
               </w:rPr>
               <w:t>“SingleStrokeFont.txt</w:t>
             </w:r>
@@ -2920,9 +3216,85 @@
               <w:rPr>
                 <w:sz w:val="16"/>
                 <w:szCs w:val="16"/>
+                <w:highlight w:val="green"/>
               </w:rPr>
               <w:t>” couldn’t be found and the programme immediately ends</w:t>
             </w:r>
+          </w:p>
+          <w:p>
+            <w:pPr>
+              <w:rPr>
+                <w:sz w:val="16"/>
+                <w:szCs w:val="16"/>
+              </w:rPr>
+            </w:pPr>
+          </w:p>
+          <w:p>
+            <w:pPr>
+              <w:rPr>
+                <w:b/>
+                <w:bCs/>
+                <w:sz w:val="16"/>
+                <w:szCs w:val="16"/>
+              </w:rPr>
+            </w:pPr>
+            <w:r>
+              <w:rPr>
+                <w:b/>
+                <w:bCs/>
+                <w:sz w:val="16"/>
+                <w:szCs w:val="16"/>
+              </w:rPr>
+              <w:t>MAYBE ADD:</w:t>
+            </w:r>
+          </w:p>
+          <w:p>
+            <w:pPr>
+              <w:rPr>
+                <w:sz w:val="16"/>
+                <w:szCs w:val="16"/>
+              </w:rPr>
+            </w:pPr>
+            <w:r>
+              <w:rPr>
+                <w:sz w:val="16"/>
+                <w:szCs w:val="16"/>
+                <w:highlight w:val="cyan"/>
+              </w:rPr>
+              <w:t xml:space="preserve">Font Count won’t equal 128, </w:t>
+            </w:r>
+            <w:r>
+              <w:rPr>
+                <w:sz w:val="16"/>
+                <w:szCs w:val="16"/>
+                <w:highlight w:val="cyan"/>
+              </w:rPr>
+              <w:t xml:space="preserve">therefore user is told that “SingleStrokeFont.txt” </w:t>
+            </w:r>
+            <w:r>
+              <w:rPr>
+                <w:sz w:val="16"/>
+                <w:szCs w:val="16"/>
+                <w:highlight w:val="cyan"/>
+              </w:rPr>
+              <w:t>doesn’t contain all ascii characters</w:t>
+            </w:r>
+            <w:r>
+              <w:rPr>
+                <w:sz w:val="16"/>
+                <w:szCs w:val="16"/>
+                <w:highlight w:val="cyan"/>
+              </w:rPr>
+              <w:t xml:space="preserve"> and the programme immediately ends</w:t>
+            </w:r>
+          </w:p>
+          <w:p>
+            <w:pPr>
+              <w:rPr>
+                <w:sz w:val="16"/>
+                <w:szCs w:val="16"/>
+              </w:rPr>
+            </w:pPr>
           </w:p>
         </w:tc>
       </w:tr>
@@ -2932,9 +3304,27 @@
         </w:trPr>
         <w:tc>
           <w:tcPr>
-            <w:tcW w:w="1271" w:type="dxa"/>
-          </w:tcPr>
-          <w:p/>
+            <w:tcW w:w="1696" w:type="dxa"/>
+          </w:tcPr>
+          <w:p>
+            <w:pPr>
+              <w:rPr>
+                <w:b/>
+                <w:bCs/>
+                <w:sz w:val="20"/>
+                <w:szCs w:val="18"/>
+              </w:rPr>
+            </w:pPr>
+            <w:r>
+              <w:rPr>
+                <w:b/>
+                <w:bCs/>
+                <w:sz w:val="20"/>
+                <w:szCs w:val="18"/>
+              </w:rPr>
+              <w:t>main()</w:t>
+            </w:r>
+          </w:p>
         </w:tc>
         <w:tc>
           <w:tcPr>
@@ -2951,7 +3341,713 @@
         </w:tc>
         <w:tc>
           <w:tcPr>
-            <w:tcW w:w="2835" w:type="dxa"/>
+            <w:tcW w:w="2410" w:type="dxa"/>
+          </w:tcPr>
+          <w:p>
+            <w:pPr>
+              <w:rPr>
+                <w:sz w:val="16"/>
+                <w:szCs w:val="16"/>
+              </w:rPr>
+            </w:pPr>
+          </w:p>
+        </w:tc>
+        <w:tc>
+          <w:tcPr>
+            <w:tcW w:w="2925" w:type="dxa"/>
+          </w:tcPr>
+          <w:p>
+            <w:pPr>
+              <w:rPr>
+                <w:sz w:val="16"/>
+                <w:szCs w:val="16"/>
+              </w:rPr>
+            </w:pPr>
+          </w:p>
+        </w:tc>
+      </w:tr>
+      <w:tr>
+        <w:trPr>
+          <w:trHeight w:val="563"/>
+        </w:trPr>
+        <w:tc>
+          <w:tcPr>
+            <w:tcW w:w="1696" w:type="dxa"/>
+          </w:tcPr>
+          <w:p>
+            <w:pPr>
+              <w:rPr>
+                <w:b/>
+                <w:bCs/>
+                <w:sz w:val="20"/>
+                <w:szCs w:val="18"/>
+              </w:rPr>
+            </w:pPr>
+            <w:r>
+              <w:rPr>
+                <w:b/>
+                <w:bCs/>
+                <w:sz w:val="20"/>
+                <w:szCs w:val="18"/>
+              </w:rPr>
+              <w:t>FontSize()</w:t>
+            </w:r>
+          </w:p>
+          <w:p>
+            <w:pPr>
+              <w:rPr>
+                <w:b/>
+                <w:bCs/>
+                <w:sz w:val="20"/>
+                <w:szCs w:val="18"/>
+              </w:rPr>
+            </w:pPr>
+          </w:p>
+        </w:tc>
+        <w:tc>
+          <w:tcPr>
+            <w:tcW w:w="1985" w:type="dxa"/>
+          </w:tcPr>
+          <w:p>
+            <w:pPr>
+              <w:rPr>
+                <w:sz w:val="16"/>
+                <w:szCs w:val="16"/>
+              </w:rPr>
+            </w:pPr>
+            <w:r>
+              <w:rPr>
+                <w:sz w:val="16"/>
+                <w:szCs w:val="16"/>
+                <w:highlight w:val="green"/>
+              </w:rPr>
+              <w:t>User inputs a something that isn’t a number</w:t>
+            </w:r>
+          </w:p>
+          <w:p>
+            <w:pPr>
+              <w:rPr>
+                <w:sz w:val="16"/>
+                <w:szCs w:val="16"/>
+              </w:rPr>
+            </w:pPr>
+          </w:p>
+          <w:p>
+            <w:pPr>
+              <w:rPr>
+                <w:sz w:val="16"/>
+                <w:szCs w:val="16"/>
+              </w:rPr>
+            </w:pPr>
+            <w:r>
+              <w:rPr>
+                <w:sz w:val="16"/>
+                <w:szCs w:val="16"/>
+                <w:highlight w:val="cyan"/>
+              </w:rPr>
+              <w:t>User inputs a number that isn’t between 4 and 10</w:t>
+            </w:r>
+          </w:p>
+        </w:tc>
+        <w:tc>
+          <w:tcPr>
+            <w:tcW w:w="2410" w:type="dxa"/>
+          </w:tcPr>
+          <w:p>
+            <w:pPr>
+              <w:rPr>
+                <w:sz w:val="16"/>
+                <w:szCs w:val="16"/>
+              </w:rPr>
+            </w:pPr>
+            <w:r>
+              <w:rPr>
+                <w:sz w:val="16"/>
+                <w:szCs w:val="16"/>
+                <w:highlight w:val="green"/>
+              </w:rPr>
+              <w:t>Input the letter a as the number for the font size</w:t>
+            </w:r>
+          </w:p>
+          <w:p>
+            <w:pPr>
+              <w:rPr>
+                <w:sz w:val="16"/>
+                <w:szCs w:val="16"/>
+              </w:rPr>
+            </w:pPr>
+          </w:p>
+          <w:p>
+            <w:pPr>
+              <w:rPr>
+                <w:sz w:val="16"/>
+                <w:szCs w:val="16"/>
+              </w:rPr>
+            </w:pPr>
+            <w:r>
+              <w:rPr>
+                <w:sz w:val="16"/>
+                <w:szCs w:val="16"/>
+                <w:highlight w:val="cyan"/>
+              </w:rPr>
+              <w:t>Input the value 3.75 as the number for the font size</w:t>
+            </w:r>
+          </w:p>
+        </w:tc>
+        <w:tc>
+          <w:tcPr>
+            <w:tcW w:w="2925" w:type="dxa"/>
+          </w:tcPr>
+          <w:p>
+            <w:pPr>
+              <w:rPr>
+                <w:sz w:val="16"/>
+                <w:szCs w:val="16"/>
+              </w:rPr>
+            </w:pPr>
+            <w:r>
+              <w:rPr>
+                <w:sz w:val="16"/>
+                <w:szCs w:val="16"/>
+                <w:highlight w:val="green"/>
+              </w:rPr>
+              <w:t xml:space="preserve">Tell user they didn’t input a number and </w:t>
+            </w:r>
+            <w:r>
+              <w:rPr>
+                <w:sz w:val="16"/>
+                <w:szCs w:val="16"/>
+                <w:highlight w:val="green"/>
+              </w:rPr>
+              <w:t xml:space="preserve">then </w:t>
+            </w:r>
+            <w:r>
+              <w:rPr>
+                <w:sz w:val="16"/>
+                <w:szCs w:val="16"/>
+                <w:highlight w:val="green"/>
+              </w:rPr>
+              <w:t>repeat the function again</w:t>
+            </w:r>
+          </w:p>
+          <w:p>
+            <w:pPr>
+              <w:rPr>
+                <w:sz w:val="16"/>
+                <w:szCs w:val="16"/>
+              </w:rPr>
+            </w:pPr>
+          </w:p>
+          <w:p>
+            <w:pPr>
+              <w:rPr>
+                <w:sz w:val="16"/>
+                <w:szCs w:val="16"/>
+              </w:rPr>
+            </w:pPr>
+            <w:r>
+              <w:rPr>
+                <w:sz w:val="16"/>
+                <w:szCs w:val="16"/>
+                <w:highlight w:val="cyan"/>
+              </w:rPr>
+              <w:t>Tell user they didn’t input a number</w:t>
+            </w:r>
+            <w:r>
+              <w:rPr>
+                <w:sz w:val="16"/>
+                <w:szCs w:val="16"/>
+                <w:highlight w:val="cyan"/>
+              </w:rPr>
+              <w:t xml:space="preserve"> between 4 and 10, and then </w:t>
+            </w:r>
+            <w:r>
+              <w:rPr>
+                <w:sz w:val="16"/>
+                <w:szCs w:val="16"/>
+                <w:highlight w:val="cyan"/>
+              </w:rPr>
+              <w:t>repeat the function agai</w:t>
+            </w:r>
+            <w:r>
+              <w:rPr>
+                <w:sz w:val="16"/>
+                <w:szCs w:val="16"/>
+                <w:highlight w:val="cyan"/>
+              </w:rPr>
+              <w:t>n</w:t>
+            </w:r>
+          </w:p>
+          <w:p>
+            <w:pPr>
+              <w:rPr>
+                <w:sz w:val="16"/>
+                <w:szCs w:val="16"/>
+              </w:rPr>
+            </w:pPr>
+          </w:p>
+        </w:tc>
+      </w:tr>
+      <w:tr>
+        <w:trPr>
+          <w:trHeight w:val="563"/>
+        </w:trPr>
+        <w:tc>
+          <w:tcPr>
+            <w:tcW w:w="1696" w:type="dxa"/>
+          </w:tcPr>
+          <w:p>
+            <w:pPr>
+              <w:rPr>
+                <w:b/>
+                <w:bCs/>
+                <w:sz w:val="20"/>
+                <w:szCs w:val="18"/>
+              </w:rPr>
+            </w:pPr>
+            <w:r>
+              <w:rPr>
+                <w:b/>
+                <w:bCs/>
+                <w:sz w:val="20"/>
+                <w:szCs w:val="18"/>
+              </w:rPr>
+              <w:t>ReadNextWord()</w:t>
+            </w:r>
+          </w:p>
+        </w:tc>
+        <w:tc>
+          <w:tcPr>
+            <w:tcW w:w="1985" w:type="dxa"/>
+          </w:tcPr>
+          <w:p>
+            <w:pPr>
+              <w:rPr>
+                <w:sz w:val="16"/>
+                <w:szCs w:val="16"/>
+              </w:rPr>
+            </w:pPr>
+            <w:r>
+              <w:rPr>
+                <w:sz w:val="16"/>
+                <w:szCs w:val="16"/>
+                <w:highlight w:val="green"/>
+              </w:rPr>
+              <w:t xml:space="preserve">No </w:t>
+            </w:r>
+            <w:r>
+              <w:rPr>
+                <w:sz w:val="16"/>
+                <w:szCs w:val="16"/>
+                <w:highlight w:val="green"/>
+              </w:rPr>
+              <w:t>"SampleLines.txt"</w:t>
+            </w:r>
+            <w:r>
+              <w:rPr>
+                <w:sz w:val="16"/>
+                <w:szCs w:val="16"/>
+                <w:highlight w:val="green"/>
+              </w:rPr>
+              <w:t xml:space="preserve"> file</w:t>
+            </w:r>
+          </w:p>
+          <w:p>
+            <w:pPr>
+              <w:rPr>
+                <w:sz w:val="16"/>
+                <w:szCs w:val="16"/>
+              </w:rPr>
+            </w:pPr>
+          </w:p>
+        </w:tc>
+        <w:tc>
+          <w:tcPr>
+            <w:tcW w:w="2410" w:type="dxa"/>
+          </w:tcPr>
+          <w:p>
+            <w:pPr>
+              <w:rPr>
+                <w:sz w:val="16"/>
+                <w:szCs w:val="16"/>
+                <w:highlight w:val="green"/>
+              </w:rPr>
+            </w:pPr>
+            <w:r>
+              <w:rPr>
+                <w:sz w:val="16"/>
+                <w:szCs w:val="16"/>
+                <w:highlight w:val="green"/>
+              </w:rPr>
+              <w:t>Remove “</w:t>
+            </w:r>
+            <w:r>
+              <w:rPr>
+                <w:sz w:val="16"/>
+                <w:szCs w:val="16"/>
+                <w:highlight w:val="green"/>
+              </w:rPr>
+              <w:t>SampleLines.txt</w:t>
+            </w:r>
+            <w:r>
+              <w:rPr>
+                <w:sz w:val="16"/>
+                <w:szCs w:val="16"/>
+                <w:highlight w:val="green"/>
+              </w:rPr>
+              <w:t>”</w:t>
+            </w:r>
+            <w:r>
+              <w:rPr>
+                <w:sz w:val="16"/>
+                <w:szCs w:val="16"/>
+                <w:highlight w:val="green"/>
+              </w:rPr>
+              <w:t xml:space="preserve"> from Robot writer folder</w:t>
+            </w:r>
+            <w:r>
+              <w:rPr>
+                <w:sz w:val="16"/>
+                <w:szCs w:val="16"/>
+              </w:rPr>
+              <w:t xml:space="preserve"> </w:t>
+            </w:r>
+          </w:p>
+          <w:p>
+            <w:pPr>
+              <w:rPr>
+                <w:sz w:val="16"/>
+                <w:szCs w:val="16"/>
+              </w:rPr>
+            </w:pPr>
+          </w:p>
+        </w:tc>
+        <w:tc>
+          <w:tcPr>
+            <w:tcW w:w="2925" w:type="dxa"/>
+          </w:tcPr>
+          <w:p>
+            <w:pPr>
+              <w:rPr>
+                <w:sz w:val="16"/>
+                <w:szCs w:val="16"/>
+              </w:rPr>
+            </w:pPr>
+            <w:r>
+              <w:rPr>
+                <w:sz w:val="16"/>
+                <w:szCs w:val="16"/>
+                <w:highlight w:val="green"/>
+              </w:rPr>
+              <w:t xml:space="preserve">Sentence </w:t>
+            </w:r>
+            <w:r>
+              <w:rPr>
+                <w:sz w:val="16"/>
+                <w:szCs w:val="16"/>
+                <w:highlight w:val="green"/>
+              </w:rPr>
+              <w:t>(file pointer) equals null, therefore user is told that “</w:t>
+            </w:r>
+            <w:r>
+              <w:rPr>
+                <w:sz w:val="16"/>
+                <w:szCs w:val="16"/>
+                <w:highlight w:val="green"/>
+              </w:rPr>
+              <w:t>S</w:t>
+            </w:r>
+            <w:r>
+              <w:rPr>
+                <w:sz w:val="16"/>
+                <w:szCs w:val="16"/>
+                <w:highlight w:val="green"/>
+              </w:rPr>
+              <w:t>ampleLines.txt</w:t>
+            </w:r>
+            <w:r>
+              <w:rPr>
+                <w:sz w:val="16"/>
+                <w:szCs w:val="16"/>
+                <w:highlight w:val="green"/>
+              </w:rPr>
+              <w:t>” couldn’t be found and the programme immediately ends</w:t>
+            </w:r>
+            <w:r>
+              <w:rPr>
+                <w:sz w:val="16"/>
+                <w:szCs w:val="16"/>
+              </w:rPr>
+              <w:t>.</w:t>
+            </w:r>
+          </w:p>
+          <w:p>
+            <w:pPr>
+              <w:rPr>
+                <w:sz w:val="16"/>
+                <w:szCs w:val="16"/>
+              </w:rPr>
+            </w:pPr>
+          </w:p>
+        </w:tc>
+      </w:tr>
+      <w:tr>
+        <w:trPr>
+          <w:trHeight w:val="563"/>
+        </w:trPr>
+        <w:tc>
+          <w:tcPr>
+            <w:tcW w:w="1696" w:type="dxa"/>
+          </w:tcPr>
+          <w:p>
+            <w:pPr>
+              <w:rPr>
+                <w:b/>
+                <w:bCs/>
+                <w:sz w:val="20"/>
+                <w:szCs w:val="18"/>
+              </w:rPr>
+            </w:pPr>
+            <w:r>
+              <w:rPr>
+                <w:b/>
+                <w:bCs/>
+                <w:sz w:val="20"/>
+                <w:szCs w:val="18"/>
+              </w:rPr>
+              <w:t>WordLength</w:t>
+            </w:r>
+            <w:r>
+              <w:rPr>
+                <w:b/>
+                <w:bCs/>
+                <w:sz w:val="20"/>
+                <w:szCs w:val="18"/>
+              </w:rPr>
+              <w:t>()</w:t>
+            </w:r>
+          </w:p>
+        </w:tc>
+        <w:tc>
+          <w:tcPr>
+            <w:tcW w:w="1985" w:type="dxa"/>
+          </w:tcPr>
+          <w:p>
+            <w:pPr>
+              <w:rPr>
+                <w:sz w:val="16"/>
+                <w:szCs w:val="16"/>
+              </w:rPr>
+            </w:pPr>
+          </w:p>
+        </w:tc>
+        <w:tc>
+          <w:tcPr>
+            <w:tcW w:w="2410" w:type="dxa"/>
+          </w:tcPr>
+          <w:p>
+            <w:pPr>
+              <w:rPr>
+                <w:sz w:val="16"/>
+                <w:szCs w:val="16"/>
+              </w:rPr>
+            </w:pPr>
+          </w:p>
+        </w:tc>
+        <w:tc>
+          <w:tcPr>
+            <w:tcW w:w="2925" w:type="dxa"/>
+          </w:tcPr>
+          <w:p>
+            <w:pPr>
+              <w:rPr>
+                <w:sz w:val="16"/>
+                <w:szCs w:val="16"/>
+              </w:rPr>
+            </w:pPr>
+          </w:p>
+        </w:tc>
+      </w:tr>
+      <w:tr>
+        <w:trPr>
+          <w:trHeight w:val="563"/>
+        </w:trPr>
+        <w:tc>
+          <w:tcPr>
+            <w:tcW w:w="1696" w:type="dxa"/>
+          </w:tcPr>
+          <w:p>
+            <w:pPr>
+              <w:rPr>
+                <w:b/>
+                <w:bCs/>
+                <w:sz w:val="20"/>
+                <w:szCs w:val="18"/>
+              </w:rPr>
+            </w:pPr>
+            <w:r>
+              <w:rPr>
+                <w:b/>
+                <w:bCs/>
+                <w:sz w:val="20"/>
+                <w:szCs w:val="18"/>
+              </w:rPr>
+              <w:t>SetNewLine()</w:t>
+            </w:r>
+          </w:p>
+        </w:tc>
+        <w:tc>
+          <w:tcPr>
+            <w:tcW w:w="1985" w:type="dxa"/>
+          </w:tcPr>
+          <w:p>
+            <w:pPr>
+              <w:rPr>
+                <w:sz w:val="16"/>
+                <w:szCs w:val="16"/>
+              </w:rPr>
+            </w:pPr>
+          </w:p>
+        </w:tc>
+        <w:tc>
+          <w:tcPr>
+            <w:tcW w:w="2410" w:type="dxa"/>
+          </w:tcPr>
+          <w:p>
+            <w:pPr>
+              <w:rPr>
+                <w:sz w:val="16"/>
+                <w:szCs w:val="16"/>
+              </w:rPr>
+            </w:pPr>
+          </w:p>
+        </w:tc>
+        <w:tc>
+          <w:tcPr>
+            <w:tcW w:w="2925" w:type="dxa"/>
+          </w:tcPr>
+          <w:p>
+            <w:pPr>
+              <w:rPr>
+                <w:sz w:val="16"/>
+                <w:szCs w:val="16"/>
+              </w:rPr>
+            </w:pPr>
+          </w:p>
+        </w:tc>
+      </w:tr>
+      <w:tr>
+        <w:trPr>
+          <w:trHeight w:val="563"/>
+        </w:trPr>
+        <w:tc>
+          <w:tcPr>
+            <w:tcW w:w="1696" w:type="dxa"/>
+          </w:tcPr>
+          <w:p>
+            <w:pPr>
+              <w:rPr>
+                <w:b/>
+                <w:bCs/>
+                <w:sz w:val="20"/>
+                <w:szCs w:val="18"/>
+              </w:rPr>
+            </w:pPr>
+            <w:r>
+              <w:rPr>
+                <w:b/>
+                <w:bCs/>
+                <w:sz w:val="20"/>
+                <w:szCs w:val="18"/>
+              </w:rPr>
+              <w:t>CharacterGCode()</w:t>
+            </w:r>
+          </w:p>
+        </w:tc>
+        <w:tc>
+          <w:tcPr>
+            <w:tcW w:w="1985" w:type="dxa"/>
+          </w:tcPr>
+          <w:p>
+            <w:pPr>
+              <w:rPr>
+                <w:sz w:val="16"/>
+                <w:szCs w:val="16"/>
+              </w:rPr>
+            </w:pPr>
+          </w:p>
+        </w:tc>
+        <w:tc>
+          <w:tcPr>
+            <w:tcW w:w="2410" w:type="dxa"/>
+          </w:tcPr>
+          <w:p>
+            <w:pPr>
+              <w:rPr>
+                <w:sz w:val="16"/>
+                <w:szCs w:val="16"/>
+              </w:rPr>
+            </w:pPr>
+          </w:p>
+        </w:tc>
+        <w:tc>
+          <w:tcPr>
+            <w:tcW w:w="2925" w:type="dxa"/>
+          </w:tcPr>
+          <w:p>
+            <w:pPr>
+              <w:rPr>
+                <w:sz w:val="16"/>
+                <w:szCs w:val="16"/>
+              </w:rPr>
+            </w:pPr>
+          </w:p>
+        </w:tc>
+      </w:tr>
+      <w:tr>
+        <w:trPr>
+          <w:trHeight w:val="563"/>
+        </w:trPr>
+        <w:tc>
+          <w:tcPr>
+            <w:tcW w:w="1696" w:type="dxa"/>
+          </w:tcPr>
+          <w:p>
+            <w:pPr>
+              <w:rPr>
+                <w:b/>
+                <w:bCs/>
+                <w:sz w:val="20"/>
+                <w:szCs w:val="18"/>
+              </w:rPr>
+            </w:pPr>
+            <w:r>
+              <w:rPr>
+                <w:b/>
+                <w:bCs/>
+                <w:sz w:val="20"/>
+                <w:szCs w:val="18"/>
+              </w:rPr>
+              <w:t>SetRobot()</w:t>
+            </w:r>
+          </w:p>
+        </w:tc>
+        <w:tc>
+          <w:tcPr>
+            <w:tcW w:w="1985" w:type="dxa"/>
+          </w:tcPr>
+          <w:p>
+            <w:pPr>
+              <w:rPr>
+                <w:sz w:val="16"/>
+                <w:szCs w:val="16"/>
+              </w:rPr>
+            </w:pPr>
+          </w:p>
+        </w:tc>
+        <w:tc>
+          <w:tcPr>
+            <w:tcW w:w="2410" w:type="dxa"/>
           </w:tcPr>
           <w:p>
             <w:pPr>
@@ -3652,7 +4748,6 @@
   <w:style w:type="character" w:default="1" w:styleId="DefaultParagraphFont">
     <w:name w:val="Default Paragraph Font"/>
     <w:uiPriority w:val="1"/>
-    <w:semiHidden/>
     <w:unhideWhenUsed/>
   </w:style>
   <w:style w:type="table" w:default="1" w:styleId="TableNormal">

</xml_diff>